<commit_message>
Updates to questionairre and template
</commit_message>
<xml_diff>
--- a/docassemble/MwtPetitionForHarassmentProtect/data/templates/mwt_petition_for_harassment_protect_next_steps.docx
+++ b/docassemble/MwtPetitionForHarassmentProtect/data/templates/mwt_petition_for_harassment_protect_next_steps.docx
@@ -75,11 +75,30 @@
           <w:kern w:val="0"/>
           <w14:ligatures w14:val="none"/>
         </w:rPr>
-        <w:t>You have completed the online petition for a Harassment Protection Order. Your petition has been submitted to the Mashpee Wampanoag Tribal Court for review.</w:t>
-      </w:r>
-      <w:r>
-        <w:rPr>
-          <w:rFonts w:ascii="Arial" w:eastAsia="Calibri" w:hAnsi="Arial" w:cs="Arial"/>
+        <w:t xml:space="preserve">Congratulations {{ users }}! You have finished all the forms you need to Ask the court for protection order for harassment. The rest of the pages in this packet are your petition{% if </w:t>
+      </w:r>
+      <w:proofErr w:type="spellStart"/>
+      <w:r>
+        <w:rPr>
+          <w:rFonts w:ascii="Arial" w:eastAsia="Calibri" w:hAnsi="Arial" w:cs="Arial"/>
+          <w:kern w:val="0"/>
+          <w14:ligatures w14:val="none"/>
+        </w:rPr>
+        <w:t>other_parties.number</w:t>
+      </w:r>
+      <w:proofErr w:type="spellEnd"/>
+      <w:r>
+        <w:rPr>
+          <w:rFonts w:ascii="Arial" w:eastAsia="Calibri" w:hAnsi="Arial" w:cs="Arial"/>
+          <w:kern w:val="0"/>
+          <w14:ligatures w14:val="none"/>
+        </w:rPr>
+        <w:t>() %}</w:t>
+      </w:r>
+      <w:r>
+        <w:rPr>
+          <w:rFonts w:ascii="Arial" w:eastAsia="Calibri" w:hAnsi="Arial" w:cs="Arial"/>
+          <w:b/>
           <w:kern w:val="0"/>
           <w14:ligatures w14:val="none"/>
         </w:rPr>
@@ -91,11 +110,65 @@
           <w:kern w:val="0"/>
           <w14:ligatures w14:val="none"/>
         </w:rPr>
-        <w:t>Filing this petition is an important step toward requesting protection from the Tribal Court.</w:t>
+        <w:t>in</w:t>
+      </w:r>
+      <w:r>
+        <w:rPr>
+          <w:rFonts w:ascii="Arial" w:eastAsia="Calibri" w:hAnsi="Arial" w:cs="Arial"/>
+          <w:b/>
+          <w:kern w:val="0"/>
+          <w14:ligatures w14:val="none"/>
+        </w:rPr>
+        <w:t xml:space="preserve"> {{ users }} v {{ </w:t>
+      </w:r>
+      <w:proofErr w:type="spellStart"/>
+      <w:r>
+        <w:rPr>
+          <w:rFonts w:ascii="Arial" w:eastAsia="Calibri" w:hAnsi="Arial" w:cs="Arial"/>
+          <w:b/>
+          <w:kern w:val="0"/>
+          <w14:ligatures w14:val="none"/>
+        </w:rPr>
+        <w:t>other_parties</w:t>
+      </w:r>
+      <w:proofErr w:type="spellEnd"/>
+      <w:r>
+        <w:rPr>
+          <w:rFonts w:ascii="Arial" w:eastAsia="Calibri" w:hAnsi="Arial" w:cs="Arial"/>
+          <w:b/>
+          <w:kern w:val="0"/>
+          <w14:ligatures w14:val="none"/>
+        </w:rPr>
+        <w:t xml:space="preserve"> }}</w:t>
+      </w:r>
+      <w:r>
+        <w:rPr>
+          <w:rFonts w:ascii="Arial" w:eastAsia="Calibri" w:hAnsi="Arial" w:cs="Arial"/>
+          <w:kern w:val="0"/>
+          <w14:ligatures w14:val="none"/>
+        </w:rPr>
+        <w:t>{% endif %}.</w:t>
       </w:r>
     </w:p>
     <w:p>
       <w:pPr>
+        <w:spacing w:after="160" w:line="259" w:lineRule="auto"/>
+        <w:rPr>
+          <w:rFonts w:ascii="Arial" w:eastAsia="Arial" w:hAnsi="Arial" w:cs="Arial"/>
+          <w:kern w:val="0"/>
+          <w:lang w:val="en"/>
+          <w14:ligatures w14:val="none"/>
+        </w:rPr>
+      </w:pPr>
+    </w:p>
+    <w:p>
+      <w:pPr>
+        <w:spacing w:after="160" w:line="259" w:lineRule="auto"/>
+        <w:rPr>
+          <w:rFonts w:ascii="Arial" w:eastAsia="Calibri" w:hAnsi="Arial" w:cs="Arial"/>
+          <w:kern w:val="0"/>
+          <w14:ligatures w14:val="none"/>
+        </w:rPr>
         <w:sectPr>
           <w:footerReference w:type="default" r:id="rId7"/>
           <w:pgSz w:w="12240" w:h="15840"/>
@@ -136,188 +209,259 @@
     </w:p>
     <w:p>
       <w:pPr>
+        <w:numPr>
+          <w:ilvl w:val="0"/>
+          <w:numId w:val="7"/>
+        </w:numPr>
+        <w:suppressAutoHyphens/>
+        <w:snapToGrid w:val="0"/>
+        <w:spacing w:after="80" w:line="259" w:lineRule="auto"/>
+        <w:contextualSpacing/>
+        <w:rPr>
+          <w:rFonts w:ascii="Arial" w:eastAsia="Times New Roman" w:hAnsi="Arial" w:cs="Arial"/>
+          <w:kern w:val="0"/>
+          <w:lang w:val="en"/>
+          <w14:textOutline w14:w="9525" w14:cap="rnd" w14:cmpd="sng" w14:algn="ctr">
+            <w14:noFill/>
+            <w14:prstDash w14:val="solid"/>
+            <w14:bevel/>
+          </w14:textOutline>
+          <w14:ligatures w14:val="none"/>
+        </w:rPr>
+      </w:pPr>
+      <w:r>
+        <w:rPr>
+          <w:rFonts w:ascii="Arial" w:eastAsia="Times New Roman" w:hAnsi="Arial" w:cs="Arial"/>
+          <w:kern w:val="0"/>
+          <w:lang w:val="en"/>
+          <w14:ligatures w14:val="none"/>
+        </w:rPr>
+        <w:t>Your petition will be reviewed by the Tribal Court on the same day it is filed or by the next business day</w:t>
+      </w:r>
+      <w:r>
+        <w:rPr>
+          <w:rFonts w:ascii="Arial" w:eastAsia="Times New Roman" w:hAnsi="Arial" w:cs="Arial"/>
+          <w:kern w:val="0"/>
+          <w:lang w:val="en"/>
+          <w14:textOutline w14:w="9525" w14:cap="rnd" w14:cmpd="sng" w14:algn="ctr">
+            <w14:noFill/>
+            <w14:prstDash w14:val="solid"/>
+            <w14:bevel/>
+          </w14:textOutline>
+          <w14:ligatures w14:val="none"/>
+        </w:rPr>
+        <w:t>.</w:t>
+      </w:r>
+    </w:p>
+    <w:p>
+      <w:pPr>
+        <w:suppressAutoHyphens/>
+        <w:snapToGrid w:val="0"/>
+        <w:spacing w:after="80" w:line="259" w:lineRule="auto"/>
+        <w:contextualSpacing/>
+        <w:rPr>
+          <w:rFonts w:ascii="Arial" w:eastAsia="Times New Roman" w:hAnsi="Arial" w:cs="Arial"/>
+          <w:kern w:val="0"/>
+          <w:lang w:val="en"/>
+          <w14:textOutline w14:w="9525" w14:cap="rnd" w14:cmpd="sng" w14:algn="ctr">
+            <w14:noFill/>
+            <w14:prstDash w14:val="solid"/>
+            <w14:bevel/>
+          </w14:textOutline>
+          <w14:ligatures w14:val="none"/>
+        </w:rPr>
+      </w:pPr>
+    </w:p>
+    <w:p>
+      <w:pPr>
+        <w:numPr>
+          <w:ilvl w:val="0"/>
+          <w:numId w:val="7"/>
+        </w:numPr>
+        <w:suppressAutoHyphens/>
+        <w:snapToGrid w:val="0"/>
+        <w:spacing w:after="80" w:line="259" w:lineRule="auto"/>
+        <w:contextualSpacing/>
+        <w:rPr>
+          <w:rFonts w:ascii="Arial" w:eastAsia="Times New Roman" w:hAnsi="Arial" w:cs="Arial"/>
+          <w:kern w:val="0"/>
+          <w:lang w:val="en"/>
+          <w14:textOutline w14:w="9525" w14:cap="rnd" w14:cmpd="sng" w14:algn="ctr">
+            <w14:noFill/>
+            <w14:prstDash w14:val="solid"/>
+            <w14:bevel/>
+          </w14:textOutline>
+          <w14:ligatures w14:val="none"/>
+        </w:rPr>
+      </w:pPr>
+      <w:r>
+        <w:rPr>
+          <w:rFonts w:ascii="Arial" w:eastAsia="Times New Roman" w:hAnsi="Arial" w:cs="Arial"/>
+          <w:kern w:val="0"/>
+          <w:lang w:val="en"/>
+          <w14:ligatures w14:val="none"/>
+        </w:rPr>
+        <w:t xml:space="preserve">The Tribal Court will schedule a hearing you must attend within: </w:t>
+      </w:r>
+    </w:p>
+    <w:p>
+      <w:pPr>
         <w:pStyle w:val="ListParagraph"/>
         <w:numPr>
           <w:ilvl w:val="0"/>
-          <w:numId w:val="10"/>
+          <w:numId w:val="8"/>
         </w:numPr>
-        <w:rPr>
-          <w:rFonts w:ascii="Arial" w:hAnsi="Arial" w:cs="Arial"/>
-        </w:rPr>
-      </w:pPr>
-      <w:r>
-        <w:rPr>
-          <w:rFonts w:ascii="Arial" w:hAnsi="Arial" w:cs="Arial"/>
-        </w:rPr>
-        <w:t>Your petition will be reviewed by the Tribal Court on the same day it is filed or by the next business day</w:t>
-      </w:r>
-      <w:r>
-        <w:rPr>
-          <w:rFonts w:ascii="Arial" w:hAnsi="Arial" w:cs="Arial"/>
-        </w:rPr>
-        <w:t>.</w:t>
-      </w:r>
-    </w:p>
-    <w:p>
-      <w:pPr>
-        <w:pStyle w:val="ListParagraph"/>
-        <w:ind w:left="360"/>
-        <w:rPr>
-          <w:rFonts w:ascii="Arial" w:hAnsi="Arial" w:cs="Arial"/>
-        </w:rPr>
-      </w:pPr>
+        <w:suppressAutoHyphens/>
+        <w:snapToGrid w:val="0"/>
+        <w:spacing w:after="80" w:line="259" w:lineRule="auto"/>
+        <w:rPr>
+          <w:rFonts w:ascii="Arial" w:eastAsia="Times New Roman" w:hAnsi="Arial" w:cs="Arial"/>
+          <w:kern w:val="0"/>
+          <w:lang w:val="en"/>
+          <w14:textOutline w14:w="9525" w14:cap="rnd" w14:cmpd="sng" w14:algn="ctr">
+            <w14:noFill/>
+            <w14:prstDash w14:val="solid"/>
+            <w14:bevel/>
+          </w14:textOutline>
+          <w14:ligatures w14:val="none"/>
+        </w:rPr>
+      </w:pPr>
+      <w:r>
+        <w:rPr>
+          <w:rFonts w:ascii="Arial" w:eastAsia="Times New Roman" w:hAnsi="Arial" w:cs="Arial"/>
+          <w:kern w:val="0"/>
+          <w:lang w:val="en"/>
+          <w14:ligatures w14:val="none"/>
+        </w:rPr>
+        <w:t>14 days after filing (if no Ex</w:t>
+      </w:r>
+      <w:r>
+        <w:rPr>
+          <w:rFonts w:ascii="Arial" w:eastAsia="Times New Roman" w:hAnsi="Arial" w:cs="Arial"/>
+          <w:kern w:val="0"/>
+          <w:lang w:val="en"/>
+          <w14:ligatures w14:val="none"/>
+        </w:rPr>
+        <w:t>-</w:t>
+      </w:r>
+      <w:proofErr w:type="spellStart"/>
+      <w:r>
+        <w:rPr>
+          <w:rFonts w:ascii="Arial" w:eastAsia="Times New Roman" w:hAnsi="Arial" w:cs="Arial"/>
+          <w:kern w:val="0"/>
+          <w:lang w:val="en"/>
+          <w14:ligatures w14:val="none"/>
+        </w:rPr>
+        <w:t>Parte</w:t>
+      </w:r>
+      <w:proofErr w:type="spellEnd"/>
+      <w:r>
+        <w:rPr>
+          <w:rFonts w:ascii="Arial" w:eastAsia="Times New Roman" w:hAnsi="Arial" w:cs="Arial"/>
+          <w:kern w:val="0"/>
+          <w:lang w:val="en"/>
+          <w14:ligatures w14:val="none"/>
+        </w:rPr>
+        <w:t xml:space="preserve"> order is issued)</w:t>
+      </w:r>
+      <w:r>
+        <w:rPr>
+          <w:rFonts w:ascii="Arial" w:eastAsia="Times New Roman" w:hAnsi="Arial" w:cs="Arial"/>
+          <w:kern w:val="0"/>
+          <w:lang w:val="en"/>
+          <w14:ligatures w14:val="none"/>
+        </w:rPr>
+        <w:t>;</w:t>
+      </w:r>
+      <w:r>
+        <w:rPr>
+          <w:rFonts w:ascii="Arial" w:eastAsia="Times New Roman" w:hAnsi="Arial" w:cs="Arial"/>
+          <w:kern w:val="0"/>
+          <w:lang w:val="en"/>
+          <w14:ligatures w14:val="none"/>
+        </w:rPr>
+        <w:t xml:space="preserve"> or </w:t>
+      </w:r>
     </w:p>
     <w:p>
       <w:pPr>
         <w:pStyle w:val="ListParagraph"/>
         <w:numPr>
           <w:ilvl w:val="0"/>
-          <w:numId w:val="10"/>
+          <w:numId w:val="8"/>
         </w:numPr>
-        <w:rPr>
-          <w:rFonts w:ascii="Arial" w:hAnsi="Arial" w:cs="Arial"/>
-        </w:rPr>
-      </w:pPr>
-      <w:r>
-        <w:rPr>
-          <w:rFonts w:ascii="Arial" w:hAnsi="Arial" w:cs="Arial"/>
+        <w:suppressAutoHyphens/>
+        <w:snapToGrid w:val="0"/>
+        <w:spacing w:after="80" w:line="259" w:lineRule="auto"/>
+        <w:rPr>
+          <w:rFonts w:ascii="Arial" w:eastAsia="Times New Roman" w:hAnsi="Arial" w:cs="Arial"/>
+          <w:kern w:val="0"/>
           <w:lang w:val="en"/>
-        </w:rPr>
-        <w:t>The Tribal Court may contact you if additional information is needed to review your petition.</w:t>
+          <w14:textOutline w14:w="9525" w14:cap="rnd" w14:cmpd="sng" w14:algn="ctr">
+            <w14:noFill/>
+            <w14:prstDash w14:val="solid"/>
+            <w14:bevel/>
+          </w14:textOutline>
+          <w14:ligatures w14:val="none"/>
+        </w:rPr>
+      </w:pPr>
+      <w:r>
+        <w:rPr>
+          <w:rFonts w:ascii="Arial" w:eastAsia="Times New Roman" w:hAnsi="Arial" w:cs="Arial"/>
+          <w:kern w:val="0"/>
+          <w:lang w:val="en"/>
+          <w14:ligatures w14:val="none"/>
+        </w:rPr>
+        <w:t>30 days after issuing an Ex</w:t>
+      </w:r>
+      <w:r>
+        <w:rPr>
+          <w:rFonts w:ascii="Arial" w:eastAsia="Times New Roman" w:hAnsi="Arial" w:cs="Arial"/>
+          <w:kern w:val="0"/>
+          <w:lang w:val="en"/>
+          <w14:ligatures w14:val="none"/>
+        </w:rPr>
+        <w:t>-</w:t>
+      </w:r>
+      <w:proofErr w:type="spellStart"/>
+      <w:r>
+        <w:rPr>
+          <w:rFonts w:ascii="Arial" w:eastAsia="Times New Roman" w:hAnsi="Arial" w:cs="Arial"/>
+          <w:kern w:val="0"/>
+          <w:lang w:val="en"/>
+          <w14:ligatures w14:val="none"/>
+        </w:rPr>
+        <w:t>Parte</w:t>
+      </w:r>
+      <w:proofErr w:type="spellEnd"/>
+      <w:r>
+        <w:rPr>
+          <w:rFonts w:ascii="Arial" w:eastAsia="Times New Roman" w:hAnsi="Arial" w:cs="Arial"/>
+          <w:kern w:val="0"/>
+          <w:lang w:val="en"/>
+          <w14:ligatures w14:val="none"/>
+        </w:rPr>
+        <w:t xml:space="preserve"> order.</w:t>
       </w:r>
     </w:p>
     <w:p>
       <w:pPr>
-        <w:rPr>
-          <w:rFonts w:ascii="Arial" w:hAnsi="Arial" w:cs="Arial"/>
-        </w:rPr>
-      </w:pPr>
-    </w:p>
-    <w:p>
-      <w:pPr>
         <w:pStyle w:val="ListParagraph"/>
-        <w:numPr>
-          <w:ilvl w:val="0"/>
-          <w:numId w:val="10"/>
-        </w:numPr>
-        <w:rPr>
-          <w:rFonts w:ascii="Arial" w:hAnsi="Arial" w:cs="Arial"/>
-        </w:rPr>
-      </w:pPr>
-      <w:r>
-        <w:rPr>
-          <w:rFonts w:ascii="Arial" w:hAnsi="Arial" w:cs="Arial"/>
-        </w:rPr>
-        <w:t>The Tribal Court will decide whether to issue a temporary protection order based on the information you provided.</w:t>
-      </w:r>
-    </w:p>
-    <w:p>
-      <w:pPr>
-        <w:pStyle w:val="ListParagraph"/>
-        <w:numPr>
-          <w:ilvl w:val="1"/>
-          <w:numId w:val="11"/>
-        </w:numPr>
-        <w:rPr>
-          <w:rFonts w:ascii="Arial" w:hAnsi="Arial" w:cs="Arial"/>
-        </w:rPr>
-      </w:pPr>
-      <w:r>
-        <w:rPr>
-          <w:rFonts w:ascii="Arial" w:hAnsi="Arial" w:cs="Arial"/>
-        </w:rPr>
-        <w:t xml:space="preserve">If no </w:t>
-      </w:r>
-      <w:r>
-        <w:rPr>
-          <w:rFonts w:ascii="Arial" w:hAnsi="Arial" w:cs="Arial"/>
-        </w:rPr>
-        <w:t xml:space="preserve">ex </w:t>
-      </w:r>
-      <w:proofErr w:type="spellStart"/>
-      <w:r>
-        <w:rPr>
-          <w:rFonts w:ascii="Arial" w:hAnsi="Arial" w:cs="Arial"/>
-        </w:rPr>
-        <w:t>parte</w:t>
-      </w:r>
-      <w:proofErr w:type="spellEnd"/>
-      <w:r>
-        <w:rPr>
-          <w:rFonts w:ascii="Arial" w:hAnsi="Arial" w:cs="Arial"/>
-        </w:rPr>
-        <w:t xml:space="preserve"> order is issued, the hearing will usually be scheduled within 14 days after filing your petition.</w:t>
-      </w:r>
-    </w:p>
-    <w:p>
-      <w:pPr>
-        <w:pStyle w:val="ListParagraph"/>
-        <w:numPr>
-          <w:ilvl w:val="1"/>
-          <w:numId w:val="11"/>
-        </w:numPr>
-        <w:rPr>
-          <w:rFonts w:ascii="Arial" w:hAnsi="Arial" w:cs="Arial"/>
-        </w:rPr>
-      </w:pPr>
-      <w:r>
-        <w:rPr>
-          <w:rFonts w:ascii="Arial" w:hAnsi="Arial" w:cs="Arial"/>
-        </w:rPr>
-        <w:t>If a</w:t>
-      </w:r>
-      <w:r>
-        <w:rPr>
-          <w:rFonts w:ascii="Arial" w:hAnsi="Arial" w:cs="Arial"/>
-        </w:rPr>
-        <w:t xml:space="preserve">n ex </w:t>
-      </w:r>
-      <w:proofErr w:type="spellStart"/>
-      <w:r>
-        <w:rPr>
-          <w:rFonts w:ascii="Arial" w:hAnsi="Arial" w:cs="Arial"/>
-        </w:rPr>
-        <w:t>parte</w:t>
-      </w:r>
-      <w:proofErr w:type="spellEnd"/>
-      <w:r>
-        <w:rPr>
-          <w:rFonts w:ascii="Arial" w:hAnsi="Arial" w:cs="Arial"/>
-        </w:rPr>
-        <w:t xml:space="preserve"> </w:t>
-      </w:r>
-      <w:r>
-        <w:rPr>
-          <w:rFonts w:ascii="Arial" w:hAnsi="Arial" w:cs="Arial"/>
-        </w:rPr>
-        <w:t>order is issued, the hearing will usually be scheduled within 30 days after the order is issued.</w:t>
-      </w:r>
-    </w:p>
-    <w:p>
-      <w:pPr>
-        <w:ind w:left="720"/>
-        <w:rPr>
-          <w:rFonts w:ascii="Arial" w:hAnsi="Arial" w:cs="Arial"/>
-        </w:rPr>
-      </w:pPr>
-    </w:p>
-    <w:p>
-      <w:pPr>
-        <w:pStyle w:val="ListParagraph"/>
-        <w:numPr>
-          <w:ilvl w:val="0"/>
-          <w:numId w:val="10"/>
-        </w:numPr>
-        <w:rPr>
-          <w:rFonts w:ascii="Arial" w:hAnsi="Arial" w:cs="Arial"/>
-        </w:rPr>
-      </w:pPr>
-      <w:r>
-        <w:rPr>
-          <w:rFonts w:ascii="Arial" w:hAnsi="Arial" w:cs="Arial"/>
-        </w:rPr>
-        <w:t>If you cannot attend the hearing, contact the Tribal Court as soon as possible. Missing the hearing may result in your petition being dismissed or your temporary protection order ending.</w:t>
-      </w:r>
+        <w:suppressAutoHyphens/>
+        <w:snapToGrid w:val="0"/>
+        <w:spacing w:after="80" w:line="259" w:lineRule="auto"/>
+        <w:rPr>
+          <w:rFonts w:ascii="Arial" w:eastAsia="Times New Roman" w:hAnsi="Arial" w:cs="Arial"/>
+          <w:kern w:val="0"/>
+          <w:lang w:val="en"/>
+          <w14:textOutline w14:w="9525" w14:cap="rnd" w14:cmpd="sng" w14:algn="ctr">
+            <w14:noFill/>
+            <w14:prstDash w14:val="solid"/>
+            <w14:bevel/>
+          </w14:textOutline>
+          <w14:ligatures w14:val="none"/>
+        </w:rPr>
+      </w:pPr>
     </w:p>
     <w:p>
       <w:pPr>
@@ -344,57 +488,169 @@
           <w:kern w:val="0"/>
           <w14:ligatures w14:val="none"/>
         </w:rPr>
-        <w:t xml:space="preserve">Ex </w:t>
-      </w:r>
-      <w:proofErr w:type="spellStart"/>
-      <w:r>
-        <w:rPr>
-          <w:rFonts w:ascii="Arial" w:eastAsia="Times New Roman" w:hAnsi="Arial" w:cs="Arial"/>
-          <w:b/>
-          <w:color w:val="0B5294"/>
-          <w:kern w:val="0"/>
-          <w14:ligatures w14:val="none"/>
-        </w:rPr>
-        <w:t>Parte</w:t>
-      </w:r>
-      <w:proofErr w:type="spellEnd"/>
-      <w:r>
-        <w:rPr>
-          <w:rFonts w:ascii="Arial" w:eastAsia="Times New Roman" w:hAnsi="Arial" w:cs="Arial"/>
-          <w:b/>
-          <w:color w:val="0B5294"/>
-          <w:kern w:val="0"/>
-          <w14:ligatures w14:val="none"/>
-        </w:rPr>
-        <w:t xml:space="preserve"> Orders</w:t>
+        <w:t>What happens in the hearing?</w:t>
       </w:r>
     </w:p>
     <w:p>
       <w:pPr>
-        <w:rPr>
-          <w:rFonts w:ascii="Arial" w:hAnsi="Arial" w:cs="Arial"/>
-        </w:rPr>
-      </w:pPr>
-      <w:r>
-        <w:rPr>
-          <w:rFonts w:ascii="Arial" w:hAnsi="Arial" w:cs="Arial"/>
-        </w:rPr>
-        <w:t xml:space="preserve">An ex </w:t>
-      </w:r>
-      <w:proofErr w:type="spellStart"/>
-      <w:r>
-        <w:rPr>
-          <w:rFonts w:ascii="Arial" w:hAnsi="Arial" w:cs="Arial"/>
-        </w:rPr>
-        <w:t>parte</w:t>
-      </w:r>
-      <w:proofErr w:type="spellEnd"/>
-      <w:r>
-        <w:rPr>
-          <w:rFonts w:ascii="Arial" w:hAnsi="Arial" w:cs="Arial"/>
-        </w:rPr>
-        <w:t xml:space="preserve"> order is a temporary protection order that may be issued if the Tribal Court believes you are in immediate danger. This order can provide protection until the court holds a full hearing.</w:t>
-      </w:r>
+        <w:spacing w:after="160" w:line="259" w:lineRule="auto"/>
+        <w:rPr>
+          <w:rFonts w:ascii="Arial" w:eastAsia="Calibri" w:hAnsi="Arial" w:cs="Arial"/>
+          <w:kern w:val="0"/>
+          <w14:ligatures w14:val="none"/>
+        </w:rPr>
+      </w:pPr>
+      <w:r>
+        <w:rPr>
+          <w:rFonts w:ascii="Arial" w:eastAsia="Calibri" w:hAnsi="Arial" w:cs="Arial"/>
+          <w:kern w:val="0"/>
+          <w14:ligatures w14:val="none"/>
+        </w:rPr>
+        <w:t xml:space="preserve">The </w:t>
+      </w:r>
+      <w:r>
+        <w:rPr>
+          <w:rFonts w:ascii="Arial" w:eastAsia="Calibri" w:hAnsi="Arial" w:cs="Arial"/>
+          <w:kern w:val="0"/>
+          <w14:ligatures w14:val="none"/>
+        </w:rPr>
+        <w:t>Tribal J</w:t>
+      </w:r>
+      <w:r>
+        <w:rPr>
+          <w:rFonts w:ascii="Arial" w:eastAsia="Calibri" w:hAnsi="Arial" w:cs="Arial"/>
+          <w:kern w:val="0"/>
+          <w14:ligatures w14:val="none"/>
+        </w:rPr>
+        <w:t>udge reads your complaint</w:t>
+      </w:r>
+      <w:r>
+        <w:rPr>
+          <w:rFonts w:ascii="Arial" w:eastAsia="Calibri" w:hAnsi="Arial" w:cs="Arial"/>
+          <w:kern w:val="0"/>
+          <w14:ligatures w14:val="none"/>
+        </w:rPr>
+        <w:t xml:space="preserve"> and </w:t>
+      </w:r>
+      <w:r>
+        <w:rPr>
+          <w:rFonts w:ascii="Arial" w:eastAsia="Calibri" w:hAnsi="Arial" w:cs="Arial"/>
+          <w:kern w:val="0"/>
+          <w14:ligatures w14:val="none"/>
+        </w:rPr>
+        <w:t>may ask you questions.</w:t>
+      </w:r>
+    </w:p>
+    <w:p>
+      <w:pPr>
+        <w:spacing w:after="160" w:line="259" w:lineRule="auto"/>
+        <w:rPr>
+          <w:rFonts w:ascii="Arial" w:eastAsia="Calibri" w:hAnsi="Arial" w:cs="Arial"/>
+          <w:kern w:val="0"/>
+          <w14:ligatures w14:val="none"/>
+        </w:rPr>
+      </w:pPr>
+      <w:r>
+        <w:rPr>
+          <w:rFonts w:ascii="Arial" w:eastAsia="Calibri" w:hAnsi="Arial" w:cs="Arial"/>
+          <w:bCs/>
+          <w:kern w:val="0"/>
+          <w14:ligatures w14:val="none"/>
+        </w:rPr>
+        <w:t>Tell</w:t>
+      </w:r>
+      <w:r>
+        <w:rPr>
+          <w:rFonts w:ascii="Arial" w:eastAsia="Calibri" w:hAnsi="Arial" w:cs="Arial"/>
+          <w:kern w:val="0"/>
+          <w14:ligatures w14:val="none"/>
+        </w:rPr>
+        <w:t xml:space="preserve"> the </w:t>
+      </w:r>
+      <w:r>
+        <w:rPr>
+          <w:rFonts w:ascii="Arial" w:eastAsia="Calibri" w:hAnsi="Arial" w:cs="Arial"/>
+          <w:kern w:val="0"/>
+          <w14:ligatures w14:val="none"/>
+        </w:rPr>
+        <w:t>Tribal J</w:t>
+      </w:r>
+      <w:r>
+        <w:rPr>
+          <w:rFonts w:ascii="Arial" w:eastAsia="Calibri" w:hAnsi="Arial" w:cs="Arial"/>
+          <w:kern w:val="0"/>
+          <w14:ligatures w14:val="none"/>
+        </w:rPr>
+        <w:t xml:space="preserve">udge why you need </w:t>
+      </w:r>
+      <w:r>
+        <w:rPr>
+          <w:rFonts w:ascii="Arial" w:eastAsia="Calibri" w:hAnsi="Arial" w:cs="Arial"/>
+          <w:kern w:val="0"/>
+          <w14:ligatures w14:val="none"/>
+        </w:rPr>
+        <w:t xml:space="preserve">the </w:t>
+      </w:r>
+      <w:r>
+        <w:rPr>
+          <w:rFonts w:ascii="Arial" w:eastAsia="Calibri" w:hAnsi="Arial" w:cs="Arial"/>
+          <w:kern w:val="0"/>
+          <w14:ligatures w14:val="none"/>
+        </w:rPr>
+        <w:t>Harassment Protection</w:t>
+      </w:r>
+      <w:r>
+        <w:rPr>
+          <w:rFonts w:ascii="Arial" w:eastAsia="Calibri" w:hAnsi="Arial" w:cs="Arial"/>
+          <w:kern w:val="0"/>
+          <w14:ligatures w14:val="none"/>
+        </w:rPr>
+        <w:t xml:space="preserve"> Order granted</w:t>
+      </w:r>
+      <w:r>
+        <w:rPr>
+          <w:rFonts w:ascii="Arial" w:eastAsia="Calibri" w:hAnsi="Arial" w:cs="Arial"/>
+          <w:kern w:val="0"/>
+          <w14:ligatures w14:val="none"/>
+        </w:rPr>
+        <w:t xml:space="preserve">. Talk about the facts that you wrote in your complaint. </w:t>
+      </w:r>
+      <w:r>
+        <w:rPr>
+          <w:rFonts w:ascii="Arial" w:eastAsia="Calibri" w:hAnsi="Arial" w:cs="Arial"/>
+          <w:kern w:val="0"/>
+          <w14:ligatures w14:val="none"/>
+        </w:rPr>
+        <w:t>Present to the Tribal Judge any evidence that you may have.</w:t>
+      </w:r>
+    </w:p>
+    <w:p>
+      <w:pPr>
+        <w:spacing w:after="160" w:line="259" w:lineRule="auto"/>
+        <w:rPr>
+          <w:rFonts w:ascii="Arial" w:eastAsia="Calibri" w:hAnsi="Arial" w:cs="Arial"/>
+          <w:kern w:val="0"/>
+          <w14:ligatures w14:val="none"/>
+        </w:rPr>
+      </w:pPr>
+      <w:r>
+        <w:rPr>
+          <w:rFonts w:ascii="Arial" w:eastAsia="Calibri" w:hAnsi="Arial" w:cs="Arial"/>
+          <w:kern w:val="0"/>
+          <w14:ligatures w14:val="none"/>
+        </w:rPr>
+        <w:t>The respondent will also have a chance to attend and respond.</w:t>
+      </w:r>
+    </w:p>
+    <w:p>
+      <w:pPr>
+        <w:spacing w:after="160" w:line="259" w:lineRule="auto"/>
+        <w:rPr>
+          <w:rFonts w:ascii="Arial" w:eastAsia="Calibri" w:hAnsi="Arial" w:cs="Arial"/>
+          <w:kern w:val="0"/>
+          <w14:ligatures w14:val="none"/>
+        </w:rPr>
+      </w:pPr>
     </w:p>
     <w:p>
       <w:pPr>
@@ -421,111 +677,175 @@
           <w:kern w:val="0"/>
           <w14:ligatures w14:val="none"/>
         </w:rPr>
-        <w:t>Preparing for your Hearing</w:t>
+        <w:t xml:space="preserve">What can the </w:t>
+      </w:r>
+      <w:r>
+        <w:rPr>
+          <w:rFonts w:ascii="Arial" w:eastAsia="Times New Roman" w:hAnsi="Arial" w:cs="Arial"/>
+          <w:b/>
+          <w:color w:val="0B5294"/>
+          <w:kern w:val="0"/>
+          <w14:ligatures w14:val="none"/>
+        </w:rPr>
+        <w:t>Tribal J</w:t>
+      </w:r>
+      <w:r>
+        <w:rPr>
+          <w:rFonts w:ascii="Arial" w:eastAsia="Times New Roman" w:hAnsi="Arial" w:cs="Arial"/>
+          <w:b/>
+          <w:color w:val="0B5294"/>
+          <w:kern w:val="0"/>
+          <w14:ligatures w14:val="none"/>
+        </w:rPr>
+        <w:t>udge do?</w:t>
       </w:r>
     </w:p>
     <w:p>
       <w:pPr>
-        <w:rPr>
-          <w:rFonts w:ascii="Arial" w:hAnsi="Arial" w:cs="Arial"/>
-        </w:rPr>
-      </w:pPr>
-      <w:r>
-        <w:rPr>
-          <w:rFonts w:ascii="Arial" w:hAnsi="Arial" w:cs="Arial"/>
-        </w:rPr>
-        <w:t>At the hearing, the Tribal Judge will review your petition and may ask you questions.</w:t>
+        <w:spacing w:after="160" w:line="259" w:lineRule="auto"/>
+        <w:rPr>
+          <w:rFonts w:ascii="Arial" w:eastAsia="Calibri" w:hAnsi="Arial" w:cs="Arial"/>
+          <w:kern w:val="0"/>
+          <w14:ligatures w14:val="none"/>
+        </w:rPr>
+      </w:pPr>
+      <w:r>
+        <w:rPr>
+          <w:rFonts w:ascii="Arial" w:eastAsia="Calibri" w:hAnsi="Arial" w:cs="Arial"/>
+          <w:kern w:val="0"/>
+          <w14:ligatures w14:val="none"/>
+        </w:rPr>
+        <w:t xml:space="preserve">At or after the hearing, the </w:t>
+      </w:r>
+      <w:r>
+        <w:rPr>
+          <w:rFonts w:ascii="Arial" w:eastAsia="Calibri" w:hAnsi="Arial" w:cs="Arial"/>
+          <w:kern w:val="0"/>
+          <w14:ligatures w14:val="none"/>
+        </w:rPr>
+        <w:t>Tribal Judge</w:t>
+      </w:r>
+      <w:r>
+        <w:rPr>
+          <w:rFonts w:ascii="Arial" w:eastAsia="Calibri" w:hAnsi="Arial" w:cs="Arial"/>
+          <w:kern w:val="0"/>
+          <w14:ligatures w14:val="none"/>
+        </w:rPr>
+        <w:t xml:space="preserve"> may:</w:t>
       </w:r>
     </w:p>
     <w:p>
       <w:pPr>
-        <w:suppressAutoHyphens/>
-        <w:snapToGrid w:val="0"/>
-        <w:spacing w:after="80" w:line="259" w:lineRule="auto"/>
-        <w:rPr>
-          <w:rFonts w:ascii="Arial" w:eastAsia="Times New Roman" w:hAnsi="Arial" w:cs="Arial"/>
-          <w:kern w:val="0"/>
-          <w14:textOutline w14:w="9525" w14:cap="rnd" w14:cmpd="sng" w14:algn="ctr">
-            <w14:noFill/>
-            <w14:prstDash w14:val="solid"/>
-            <w14:bevel/>
-          </w14:textOutline>
-          <w14:ligatures w14:val="none"/>
-        </w:rPr>
-      </w:pPr>
+        <w:numPr>
+          <w:ilvl w:val="0"/>
+          <w:numId w:val="5"/>
+        </w:numPr>
+        <w:spacing w:after="160" w:line="259" w:lineRule="auto"/>
+        <w:ind w:left="720"/>
+        <w:contextualSpacing/>
+        <w:rPr>
+          <w:rFonts w:ascii="Arial" w:eastAsia="Times New Roman" w:hAnsi="Arial" w:cs="Arial"/>
+          <w:kern w:val="0"/>
+          <w:lang w:val="en"/>
+          <w14:ligatures w14:val="none"/>
+        </w:rPr>
+      </w:pPr>
+      <w:r>
+        <w:rPr>
+          <w:rFonts w:ascii="Arial" w:eastAsia="Times New Roman" w:hAnsi="Arial" w:cs="Arial"/>
+          <w:kern w:val="0"/>
+          <w:lang w:val="en"/>
+          <w14:ligatures w14:val="none"/>
+        </w:rPr>
+        <w:t>grant a Protection Order (lasting up to 12 months);</w:t>
+      </w:r>
     </w:p>
     <w:p>
       <w:pPr>
-        <w:rPr>
-          <w:rFonts w:ascii="Arial" w:hAnsi="Arial" w:cs="Arial"/>
-        </w:rPr>
-      </w:pPr>
-      <w:r>
-        <w:rPr>
-          <w:rFonts w:ascii="Arial" w:hAnsi="Arial" w:cs="Arial"/>
-        </w:rPr>
-        <w:t>You should explain why you are asking for a protection order and describe what happened that led you to file your petition.</w:t>
+        <w:numPr>
+          <w:ilvl w:val="0"/>
+          <w:numId w:val="5"/>
+        </w:numPr>
+        <w:spacing w:after="160" w:line="259" w:lineRule="auto"/>
+        <w:ind w:left="720"/>
+        <w:contextualSpacing/>
+        <w:rPr>
+          <w:rFonts w:ascii="Arial" w:eastAsia="Times New Roman" w:hAnsi="Arial" w:cs="Arial"/>
+          <w:kern w:val="0"/>
+          <w:lang w:val="en"/>
+          <w14:ligatures w14:val="none"/>
+        </w:rPr>
+      </w:pPr>
+      <w:r>
+        <w:rPr>
+          <w:rFonts w:ascii="Arial" w:eastAsia="Times New Roman" w:hAnsi="Arial" w:cs="Arial"/>
+          <w:kern w:val="0"/>
+          <w:lang w:val="en"/>
+          <w14:ligatures w14:val="none"/>
+        </w:rPr>
+        <w:t>modify or extend a temporary order; or</w:t>
       </w:r>
     </w:p>
     <w:p>
       <w:pPr>
-        <w:rPr>
-          <w:rFonts w:ascii="Arial" w:hAnsi="Arial" w:cs="Arial"/>
-        </w:rPr>
-      </w:pPr>
+        <w:numPr>
+          <w:ilvl w:val="0"/>
+          <w:numId w:val="5"/>
+        </w:numPr>
+        <w:spacing w:after="160" w:line="259" w:lineRule="auto"/>
+        <w:ind w:left="720"/>
+        <w:contextualSpacing/>
+        <w:rPr>
+          <w:rFonts w:ascii="Arial" w:eastAsia="Times New Roman" w:hAnsi="Arial" w:cs="Arial"/>
+          <w:kern w:val="0"/>
+          <w:lang w:val="en"/>
+          <w14:ligatures w14:val="none"/>
+        </w:rPr>
+      </w:pPr>
+      <w:r>
+        <w:rPr>
+          <w:rFonts w:ascii="Arial" w:eastAsia="Times New Roman" w:hAnsi="Arial" w:cs="Arial"/>
+          <w:kern w:val="0"/>
+          <w:lang w:val="en"/>
+          <w14:ligatures w14:val="none"/>
+        </w:rPr>
+        <w:t>deny the petition</w:t>
+      </w:r>
+      <w:r>
+        <w:rPr>
+          <w:rFonts w:ascii="Arial" w:eastAsia="Times New Roman" w:hAnsi="Arial" w:cs="Arial"/>
+          <w:kern w:val="0"/>
+          <w:lang w:val="en"/>
+          <w14:ligatures w14:val="none"/>
+        </w:rPr>
+        <w:t>.</w:t>
+      </w:r>
     </w:p>
     <w:p>
       <w:pPr>
-        <w:rPr>
-          <w:rFonts w:ascii="Arial" w:hAnsi="Arial" w:cs="Arial"/>
-        </w:rPr>
-      </w:pPr>
-      <w:r>
-        <w:rPr>
-          <w:rFonts w:ascii="Arial" w:hAnsi="Arial" w:cs="Arial"/>
-        </w:rPr>
-        <w:t>You may bring evidence to support your request, such as text messages, emails, photos, medical records, police reports, or statements from witnesses.</w:t>
-      </w:r>
+        <w:spacing w:after="160" w:line="259" w:lineRule="auto"/>
+        <w:ind w:left="720"/>
+        <w:contextualSpacing/>
+        <w:rPr>
+          <w:rFonts w:ascii="Arial" w:eastAsia="Times New Roman" w:hAnsi="Arial" w:cs="Arial"/>
+          <w:kern w:val="0"/>
+          <w:lang w:val="en"/>
+          <w14:ligatures w14:val="none"/>
+        </w:rPr>
+      </w:pPr>
     </w:p>
     <w:p>
       <w:pPr>
-        <w:rPr>
-          <w:rFonts w:ascii="Arial" w:hAnsi="Arial" w:cs="Arial"/>
-        </w:rPr>
-      </w:pPr>
-    </w:p>
-    <w:p>
-      <w:pPr>
-        <w:rPr>
-          <w:rFonts w:ascii="Arial" w:hAnsi="Arial" w:cs="Arial"/>
-        </w:rPr>
-      </w:pPr>
-      <w:r>
-        <w:rPr>
-          <w:rFonts w:ascii="Arial" w:hAnsi="Arial" w:cs="Arial"/>
-        </w:rPr>
-        <w:t>The defendant will also have the opportunity to attend and respond to your petition.</w:t>
-      </w:r>
-    </w:p>
-    <w:p>
-      <w:pPr>
-        <w:rPr>
-          <w:rFonts w:ascii="Arial" w:hAnsi="Arial" w:cs="Arial"/>
-        </w:rPr>
-      </w:pPr>
-    </w:p>
-    <w:p>
-      <w:pPr>
-        <w:rPr>
-          <w:rFonts w:ascii="Arial" w:hAnsi="Arial" w:cs="Arial"/>
-        </w:rPr>
-      </w:pPr>
-      <w:r>
-        <w:rPr>
-          <w:rFonts w:ascii="Arial" w:hAnsi="Arial" w:cs="Arial"/>
-        </w:rPr>
-        <w:t>The Tribal Court will decide whether it believes the harassment you described likely happened or could happen again.</w:t>
-      </w:r>
+        <w:spacing w:after="160" w:line="259" w:lineRule="auto"/>
+        <w:ind w:left="720"/>
+        <w:contextualSpacing/>
+        <w:rPr>
+          <w:rFonts w:ascii="Arial" w:eastAsia="Times New Roman" w:hAnsi="Arial" w:cs="Arial"/>
+          <w:kern w:val="0"/>
+          <w:lang w:val="en"/>
+          <w14:ligatures w14:val="none"/>
+        </w:rPr>
+      </w:pPr>
     </w:p>
     <w:p>
       <w:pPr>
@@ -552,41 +872,87 @@
           <w:kern w:val="0"/>
           <w14:ligatures w14:val="none"/>
         </w:rPr>
-        <w:t>What are the possible outcomes?</w:t>
+        <w:t xml:space="preserve">What happens if the </w:t>
+      </w:r>
+      <w:r>
+        <w:rPr>
+          <w:rFonts w:ascii="Arial" w:eastAsia="Times New Roman" w:hAnsi="Arial" w:cs="Arial"/>
+          <w:b/>
+          <w:color w:val="0B5294"/>
+          <w:kern w:val="0"/>
+          <w14:ligatures w14:val="none"/>
+        </w:rPr>
+        <w:t>Tribal Judge</w:t>
+      </w:r>
+      <w:r>
+        <w:rPr>
+          <w:rFonts w:ascii="Arial" w:eastAsia="Times New Roman" w:hAnsi="Arial" w:cs="Arial"/>
+          <w:b/>
+          <w:color w:val="0B5294"/>
+          <w:kern w:val="0"/>
+          <w14:ligatures w14:val="none"/>
+        </w:rPr>
+        <w:t xml:space="preserve"> </w:t>
+      </w:r>
+      <w:r>
+        <w:rPr>
+          <w:rFonts w:ascii="Arial" w:eastAsia="Times New Roman" w:hAnsi="Arial" w:cs="Arial"/>
+          <w:b/>
+          <w:color w:val="0B5294"/>
+          <w:kern w:val="0"/>
+          <w14:ligatures w14:val="none"/>
+        </w:rPr>
+        <w:t>grants</w:t>
+      </w:r>
+      <w:r>
+        <w:rPr>
+          <w:rFonts w:ascii="Arial" w:eastAsia="Times New Roman" w:hAnsi="Arial" w:cs="Arial"/>
+          <w:b/>
+          <w:color w:val="0B5294"/>
+          <w:kern w:val="0"/>
+          <w14:ligatures w14:val="none"/>
+        </w:rPr>
+        <w:t xml:space="preserve"> the order?</w:t>
       </w:r>
     </w:p>
     <w:p>
       <w:pPr>
-        <w:rPr>
-          <w:rFonts w:ascii="Arial" w:hAnsi="Arial" w:cs="Arial"/>
-        </w:rPr>
-      </w:pPr>
-      <w:r>
-        <w:rPr>
-          <w:rFonts w:ascii="Arial" w:hAnsi="Arial" w:cs="Arial"/>
-        </w:rPr>
-        <w:t>At or after the hearing, the Tribal Judge may grant a protection order, modify or extend a temporary protection order, or deny the petition.</w:t>
+        <w:spacing w:after="80"/>
+        <w:rPr>
+          <w:rFonts w:ascii="Arial" w:eastAsia="Calibri" w:hAnsi="Arial" w:cs="Arial"/>
+          <w:b/>
+          <w:kern w:val="0"/>
+          <w14:ligatures w14:val="none"/>
+        </w:rPr>
+      </w:pPr>
+      <w:r>
+        <w:rPr>
+          <w:rFonts w:ascii="Arial" w:eastAsia="Calibri" w:hAnsi="Arial" w:cs="Arial"/>
+          <w:kern w:val="0"/>
+          <w14:ligatures w14:val="none"/>
+        </w:rPr>
+        <w:t>The Tribal Police and local law enforcement will receive copies of your order to ensure enforcement both on and off Tribal Lands</w:t>
+      </w:r>
+      <w:r>
+        <w:rPr>
+          <w:rFonts w:ascii="Arial" w:eastAsia="Calibri" w:hAnsi="Arial" w:cs="Arial"/>
+          <w:b/>
+          <w:kern w:val="0"/>
+          <w14:ligatures w14:val="none"/>
+        </w:rPr>
+        <w:t>.</w:t>
       </w:r>
     </w:p>
     <w:p>
       <w:pPr>
-        <w:rPr>
-          <w:rFonts w:ascii="Arial" w:hAnsi="Arial" w:cs="Arial"/>
-        </w:rPr>
-      </w:pPr>
-    </w:p>
-    <w:p>
-      <w:pPr>
-        <w:rPr>
-          <w:rFonts w:ascii="Arial" w:hAnsi="Arial" w:cs="Arial"/>
-        </w:rPr>
-      </w:pPr>
-      <w:r>
-        <w:rPr>
-          <w:rFonts w:ascii="Arial" w:hAnsi="Arial" w:cs="Arial"/>
-        </w:rPr>
-        <w:t>If the protection order is granted, it may require the defendant to stop contacting you, stay away from your home, job, or school, or follow other rules set by the court.</w:t>
-      </w:r>
+        <w:spacing w:after="80"/>
+        <w:rPr>
+          <w:rFonts w:ascii="Arial" w:eastAsia="Calibri" w:hAnsi="Arial" w:cs="Arial"/>
+          <w:b/>
+          <w:kern w:val="0"/>
+          <w14:ligatures w14:val="none"/>
+        </w:rPr>
+      </w:pPr>
     </w:p>
     <w:p>
       <w:pPr>
@@ -613,92 +979,11 @@
           <w:kern w:val="0"/>
           <w14:ligatures w14:val="none"/>
         </w:rPr>
-        <w:t xml:space="preserve">What happens if the </w:t>
-      </w:r>
-      <w:r>
-        <w:rPr>
-          <w:rFonts w:ascii="Arial" w:eastAsia="Times New Roman" w:hAnsi="Arial" w:cs="Arial"/>
-          <w:b/>
-          <w:color w:val="0B5294"/>
-          <w:kern w:val="0"/>
-          <w14:ligatures w14:val="none"/>
-        </w:rPr>
-        <w:t>Tribal Judge</w:t>
-      </w:r>
-      <w:r>
-        <w:rPr>
-          <w:rFonts w:ascii="Arial" w:eastAsia="Times New Roman" w:hAnsi="Arial" w:cs="Arial"/>
-          <w:b/>
-          <w:color w:val="0B5294"/>
-          <w:kern w:val="0"/>
-          <w14:ligatures w14:val="none"/>
-        </w:rPr>
-        <w:t xml:space="preserve"> </w:t>
-      </w:r>
-      <w:r>
-        <w:rPr>
-          <w:rFonts w:ascii="Arial" w:eastAsia="Times New Roman" w:hAnsi="Arial" w:cs="Arial"/>
-          <w:b/>
-          <w:color w:val="0B5294"/>
-          <w:kern w:val="0"/>
-          <w14:ligatures w14:val="none"/>
-        </w:rPr>
-        <w:t>grants</w:t>
-      </w:r>
-      <w:r>
-        <w:rPr>
-          <w:rFonts w:ascii="Arial" w:eastAsia="Times New Roman" w:hAnsi="Arial" w:cs="Arial"/>
-          <w:b/>
-          <w:color w:val="0B5294"/>
-          <w:kern w:val="0"/>
-          <w14:ligatures w14:val="none"/>
-        </w:rPr>
-        <w:t xml:space="preserve"> the order?</w:t>
+        <w:t>Learn more</w:t>
       </w:r>
     </w:p>
     <w:p>
       <w:pPr>
-        <w:rPr>
-          <w:rFonts w:ascii="Arial" w:hAnsi="Arial" w:cs="Arial"/>
-        </w:rPr>
-      </w:pPr>
-      <w:r>
-        <w:rPr>
-          <w:rFonts w:ascii="Arial" w:hAnsi="Arial" w:cs="Arial"/>
-        </w:rPr>
-        <w:t>The Tribal Police and local law enforcement will receive copies of your order to ensure enforcement both on and off Tribal Lands.</w:t>
-      </w:r>
-    </w:p>
-    <w:p>
-      <w:pPr>
-        <w:keepNext/>
-        <w:keepLines/>
-        <w:pBdr>
-          <w:bottom w:val="single" w:sz="12" w:space="1" w:color="0B5294"/>
-        </w:pBdr>
-        <w:spacing w:before="240" w:line="259" w:lineRule="auto"/>
-        <w:outlineLvl w:val="1"/>
-        <w:rPr>
-          <w:rFonts w:ascii="Arial" w:eastAsia="Times New Roman" w:hAnsi="Arial" w:cs="Arial"/>
-          <w:b/>
-          <w:color w:val="0B5294"/>
-          <w:kern w:val="0"/>
-          <w14:ligatures w14:val="none"/>
-        </w:rPr>
-      </w:pPr>
-      <w:r>
-        <w:rPr>
-          <w:rFonts w:ascii="Arial" w:eastAsia="Times New Roman" w:hAnsi="Arial" w:cs="Arial"/>
-          <w:b/>
-          <w:color w:val="0B5294"/>
-          <w:kern w:val="0"/>
-          <w14:ligatures w14:val="none"/>
-        </w:rPr>
-        <w:t>If you Need Help</w:t>
-      </w:r>
-    </w:p>
-    <w:p>
-      <w:pPr>
         <w:keepNext/>
         <w:spacing w:after="160" w:line="259" w:lineRule="auto"/>
         <w:rPr>
@@ -713,53 +998,7 @@
           <w:kern w:val="0"/>
           <w14:ligatures w14:val="none"/>
         </w:rPr>
-        <w:t>If you have questions about your petition or court process, contact the Mashpee Wampanoag Tribal Court.</w:t>
-      </w:r>
-    </w:p>
-    <w:p>
-      <w:pPr>
-        <w:keepNext/>
-        <w:spacing w:after="160" w:line="259" w:lineRule="auto"/>
-        <w:rPr>
-          <w:rFonts w:ascii="Arial" w:eastAsia="Calibri" w:hAnsi="Arial" w:cs="Arial"/>
-          <w:kern w:val="0"/>
-          <w14:ligatures w14:val="none"/>
-        </w:rPr>
-      </w:pPr>
-      <w:r>
-        <w:rPr>
-          <w:rFonts w:ascii="Arial" w:eastAsia="Calibri" w:hAnsi="Arial" w:cs="Arial"/>
-          <w:kern w:val="0"/>
-          <w14:ligatures w14:val="none"/>
-        </w:rPr>
-        <w:t>Hours of Operation: Monday–Friday 8:30 AM–4:30 PM</w:t>
-      </w:r>
-    </w:p>
-    <w:p>
-      <w:pPr>
-        <w:keepNext/>
-        <w:spacing w:after="160" w:line="259" w:lineRule="auto"/>
-        <w:rPr>
-          <w:rFonts w:ascii="Arial" w:eastAsia="Calibri" w:hAnsi="Arial" w:cs="Arial"/>
-          <w:kern w:val="0"/>
-          <w14:ligatures w14:val="none"/>
-        </w:rPr>
-      </w:pPr>
-      <w:r>
-        <w:rPr>
-          <w:rFonts w:ascii="Arial" w:eastAsia="Calibri" w:hAnsi="Arial" w:cs="Arial"/>
-          <w:kern w:val="0"/>
-          <w14:ligatures w14:val="none"/>
-        </w:rPr>
-        <w:t>Website</w:t>
-      </w:r>
-      <w:r>
-        <w:rPr>
-          <w:rFonts w:ascii="Arial" w:eastAsia="Calibri" w:hAnsi="Arial" w:cs="Arial"/>
-          <w:kern w:val="0"/>
-          <w14:ligatures w14:val="none"/>
-        </w:rPr>
-        <w:t xml:space="preserve">: </w:t>
+        <w:t xml:space="preserve">Visit: </w:t>
       </w:r>
       <w:hyperlink r:id="rId8" w:history="1">
         <w:r>
@@ -791,17 +1030,20 @@
           <w:kern w:val="0"/>
           <w14:ligatures w14:val="none"/>
         </w:rPr>
-        <w:t>Phone</w:t>
-      </w:r>
-      <w:r>
-        <w:rPr>
-          <w:rFonts w:ascii="Arial" w:eastAsia="Calibri" w:hAnsi="Arial" w:cs="Arial"/>
-          <w:kern w:val="0"/>
-          <w14:ligatures w14:val="none"/>
-        </w:rPr>
-        <w:t>: (508) 477-0208</w:t>
+        <w:t>Contact Number: (508) 477-0208</w:t>
       </w:r>
     </w:p>
+    <w:p>
+      <w:pPr>
+        <w:spacing w:after="160" w:line="259" w:lineRule="auto"/>
+        <w:rPr>
+          <w:rFonts w:ascii="Arial" w:eastAsia="Calibri" w:hAnsi="Arial" w:cs="Arial"/>
+          <w:kern w:val="0"/>
+          <w14:ligatures w14:val="none"/>
+        </w:rPr>
+      </w:pPr>
+    </w:p>
+    <w:p/>
     <w:sectPr>
       <w:type w:val="continuous"/>
       <w:pgSz w:w="12240" w:h="15840"/>
@@ -923,6 +1165,7 @@
                 <w:txbxContent>
                   <w:p>
                     <w:pPr>
+                      <w:pStyle w:val="Heading2Char"/>
                       <w:rPr>
                         <w:rFonts w:ascii="Arial" w:hAnsi="Arial" w:cs="Arial"/>
                         <w:sz w:val="22"/>
@@ -1084,95 +1327,6 @@
     </w:lvl>
   </w:abstractNum>
   <w:abstractNum w:abstractNumId="1" w15:restartNumberingAfterBreak="0">
-    <w:nsid w:val="0C623A4C"/>
-    <w:multiLevelType w:val="hybridMultilevel"/>
-    <w:tmpl w:val="B29EFA7A"/>
-    <w:lvl w:ilvl="0" w:tplc="FFFFFFFF">
-      <w:start w:val="1"/>
-      <w:numFmt w:val="decimal"/>
-      <w:lvlText w:val="%1)"/>
-      <w:lvlJc w:val="left"/>
-      <w:pPr>
-        <w:ind w:left="360" w:hanging="360"/>
-      </w:pPr>
-      <w:rPr>
-        <w:rFonts w:hint="default"/>
-      </w:rPr>
-    </w:lvl>
-    <w:lvl w:ilvl="1" w:tplc="04090017">
-      <w:start w:val="1"/>
-      <w:numFmt w:val="lowerLetter"/>
-      <w:lvlText w:val="%2)"/>
-      <w:lvlJc w:val="left"/>
-      <w:pPr>
-        <w:ind w:left="1080" w:hanging="360"/>
-      </w:pPr>
-    </w:lvl>
-    <w:lvl w:ilvl="2" w:tplc="FFFFFFFF" w:tentative="1">
-      <w:start w:val="1"/>
-      <w:numFmt w:val="lowerRoman"/>
-      <w:lvlText w:val="%3."/>
-      <w:lvlJc w:val="right"/>
-      <w:pPr>
-        <w:ind w:left="1800" w:hanging="180"/>
-      </w:pPr>
-    </w:lvl>
-    <w:lvl w:ilvl="3" w:tplc="FFFFFFFF" w:tentative="1">
-      <w:start w:val="1"/>
-      <w:numFmt w:val="decimal"/>
-      <w:lvlText w:val="%4."/>
-      <w:lvlJc w:val="left"/>
-      <w:pPr>
-        <w:ind w:left="2520" w:hanging="360"/>
-      </w:pPr>
-    </w:lvl>
-    <w:lvl w:ilvl="4" w:tplc="FFFFFFFF" w:tentative="1">
-      <w:start w:val="1"/>
-      <w:numFmt w:val="lowerLetter"/>
-      <w:lvlText w:val="%5."/>
-      <w:lvlJc w:val="left"/>
-      <w:pPr>
-        <w:ind w:left="3240" w:hanging="360"/>
-      </w:pPr>
-    </w:lvl>
-    <w:lvl w:ilvl="5" w:tplc="FFFFFFFF" w:tentative="1">
-      <w:start w:val="1"/>
-      <w:numFmt w:val="lowerRoman"/>
-      <w:lvlText w:val="%6."/>
-      <w:lvlJc w:val="right"/>
-      <w:pPr>
-        <w:ind w:left="3960" w:hanging="180"/>
-      </w:pPr>
-    </w:lvl>
-    <w:lvl w:ilvl="6" w:tplc="FFFFFFFF" w:tentative="1">
-      <w:start w:val="1"/>
-      <w:numFmt w:val="decimal"/>
-      <w:lvlText w:val="%7."/>
-      <w:lvlJc w:val="left"/>
-      <w:pPr>
-        <w:ind w:left="4680" w:hanging="360"/>
-      </w:pPr>
-    </w:lvl>
-    <w:lvl w:ilvl="7" w:tplc="FFFFFFFF" w:tentative="1">
-      <w:start w:val="1"/>
-      <w:numFmt w:val="lowerLetter"/>
-      <w:lvlText w:val="%8."/>
-      <w:lvlJc w:val="left"/>
-      <w:pPr>
-        <w:ind w:left="5400" w:hanging="360"/>
-      </w:pPr>
-    </w:lvl>
-    <w:lvl w:ilvl="8" w:tplc="FFFFFFFF" w:tentative="1">
-      <w:start w:val="1"/>
-      <w:numFmt w:val="lowerRoman"/>
-      <w:lvlText w:val="%9."/>
-      <w:lvlJc w:val="right"/>
-      <w:pPr>
-        <w:ind w:left="6120" w:hanging="180"/>
-      </w:pPr>
-    </w:lvl>
-  </w:abstractNum>
-  <w:abstractNum w:abstractNumId="2" w15:restartNumberingAfterBreak="0">
     <w:nsid w:val="20E81A46"/>
     <w:multiLevelType w:val="hybridMultilevel"/>
     <w:tmpl w:val="4E662BEC"/>
@@ -1284,10 +1438,10 @@
       </w:rPr>
     </w:lvl>
   </w:abstractNum>
-  <w:abstractNum w:abstractNumId="3" w15:restartNumberingAfterBreak="0">
+  <w:abstractNum w:abstractNumId="2" w15:restartNumberingAfterBreak="0">
     <w:nsid w:val="499D4C36"/>
     <w:multiLevelType w:val="multilevel"/>
-    <w:tmpl w:val="7848E66E"/>
+    <w:tmpl w:val="CD502C96"/>
     <w:lvl w:ilvl="0">
       <w:start w:val="1"/>
       <w:numFmt w:val="decimal"/>
@@ -1310,12 +1464,18 @@
     </w:lvl>
     <w:lvl w:ilvl="1">
       <w:start w:val="1"/>
-      <w:numFmt w:val="lowerLetter"/>
-      <w:lvlText w:val="%2)"/>
-      <w:lvlJc w:val="left"/>
-      <w:pPr>
-        <w:ind w:left="1080" w:hanging="360"/>
-      </w:pPr>
+      <w:numFmt w:val="bullet"/>
+      <w:lvlText w:val=""/>
+      <w:lvlJc w:val="left"/>
+      <w:pPr>
+        <w:tabs>
+          <w:tab w:val="num" w:pos="0"/>
+        </w:tabs>
+        <w:ind w:left="1440" w:hanging="360"/>
+      </w:pPr>
+      <w:rPr>
+        <w:rFonts w:ascii="Wingdings 2" w:hAnsi="Wingdings 2" w:cs="Wingdings 2" w:hint="default"/>
+      </w:rPr>
     </w:lvl>
     <w:lvl w:ilvl="2">
       <w:start w:val="1"/>
@@ -1423,7 +1583,7 @@
       </w:rPr>
     </w:lvl>
   </w:abstractNum>
-  <w:abstractNum w:abstractNumId="4" w15:restartNumberingAfterBreak="0">
+  <w:abstractNum w:abstractNumId="3" w15:restartNumberingAfterBreak="0">
     <w:nsid w:val="4E0E2B6D"/>
     <w:multiLevelType w:val="hybridMultilevel"/>
     <w:tmpl w:val="9216F4D4"/>
@@ -1512,7 +1672,7 @@
       </w:pPr>
     </w:lvl>
   </w:abstractNum>
-  <w:abstractNum w:abstractNumId="5" w15:restartNumberingAfterBreak="0">
+  <w:abstractNum w:abstractNumId="4" w15:restartNumberingAfterBreak="0">
     <w:nsid w:val="5DB122E3"/>
     <w:multiLevelType w:val="hybridMultilevel"/>
     <w:tmpl w:val="70585A66"/>
@@ -1624,7 +1784,7 @@
       </w:rPr>
     </w:lvl>
   </w:abstractNum>
-  <w:abstractNum w:abstractNumId="6" w15:restartNumberingAfterBreak="0">
+  <w:abstractNum w:abstractNumId="5" w15:restartNumberingAfterBreak="0">
     <w:nsid w:val="70F12DF3"/>
     <w:multiLevelType w:val="multilevel"/>
     <w:tmpl w:val="11EAA22A"/>
@@ -1743,7 +1903,7 @@
       </w:rPr>
     </w:lvl>
   </w:abstractNum>
-  <w:abstractNum w:abstractNumId="7" w15:restartNumberingAfterBreak="0">
+  <w:abstractNum w:abstractNumId="6" w15:restartNumberingAfterBreak="0">
     <w:nsid w:val="783C55D3"/>
     <w:multiLevelType w:val="multilevel"/>
     <w:tmpl w:val="3258C3EA"/>
@@ -1859,96 +2019,7 @@
       </w:rPr>
     </w:lvl>
   </w:abstractNum>
-  <w:abstractNum w:abstractNumId="8" w15:restartNumberingAfterBreak="0">
-    <w:nsid w:val="79947E74"/>
-    <w:multiLevelType w:val="hybridMultilevel"/>
-    <w:tmpl w:val="B6EC25EE"/>
-    <w:lvl w:ilvl="0" w:tplc="04090011">
-      <w:start w:val="1"/>
-      <w:numFmt w:val="decimal"/>
-      <w:lvlText w:val="%1)"/>
-      <w:lvlJc w:val="left"/>
-      <w:pPr>
-        <w:ind w:left="360" w:hanging="360"/>
-      </w:pPr>
-      <w:rPr>
-        <w:rFonts w:hint="default"/>
-      </w:rPr>
-    </w:lvl>
-    <w:lvl w:ilvl="1" w:tplc="04090019">
-      <w:start w:val="1"/>
-      <w:numFmt w:val="lowerLetter"/>
-      <w:lvlText w:val="%2."/>
-      <w:lvlJc w:val="left"/>
-      <w:pPr>
-        <w:ind w:left="1080" w:hanging="360"/>
-      </w:pPr>
-    </w:lvl>
-    <w:lvl w:ilvl="2" w:tplc="0409001B" w:tentative="1">
-      <w:start w:val="1"/>
-      <w:numFmt w:val="lowerRoman"/>
-      <w:lvlText w:val="%3."/>
-      <w:lvlJc w:val="right"/>
-      <w:pPr>
-        <w:ind w:left="1800" w:hanging="180"/>
-      </w:pPr>
-    </w:lvl>
-    <w:lvl w:ilvl="3" w:tplc="0409000F" w:tentative="1">
-      <w:start w:val="1"/>
-      <w:numFmt w:val="decimal"/>
-      <w:lvlText w:val="%4."/>
-      <w:lvlJc w:val="left"/>
-      <w:pPr>
-        <w:ind w:left="2520" w:hanging="360"/>
-      </w:pPr>
-    </w:lvl>
-    <w:lvl w:ilvl="4" w:tplc="04090019" w:tentative="1">
-      <w:start w:val="1"/>
-      <w:numFmt w:val="lowerLetter"/>
-      <w:lvlText w:val="%5."/>
-      <w:lvlJc w:val="left"/>
-      <w:pPr>
-        <w:ind w:left="3240" w:hanging="360"/>
-      </w:pPr>
-    </w:lvl>
-    <w:lvl w:ilvl="5" w:tplc="0409001B" w:tentative="1">
-      <w:start w:val="1"/>
-      <w:numFmt w:val="lowerRoman"/>
-      <w:lvlText w:val="%6."/>
-      <w:lvlJc w:val="right"/>
-      <w:pPr>
-        <w:ind w:left="3960" w:hanging="180"/>
-      </w:pPr>
-    </w:lvl>
-    <w:lvl w:ilvl="6" w:tplc="0409000F" w:tentative="1">
-      <w:start w:val="1"/>
-      <w:numFmt w:val="decimal"/>
-      <w:lvlText w:val="%7."/>
-      <w:lvlJc w:val="left"/>
-      <w:pPr>
-        <w:ind w:left="4680" w:hanging="360"/>
-      </w:pPr>
-    </w:lvl>
-    <w:lvl w:ilvl="7" w:tplc="04090019" w:tentative="1">
-      <w:start w:val="1"/>
-      <w:numFmt w:val="lowerLetter"/>
-      <w:lvlText w:val="%8."/>
-      <w:lvlJc w:val="left"/>
-      <w:pPr>
-        <w:ind w:left="5400" w:hanging="360"/>
-      </w:pPr>
-    </w:lvl>
-    <w:lvl w:ilvl="8" w:tplc="0409001B" w:tentative="1">
-      <w:start w:val="1"/>
-      <w:numFmt w:val="lowerRoman"/>
-      <w:lvlText w:val="%9."/>
-      <w:lvlJc w:val="right"/>
-      <w:pPr>
-        <w:ind w:left="6120" w:hanging="180"/>
-      </w:pPr>
-    </w:lvl>
-  </w:abstractNum>
-  <w:abstractNum w:abstractNumId="9" w15:restartNumberingAfterBreak="0">
+  <w:abstractNum w:abstractNumId="7" w15:restartNumberingAfterBreak="0">
     <w:nsid w:val="7BB2415A"/>
     <w:multiLevelType w:val="multilevel"/>
     <w:tmpl w:val="FBEC29C2"/>
@@ -2064,151 +2135,29 @@
       </w:rPr>
     </w:lvl>
   </w:abstractNum>
-  <w:abstractNum w:abstractNumId="10" w15:restartNumberingAfterBreak="0">
-    <w:nsid w:val="7EF00BDC"/>
-    <w:multiLevelType w:val="hybridMultilevel"/>
-    <w:tmpl w:val="234C78A2"/>
-    <w:lvl w:ilvl="0" w:tplc="50F2DCA4">
-      <w:start w:val="14"/>
-      <w:numFmt w:val="bullet"/>
-      <w:lvlText w:val="-"/>
-      <w:lvlJc w:val="left"/>
-      <w:pPr>
-        <w:ind w:left="720" w:hanging="360"/>
-      </w:pPr>
-      <w:rPr>
-        <w:rFonts w:ascii="Arial" w:eastAsiaTheme="minorHAnsi" w:hAnsi="Arial" w:cs="Arial" w:hint="default"/>
-      </w:rPr>
-    </w:lvl>
-    <w:lvl w:ilvl="1" w:tplc="04090003" w:tentative="1">
-      <w:start w:val="1"/>
-      <w:numFmt w:val="bullet"/>
-      <w:lvlText w:val="o"/>
-      <w:lvlJc w:val="left"/>
-      <w:pPr>
-        <w:ind w:left="1440" w:hanging="360"/>
-      </w:pPr>
-      <w:rPr>
-        <w:rFonts w:ascii="Courier New" w:hAnsi="Courier New" w:cs="Courier New" w:hint="default"/>
-      </w:rPr>
-    </w:lvl>
-    <w:lvl w:ilvl="2" w:tplc="04090005" w:tentative="1">
-      <w:start w:val="1"/>
-      <w:numFmt w:val="bullet"/>
-      <w:lvlText w:val=""/>
-      <w:lvlJc w:val="left"/>
-      <w:pPr>
-        <w:ind w:left="2160" w:hanging="360"/>
-      </w:pPr>
-      <w:rPr>
-        <w:rFonts w:ascii="Wingdings" w:hAnsi="Wingdings" w:hint="default"/>
-      </w:rPr>
-    </w:lvl>
-    <w:lvl w:ilvl="3" w:tplc="04090001" w:tentative="1">
-      <w:start w:val="1"/>
-      <w:numFmt w:val="bullet"/>
-      <w:lvlText w:val=""/>
-      <w:lvlJc w:val="left"/>
-      <w:pPr>
-        <w:ind w:left="2880" w:hanging="360"/>
-      </w:pPr>
-      <w:rPr>
-        <w:rFonts w:ascii="Symbol" w:hAnsi="Symbol" w:hint="default"/>
-      </w:rPr>
-    </w:lvl>
-    <w:lvl w:ilvl="4" w:tplc="04090003" w:tentative="1">
-      <w:start w:val="1"/>
-      <w:numFmt w:val="bullet"/>
-      <w:lvlText w:val="o"/>
-      <w:lvlJc w:val="left"/>
-      <w:pPr>
-        <w:ind w:left="3600" w:hanging="360"/>
-      </w:pPr>
-      <w:rPr>
-        <w:rFonts w:ascii="Courier New" w:hAnsi="Courier New" w:cs="Courier New" w:hint="default"/>
-      </w:rPr>
-    </w:lvl>
-    <w:lvl w:ilvl="5" w:tplc="04090005" w:tentative="1">
-      <w:start w:val="1"/>
-      <w:numFmt w:val="bullet"/>
-      <w:lvlText w:val=""/>
-      <w:lvlJc w:val="left"/>
-      <w:pPr>
-        <w:ind w:left="4320" w:hanging="360"/>
-      </w:pPr>
-      <w:rPr>
-        <w:rFonts w:ascii="Wingdings" w:hAnsi="Wingdings" w:hint="default"/>
-      </w:rPr>
-    </w:lvl>
-    <w:lvl w:ilvl="6" w:tplc="04090001" w:tentative="1">
-      <w:start w:val="1"/>
-      <w:numFmt w:val="bullet"/>
-      <w:lvlText w:val=""/>
-      <w:lvlJc w:val="left"/>
-      <w:pPr>
-        <w:ind w:left="5040" w:hanging="360"/>
-      </w:pPr>
-      <w:rPr>
-        <w:rFonts w:ascii="Symbol" w:hAnsi="Symbol" w:hint="default"/>
-      </w:rPr>
-    </w:lvl>
-    <w:lvl w:ilvl="7" w:tplc="04090003" w:tentative="1">
-      <w:start w:val="1"/>
-      <w:numFmt w:val="bullet"/>
-      <w:lvlText w:val="o"/>
-      <w:lvlJc w:val="left"/>
-      <w:pPr>
-        <w:ind w:left="5760" w:hanging="360"/>
-      </w:pPr>
-      <w:rPr>
-        <w:rFonts w:ascii="Courier New" w:hAnsi="Courier New" w:cs="Courier New" w:hint="default"/>
-      </w:rPr>
-    </w:lvl>
-    <w:lvl w:ilvl="8" w:tplc="04090005" w:tentative="1">
-      <w:start w:val="1"/>
-      <w:numFmt w:val="bullet"/>
-      <w:lvlText w:val=""/>
-      <w:lvlJc w:val="left"/>
-      <w:pPr>
-        <w:ind w:left="6480" w:hanging="360"/>
-      </w:pPr>
-      <w:rPr>
-        <w:rFonts w:ascii="Wingdings" w:hAnsi="Wingdings" w:hint="default"/>
-      </w:rPr>
-    </w:lvl>
-  </w:abstractNum>
   <w:num w:numId="1" w16cid:durableId="874930986">
-    <w:abstractNumId w:val="9"/>
+    <w:abstractNumId w:val="7"/>
   </w:num>
   <w:num w:numId="2" w16cid:durableId="998734191">
-    <w:abstractNumId w:val="7"/>
+    <w:abstractNumId w:val="6"/>
   </w:num>
   <w:num w:numId="3" w16cid:durableId="1375040618">
+    <w:abstractNumId w:val="3"/>
+  </w:num>
+  <w:num w:numId="4" w16cid:durableId="1080910593">
     <w:abstractNumId w:val="4"/>
   </w:num>
-  <w:num w:numId="4" w16cid:durableId="1080910593">
+  <w:num w:numId="5" w16cid:durableId="1255868036">
+    <w:abstractNumId w:val="1"/>
+  </w:num>
+  <w:num w:numId="6" w16cid:durableId="1888180729">
     <w:abstractNumId w:val="5"/>
   </w:num>
-  <w:num w:numId="5" w16cid:durableId="1255868036">
+  <w:num w:numId="7" w16cid:durableId="1849321020">
     <w:abstractNumId w:val="2"/>
-  </w:num>
-  <w:num w:numId="6" w16cid:durableId="1888180729">
-    <w:abstractNumId w:val="6"/>
-  </w:num>
-  <w:num w:numId="7" w16cid:durableId="1849321020">
-    <w:abstractNumId w:val="3"/>
   </w:num>
   <w:num w:numId="8" w16cid:durableId="572664912">
     <w:abstractNumId w:val="0"/>
-  </w:num>
-  <w:num w:numId="9" w16cid:durableId="773209119">
-    <w:abstractNumId w:val="10"/>
-  </w:num>
-  <w:num w:numId="10" w16cid:durableId="1903516213">
-    <w:abstractNumId w:val="8"/>
-  </w:num>
-  <w:num w:numId="11" w16cid:durableId="1084112665">
-    <w:abstractNumId w:val="1"/>
   </w:num>
 </w:numbering>
 </file>
@@ -2810,6 +2759,7 @@
   <w:style w:type="character" w:default="1" w:styleId="DefaultParagraphFont">
     <w:name w:val="Default Paragraph Font"/>
     <w:uiPriority w:val="1"/>
+    <w:semiHidden/>
     <w:unhideWhenUsed/>
   </w:style>
   <w:style w:type="table" w:default="1" w:styleId="TableNormal">
@@ -3217,22 +3167,6 @@
         <w:insideV w:val="single" w:sz="4" w:space="0" w:color="auto"/>
       </w:tblBorders>
     </w:tblPr>
-  </w:style>
-  <w:style w:type="paragraph" w:styleId="NormalWeb">
-    <w:name w:val="Normal (Web)"/>
-    <w:basedOn w:val="Normal"/>
-    <w:uiPriority w:val="99"/>
-    <w:semiHidden/>
-    <w:unhideWhenUsed/>
-    <w:rsid w:val="002A01E2"/>
-    <w:pPr>
-      <w:spacing w:before="100" w:beforeAutospacing="1" w:after="100" w:afterAutospacing="1"/>
-    </w:pPr>
-    <w:rPr>
-      <w:rFonts w:ascii="Times New Roman" w:eastAsia="Times New Roman" w:hAnsi="Times New Roman" w:cs="Times New Roman"/>
-      <w:kern w:val="0"/>
-      <w14:ligatures w14:val="none"/>
-    </w:rPr>
   </w:style>
 </w:styles>
 </file>

</xml_diff>

<commit_message>
okay this is less wrong "is_defendant_need_interprete" is undefiined but it runs
</commit_message>
<xml_diff>
--- a/docassemble/MwtPetitionForHarassmentProtect/data/templates/mwt_petition_for_harassment_protect_next_steps.docx
+++ b/docassemble/MwtPetitionForHarassmentProtect/data/templates/mwt_petition_for_harassment_protect_next_steps.docx
@@ -62,42 +62,8 @@
     </w:p>
     <w:p>
       <w:pPr>
-        <w:spacing w:after="160" w:line="259" w:lineRule="auto"/>
-        <w:rPr>
-          <w:rFonts w:ascii="Arial" w:eastAsia="Calibri" w:hAnsi="Arial" w:cs="Arial"/>
-          <w:kern w:val="0"/>
-          <w14:ligatures w14:val="none"/>
-        </w:rPr>
-      </w:pPr>
-      <w:r>
-        <w:rPr>
-          <w:rFonts w:ascii="Arial" w:eastAsia="Calibri" w:hAnsi="Arial" w:cs="Arial"/>
-          <w:kern w:val="0"/>
-          <w14:ligatures w14:val="none"/>
-        </w:rPr>
-        <w:t>You have completed the online petition for a Harassment Protection Order. Your petition has been submitted to the Mashpee Wampanoag Tribal Court for review.</w:t>
-      </w:r>
-      <w:r>
-        <w:rPr>
-          <w:rFonts w:ascii="Arial" w:eastAsia="Calibri" w:hAnsi="Arial" w:cs="Arial"/>
-          <w:kern w:val="0"/>
-          <w14:ligatures w14:val="none"/>
-        </w:rPr>
-        <w:t xml:space="preserve"> </w:t>
-      </w:r>
-      <w:r>
-        <w:rPr>
-          <w:rFonts w:ascii="Arial" w:eastAsia="Calibri" w:hAnsi="Arial" w:cs="Arial"/>
-          <w:kern w:val="0"/>
-          <w14:ligatures w14:val="none"/>
-        </w:rPr>
-        <w:t>Filing this petition is an important step toward requesting protection from the Tribal Court.</w:t>
-      </w:r>
-    </w:p>
-    <w:p>
-      <w:pPr>
         <w:sectPr>
-          <w:footerReference w:type="default" r:id="rId5"/>
+          <w:footerReference w:type="default" r:id="rId7"/>
           <w:pgSz w:w="12240" w:h="15840"/>
           <w:pgMar w:top="720" w:right="720" w:bottom="720" w:left="720" w:header="720" w:footer="720" w:gutter="0"/>
           <w:cols w:space="720"/>
@@ -105,6 +71,14 @@
           <w:docGrid w:linePitch="360"/>
         </w:sectPr>
       </w:pPr>
+      <w:r>
+        <w:rPr>
+          <w:rFonts w:ascii="Arial" w:eastAsia="Calibri" w:hAnsi="Arial" w:cs="Arial"/>
+          <w:kern w:val="0"/>
+          <w14:ligatures w14:val="none"/>
+        </w:rPr>
+        <w:t>You’ve completed putting together your petition for a Harassment Protection Order. To finish the filing process, you must either e-file your petition or download, print, and bring it to the Mashpee Wampanoag Tribal Court for review. Filing your petition is an important step toward requesting protection from the Tribal Court.</w:t>
+      </w:r>
     </w:p>
     <w:p>
       <w:pPr>
@@ -131,7 +105,37 @@
           <w:kern w:val="0"/>
           <w14:ligatures w14:val="none"/>
         </w:rPr>
-        <w:t>Next steps</w:t>
+        <w:t xml:space="preserve">Choosing </w:t>
+      </w:r>
+      <w:r>
+        <w:rPr>
+          <w:rFonts w:ascii="Arial" w:eastAsia="Times New Roman" w:hAnsi="Arial" w:cs="Arial"/>
+          <w:b/>
+          <w:color w:val="0B5294"/>
+          <w:kern w:val="0"/>
+          <w14:ligatures w14:val="none"/>
+        </w:rPr>
+        <w:t xml:space="preserve">the </w:t>
+      </w:r>
+      <w:r>
+        <w:rPr>
+          <w:rFonts w:ascii="Arial" w:eastAsia="Times New Roman" w:hAnsi="Arial" w:cs="Arial"/>
+          <w:b/>
+          <w:color w:val="0B5294"/>
+          <w:kern w:val="0"/>
+          <w14:ligatures w14:val="none"/>
+        </w:rPr>
+        <w:t>E-Fi</w:t>
+      </w:r>
+      <w:r>
+        <w:rPr>
+          <w:rFonts w:ascii="Arial" w:eastAsia="Times New Roman" w:hAnsi="Arial" w:cs="Arial"/>
+          <w:b/>
+          <w:color w:val="0B5294"/>
+          <w:kern w:val="0"/>
+          <w14:ligatures w14:val="none"/>
+        </w:rPr>
+        <w:t>le Option</w:t>
       </w:r>
     </w:p>
     <w:p>
@@ -149,61 +153,7 @@
         <w:rPr>
           <w:rFonts w:ascii="Arial" w:hAnsi="Arial" w:cs="Arial"/>
         </w:rPr>
-        <w:t>After filing, Tribal Court</w:t>
-      </w:r>
-      <w:r>
-        <w:rPr>
-          <w:rFonts w:ascii="Arial" w:hAnsi="Arial" w:cs="Arial"/>
-        </w:rPr>
-        <w:t xml:space="preserve"> </w:t>
-      </w:r>
-      <w:r>
-        <w:rPr>
-          <w:rFonts w:ascii="Arial" w:hAnsi="Arial" w:cs="Arial"/>
-        </w:rPr>
-        <w:t>C</w:t>
-      </w:r>
-      <w:r>
-        <w:rPr>
-          <w:rFonts w:ascii="Arial" w:hAnsi="Arial" w:cs="Arial"/>
-        </w:rPr>
-        <w:t xml:space="preserve">lerk will </w:t>
-      </w:r>
-      <w:r>
-        <w:rPr>
-          <w:rFonts w:ascii="Arial" w:hAnsi="Arial" w:cs="Arial"/>
-        </w:rPr>
-        <w:t>send</w:t>
-      </w:r>
-      <w:r>
-        <w:rPr>
-          <w:rFonts w:ascii="Arial" w:hAnsi="Arial" w:cs="Arial"/>
-        </w:rPr>
-        <w:t xml:space="preserve"> it to the Chief Judge, who</w:t>
-      </w:r>
-      <w:r>
-        <w:rPr>
-          <w:rFonts w:ascii="Arial" w:hAnsi="Arial" w:cs="Arial"/>
-        </w:rPr>
-        <w:t>’</w:t>
-      </w:r>
-      <w:r>
-        <w:rPr>
-          <w:rFonts w:ascii="Arial" w:hAnsi="Arial" w:cs="Arial"/>
-        </w:rPr>
-        <w:t xml:space="preserve">ll assign it to a Tribal District Court Judge for review. Your petition will usually be reviewed the same day it is filed or by the next </w:t>
-      </w:r>
-      <w:r>
-        <w:rPr>
-          <w:rFonts w:ascii="Arial" w:hAnsi="Arial" w:cs="Arial"/>
-        </w:rPr>
-        <w:t>open court</w:t>
-      </w:r>
-      <w:r>
-        <w:rPr>
-          <w:rFonts w:ascii="Arial" w:hAnsi="Arial" w:cs="Arial"/>
-        </w:rPr>
-        <w:t xml:space="preserve"> day. </w:t>
+        <w:t>When you e-file your petition will be sent electronically to the Tribal Court. You don’t need to print the petition or bring it to the Tribal Courthouse to file it.</w:t>
       </w:r>
     </w:p>
     <w:p>
@@ -221,282 +171,7 @@
         <w:rPr>
           <w:rFonts w:ascii="Arial" w:hAnsi="Arial" w:cs="Arial"/>
         </w:rPr>
-        <w:t xml:space="preserve">The </w:t>
-      </w:r>
-      <w:r>
-        <w:rPr>
-          <w:rFonts w:ascii="Arial" w:hAnsi="Arial" w:cs="Arial"/>
-        </w:rPr>
-        <w:t>Tribal Court</w:t>
-      </w:r>
-      <w:r>
-        <w:rPr>
-          <w:rFonts w:ascii="Arial" w:hAnsi="Arial" w:cs="Arial"/>
-        </w:rPr>
-        <w:t xml:space="preserve"> may contact you if more information is needed. </w:t>
-      </w:r>
-    </w:p>
-    <w:p>
-      <w:pPr>
-        <w:pStyle w:val="ListParagraph"/>
-        <w:numPr>
-          <w:ilvl w:val="0"/>
-          <w:numId w:val="3"/>
-        </w:numPr>
-        <w:rPr>
-          <w:rFonts w:ascii="Arial" w:hAnsi="Arial" w:cs="Arial"/>
-        </w:rPr>
-      </w:pPr>
-      <w:r>
-        <w:rPr>
-          <w:rFonts w:ascii="Arial" w:hAnsi="Arial" w:cs="Arial"/>
-        </w:rPr>
-        <w:t>The Tribal Court</w:t>
-      </w:r>
-      <w:r>
-        <w:rPr>
-          <w:rFonts w:ascii="Arial" w:hAnsi="Arial" w:cs="Arial"/>
-        </w:rPr>
-        <w:t xml:space="preserve"> </w:t>
-      </w:r>
-      <w:r>
-        <w:rPr>
-          <w:rFonts w:ascii="Arial" w:hAnsi="Arial" w:cs="Arial"/>
-        </w:rPr>
-        <w:t>J</w:t>
-      </w:r>
-      <w:r>
-        <w:rPr>
-          <w:rFonts w:ascii="Arial" w:hAnsi="Arial" w:cs="Arial"/>
-        </w:rPr>
-        <w:t xml:space="preserve">udge will decide whether to issue a temporary or ex </w:t>
-      </w:r>
-      <w:proofErr w:type="spellStart"/>
-      <w:r>
-        <w:rPr>
-          <w:rFonts w:ascii="Arial" w:hAnsi="Arial" w:cs="Arial"/>
-        </w:rPr>
-        <w:t>parte</w:t>
-      </w:r>
-      <w:proofErr w:type="spellEnd"/>
-      <w:r>
-        <w:rPr>
-          <w:rFonts w:ascii="Arial" w:hAnsi="Arial" w:cs="Arial"/>
-        </w:rPr>
-        <w:t xml:space="preserve"> protection order based on the information </w:t>
-      </w:r>
-      <w:r>
-        <w:rPr>
-          <w:rFonts w:ascii="Arial" w:hAnsi="Arial" w:cs="Arial"/>
-        </w:rPr>
-        <w:t>provided</w:t>
-      </w:r>
-      <w:r>
-        <w:rPr>
-          <w:rFonts w:ascii="Arial" w:hAnsi="Arial" w:cs="Arial"/>
-        </w:rPr>
-        <w:t xml:space="preserve">. </w:t>
-      </w:r>
-    </w:p>
-    <w:p>
-      <w:pPr>
-        <w:pStyle w:val="ListParagraph"/>
-        <w:numPr>
-          <w:ilvl w:val="1"/>
-          <w:numId w:val="3"/>
-        </w:numPr>
-        <w:rPr>
-          <w:rFonts w:ascii="Arial" w:hAnsi="Arial" w:cs="Arial"/>
-        </w:rPr>
-      </w:pPr>
-      <w:r>
-        <w:rPr>
-          <w:rFonts w:ascii="Arial" w:hAnsi="Arial" w:cs="Arial"/>
-        </w:rPr>
-        <w:t xml:space="preserve">If no temporary or ex </w:t>
-      </w:r>
-      <w:proofErr w:type="spellStart"/>
-      <w:r>
-        <w:rPr>
-          <w:rFonts w:ascii="Arial" w:hAnsi="Arial" w:cs="Arial"/>
-        </w:rPr>
-        <w:t>parte</w:t>
-      </w:r>
-      <w:proofErr w:type="spellEnd"/>
-      <w:r>
-        <w:rPr>
-          <w:rFonts w:ascii="Arial" w:hAnsi="Arial" w:cs="Arial"/>
-        </w:rPr>
-        <w:t xml:space="preserve"> order is issued, a hearing will usually be scheduled within 14 days after you file your petition. </w:t>
-      </w:r>
-    </w:p>
-    <w:p>
-      <w:pPr>
-        <w:pStyle w:val="ListParagraph"/>
-        <w:numPr>
-          <w:ilvl w:val="1"/>
-          <w:numId w:val="3"/>
-        </w:numPr>
-        <w:rPr>
-          <w:rFonts w:ascii="Arial" w:hAnsi="Arial" w:cs="Arial"/>
-        </w:rPr>
-      </w:pPr>
-      <w:r>
-        <w:rPr>
-          <w:rFonts w:ascii="Arial" w:hAnsi="Arial" w:cs="Arial"/>
-        </w:rPr>
-        <w:t xml:space="preserve">If a temporary or ex </w:t>
-      </w:r>
-      <w:proofErr w:type="spellStart"/>
-      <w:r>
-        <w:rPr>
-          <w:rFonts w:ascii="Arial" w:hAnsi="Arial" w:cs="Arial"/>
-        </w:rPr>
-        <w:t>parte</w:t>
-      </w:r>
-      <w:proofErr w:type="spellEnd"/>
-      <w:r>
-        <w:rPr>
-          <w:rFonts w:ascii="Arial" w:hAnsi="Arial" w:cs="Arial"/>
-        </w:rPr>
-        <w:t xml:space="preserve"> order is issued, a hearing will usually be scheduled within 30 days after the order is issued. </w:t>
-      </w:r>
-    </w:p>
-    <w:p>
-      <w:pPr>
-        <w:pStyle w:val="ListParagraph"/>
-        <w:numPr>
-          <w:ilvl w:val="0"/>
-          <w:numId w:val="3"/>
-        </w:numPr>
-        <w:rPr>
-          <w:rFonts w:ascii="Arial" w:hAnsi="Arial" w:cs="Arial"/>
-        </w:rPr>
-      </w:pPr>
-      <w:r>
-        <w:rPr>
-          <w:rFonts w:ascii="Arial" w:hAnsi="Arial" w:cs="Arial"/>
-        </w:rPr>
-        <w:t xml:space="preserve">The </w:t>
-      </w:r>
-      <w:r>
-        <w:rPr>
-          <w:rFonts w:ascii="Arial" w:hAnsi="Arial" w:cs="Arial"/>
-        </w:rPr>
-        <w:t>Tribal Court</w:t>
-      </w:r>
-      <w:r>
-        <w:rPr>
-          <w:rFonts w:ascii="Arial" w:hAnsi="Arial" w:cs="Arial"/>
-        </w:rPr>
-        <w:t xml:space="preserve"> </w:t>
-      </w:r>
-      <w:r>
-        <w:rPr>
-          <w:rFonts w:ascii="Arial" w:hAnsi="Arial" w:cs="Arial"/>
-        </w:rPr>
-        <w:t>C</w:t>
-      </w:r>
-      <w:r>
-        <w:rPr>
-          <w:rFonts w:ascii="Arial" w:hAnsi="Arial" w:cs="Arial"/>
-        </w:rPr>
-        <w:t xml:space="preserve">lerk will send notice of the hearing to both you and the defendant. </w:t>
-      </w:r>
-      <w:r>
-        <w:rPr>
-          <w:rFonts w:ascii="Arial" w:hAnsi="Arial" w:cs="Arial"/>
-          <w:shd w:val="clear" w:color="auto" w:fill="FFFF00"/>
-        </w:rPr>
-        <w:t>You do not need to contact the defendant or arrange service yourself.</w:t>
-      </w:r>
-    </w:p>
-    <w:p>
-      <w:pPr>
-        <w:pStyle w:val="ListParagraph"/>
-        <w:numPr>
-          <w:ilvl w:val="1"/>
-          <w:numId w:val="3"/>
-        </w:numPr>
-        <w:rPr>
-          <w:rFonts w:ascii="Arial" w:hAnsi="Arial" w:cs="Arial"/>
-        </w:rPr>
-      </w:pPr>
-      <w:r>
-        <w:rPr>
-          <w:rFonts w:ascii="Arial" w:hAnsi="Arial" w:cs="Arial"/>
-        </w:rPr>
-        <w:t xml:space="preserve">If a temporary or ex </w:t>
-      </w:r>
-      <w:proofErr w:type="spellStart"/>
-      <w:r>
-        <w:rPr>
-          <w:rFonts w:ascii="Arial" w:hAnsi="Arial" w:cs="Arial"/>
-        </w:rPr>
-        <w:t>parte</w:t>
-      </w:r>
-      <w:proofErr w:type="spellEnd"/>
-      <w:r>
-        <w:rPr>
-          <w:rFonts w:ascii="Arial" w:hAnsi="Arial" w:cs="Arial"/>
-        </w:rPr>
-        <w:t xml:space="preserve"> order is issued, Tribal Police</w:t>
-      </w:r>
-      <w:r>
-        <w:rPr>
-          <w:rFonts w:ascii="Arial" w:hAnsi="Arial" w:cs="Arial"/>
-        </w:rPr>
-        <w:t xml:space="preserve"> </w:t>
-      </w:r>
-      <w:r>
-        <w:rPr>
-          <w:rFonts w:ascii="Arial" w:hAnsi="Arial" w:cs="Arial"/>
-        </w:rPr>
-        <w:t>will serve the defendant.</w:t>
-      </w:r>
-    </w:p>
-    <w:p>
-      <w:pPr>
-        <w:pStyle w:val="ListParagraph"/>
-        <w:numPr>
-          <w:ilvl w:val="0"/>
-          <w:numId w:val="3"/>
-        </w:numPr>
-        <w:rPr>
-          <w:rFonts w:ascii="Arial" w:hAnsi="Arial" w:cs="Arial"/>
-        </w:rPr>
-      </w:pPr>
-      <w:r>
-        <w:rPr>
-          <w:rFonts w:ascii="Arial" w:hAnsi="Arial" w:cs="Arial"/>
-        </w:rPr>
-        <w:t>If you can</w:t>
-      </w:r>
-      <w:r>
-        <w:rPr>
-          <w:rFonts w:ascii="Arial" w:hAnsi="Arial" w:cs="Arial"/>
-        </w:rPr>
-        <w:t>’</w:t>
-      </w:r>
-      <w:r>
-        <w:rPr>
-          <w:rFonts w:ascii="Arial" w:hAnsi="Arial" w:cs="Arial"/>
-        </w:rPr>
-        <w:t xml:space="preserve">t attend the hearing, contact the Tribal Court as soon as possible. Missing the hearing may result in your petition being dismissed or a temporary or ex </w:t>
-      </w:r>
-      <w:proofErr w:type="spellStart"/>
-      <w:r>
-        <w:rPr>
-          <w:rFonts w:ascii="Arial" w:hAnsi="Arial" w:cs="Arial"/>
-        </w:rPr>
-        <w:t>parte</w:t>
-      </w:r>
-      <w:proofErr w:type="spellEnd"/>
-      <w:r>
-        <w:rPr>
-          <w:rFonts w:ascii="Arial" w:hAnsi="Arial" w:cs="Arial"/>
-        </w:rPr>
-        <w:t xml:space="preserve"> order ending.</w:t>
+        <w:t>You should save or download a copy of your completed petition for your records.</w:t>
       </w:r>
     </w:p>
     <w:p>
@@ -524,9 +199,8 @@
           <w:kern w:val="0"/>
           <w14:ligatures w14:val="none"/>
         </w:rPr>
-        <w:t xml:space="preserve">Ex </w:t>
-      </w:r>
-      <w:proofErr w:type="spellStart"/>
+        <w:t>Choosing</w:t>
+      </w:r>
       <w:r>
         <w:rPr>
           <w:rFonts w:ascii="Arial" w:eastAsia="Times New Roman" w:hAnsi="Arial" w:cs="Arial"/>
@@ -535,9 +209,8 @@
           <w:kern w:val="0"/>
           <w14:ligatures w14:val="none"/>
         </w:rPr>
-        <w:t>Parte</w:t>
-      </w:r>
-      <w:proofErr w:type="spellEnd"/>
+        <w:t xml:space="preserve"> </w:t>
+      </w:r>
       <w:r>
         <w:rPr>
           <w:rFonts w:ascii="Arial" w:eastAsia="Times New Roman" w:hAnsi="Arial" w:cs="Arial"/>
@@ -546,34 +219,111 @@
           <w:kern w:val="0"/>
           <w14:ligatures w14:val="none"/>
         </w:rPr>
-        <w:t xml:space="preserve"> Orders</w:t>
+        <w:t xml:space="preserve">the </w:t>
+      </w:r>
+      <w:r>
+        <w:rPr>
+          <w:rFonts w:ascii="Arial" w:eastAsia="Times New Roman" w:hAnsi="Arial" w:cs="Arial"/>
+          <w:b/>
+          <w:color w:val="0B5294"/>
+          <w:kern w:val="0"/>
+          <w14:ligatures w14:val="none"/>
+        </w:rPr>
+        <w:t>Download</w:t>
+      </w:r>
+      <w:r>
+        <w:rPr>
+          <w:rFonts w:ascii="Arial" w:eastAsia="Times New Roman" w:hAnsi="Arial" w:cs="Arial"/>
+          <w:b/>
+          <w:color w:val="0B5294"/>
+          <w:kern w:val="0"/>
+          <w14:ligatures w14:val="none"/>
+        </w:rPr>
+        <w:t xml:space="preserve"> Option</w:t>
       </w:r>
     </w:p>
     <w:p>
       <w:pPr>
-        <w:rPr>
-          <w:rFonts w:ascii="Arial" w:hAnsi="Arial" w:cs="Arial"/>
-        </w:rPr>
-      </w:pPr>
-      <w:r>
-        <w:rPr>
-          <w:rFonts w:ascii="Arial" w:hAnsi="Arial" w:cs="Arial"/>
-        </w:rPr>
-        <w:t xml:space="preserve">An ex </w:t>
-      </w:r>
-      <w:proofErr w:type="spellStart"/>
-      <w:r>
-        <w:rPr>
-          <w:rFonts w:ascii="Arial" w:hAnsi="Arial" w:cs="Arial"/>
-        </w:rPr>
-        <w:t>parte</w:t>
-      </w:r>
-      <w:proofErr w:type="spellEnd"/>
-      <w:r>
-        <w:rPr>
-          <w:rFonts w:ascii="Arial" w:hAnsi="Arial" w:cs="Arial"/>
-        </w:rPr>
-        <w:t xml:space="preserve"> order is a temporary protection order that may be issued if the Tribal Court believes you are in immediate danger. This order can provide protection until the court holds a full hearing.</w:t>
+        <w:pStyle w:val="ListParagraph"/>
+        <w:numPr>
+          <w:ilvl w:val="0"/>
+          <w:numId w:val="8"/>
+        </w:numPr>
+        <w:rPr>
+          <w:rFonts w:ascii="Arial" w:hAnsi="Arial" w:cs="Arial"/>
+        </w:rPr>
+      </w:pPr>
+      <w:r>
+        <w:rPr>
+          <w:rFonts w:ascii="Arial" w:hAnsi="Arial" w:cs="Arial"/>
+        </w:rPr>
+        <w:t xml:space="preserve">Download and save a copy of your completed petition. </w:t>
+      </w:r>
+    </w:p>
+    <w:p>
+      <w:pPr>
+        <w:pStyle w:val="ListParagraph"/>
+        <w:numPr>
+          <w:ilvl w:val="0"/>
+          <w:numId w:val="8"/>
+        </w:numPr>
+        <w:rPr>
+          <w:rFonts w:ascii="Arial" w:hAnsi="Arial" w:cs="Arial"/>
+        </w:rPr>
+      </w:pPr>
+      <w:r>
+        <w:rPr>
+          <w:rFonts w:ascii="Arial" w:hAnsi="Arial" w:cs="Arial"/>
+        </w:rPr>
+        <w:t xml:space="preserve">Print your petition. </w:t>
+      </w:r>
+    </w:p>
+    <w:p>
+      <w:pPr>
+        <w:pStyle w:val="ListParagraph"/>
+        <w:numPr>
+          <w:ilvl w:val="0"/>
+          <w:numId w:val="8"/>
+        </w:numPr>
+        <w:rPr>
+          <w:rFonts w:ascii="Arial" w:hAnsi="Arial" w:cs="Arial"/>
+        </w:rPr>
+      </w:pPr>
+      <w:r>
+        <w:rPr>
+          <w:rFonts w:ascii="Arial" w:hAnsi="Arial" w:cs="Arial"/>
+        </w:rPr>
+        <w:t xml:space="preserve">Bring your printed petition to the Mashpee Wampanoag Tribal Court </w:t>
+      </w:r>
+      <w:r>
+        <w:rPr>
+          <w:rFonts w:ascii="Arial" w:hAnsi="Arial" w:cs="Arial"/>
+        </w:rPr>
+        <w:t xml:space="preserve">Clerk </w:t>
+      </w:r>
+      <w:r>
+        <w:rPr>
+          <w:rFonts w:ascii="Arial" w:hAnsi="Arial" w:cs="Arial"/>
+        </w:rPr>
+        <w:t xml:space="preserve">during court hours so it can be filed. </w:t>
+      </w:r>
+    </w:p>
+    <w:p>
+      <w:pPr>
+        <w:pStyle w:val="ListParagraph"/>
+        <w:numPr>
+          <w:ilvl w:val="0"/>
+          <w:numId w:val="8"/>
+        </w:numPr>
+        <w:rPr>
+          <w:rFonts w:ascii="Arial" w:hAnsi="Arial" w:cs="Arial"/>
+        </w:rPr>
+      </w:pPr>
+      <w:r>
+        <w:rPr>
+          <w:rFonts w:ascii="Arial" w:hAnsi="Arial" w:cs="Arial"/>
+        </w:rPr>
+        <w:t>You should keep a copy of your completed petition for your records.</w:t>
       </w:r>
     </w:p>
     <w:p>
@@ -601,144 +351,472 @@
           <w:kern w:val="0"/>
           <w14:ligatures w14:val="none"/>
         </w:rPr>
-        <w:t>Preparing for your Hearing</w:t>
+        <w:t xml:space="preserve">Next </w:t>
+      </w:r>
+      <w:r>
+        <w:rPr>
+          <w:rFonts w:ascii="Arial" w:eastAsia="Times New Roman" w:hAnsi="Arial" w:cs="Arial"/>
+          <w:b/>
+          <w:color w:val="0B5294"/>
+          <w:kern w:val="0"/>
+          <w14:ligatures w14:val="none"/>
+        </w:rPr>
+        <w:t>Steps</w:t>
       </w:r>
     </w:p>
     <w:p>
       <w:pPr>
-        <w:rPr>
-          <w:rFonts w:ascii="Arial" w:hAnsi="Arial" w:cs="Arial"/>
-        </w:rPr>
-      </w:pPr>
-      <w:r>
-        <w:rPr>
-          <w:rFonts w:ascii="Arial" w:hAnsi="Arial" w:cs="Arial"/>
-        </w:rPr>
-        <w:t>At the hearing, the Tribal Judge will review your petition and may ask you questions.</w:t>
+        <w:pStyle w:val="ListParagraph"/>
+        <w:numPr>
+          <w:ilvl w:val="0"/>
+          <w:numId w:val="9"/>
+        </w:numPr>
+        <w:rPr>
+          <w:rFonts w:ascii="Arial" w:hAnsi="Arial" w:cs="Arial"/>
+        </w:rPr>
+      </w:pPr>
+      <w:r>
+        <w:rPr>
+          <w:rFonts w:ascii="Arial" w:hAnsi="Arial" w:cs="Arial"/>
+        </w:rPr>
+        <w:t xml:space="preserve">Once </w:t>
+      </w:r>
+      <w:r>
+        <w:rPr>
+          <w:rFonts w:ascii="Arial" w:hAnsi="Arial" w:cs="Arial"/>
+        </w:rPr>
+        <w:t>filed</w:t>
+      </w:r>
+      <w:r>
+        <w:rPr>
+          <w:rFonts w:ascii="Arial" w:hAnsi="Arial" w:cs="Arial"/>
+        </w:rPr>
+        <w:t xml:space="preserve">, </w:t>
+      </w:r>
+      <w:r>
+        <w:rPr>
+          <w:rFonts w:ascii="Arial" w:hAnsi="Arial" w:cs="Arial"/>
+        </w:rPr>
+        <w:t xml:space="preserve">the </w:t>
+      </w:r>
+      <w:r>
+        <w:rPr>
+          <w:rFonts w:ascii="Arial" w:hAnsi="Arial" w:cs="Arial"/>
+        </w:rPr>
+        <w:t xml:space="preserve">Tribal Court Clerk will </w:t>
+      </w:r>
+      <w:r>
+        <w:rPr>
+          <w:rFonts w:ascii="Arial" w:hAnsi="Arial" w:cs="Arial"/>
+        </w:rPr>
+        <w:t>send</w:t>
+      </w:r>
+      <w:r>
+        <w:rPr>
+          <w:rFonts w:ascii="Arial" w:hAnsi="Arial" w:cs="Arial"/>
+        </w:rPr>
+        <w:t xml:space="preserve"> it to the Chief Judge, who</w:t>
+      </w:r>
+      <w:r>
+        <w:rPr>
+          <w:rFonts w:ascii="Arial" w:hAnsi="Arial" w:cs="Arial"/>
+        </w:rPr>
+        <w:t>’</w:t>
+      </w:r>
+      <w:r>
+        <w:rPr>
+          <w:rFonts w:ascii="Arial" w:hAnsi="Arial" w:cs="Arial"/>
+        </w:rPr>
+        <w:t xml:space="preserve">ll assign it to a Tribal District Court Judge for review. Your petition will be </w:t>
+      </w:r>
+      <w:r>
+        <w:rPr>
+          <w:rFonts w:ascii="Arial" w:hAnsi="Arial" w:cs="Arial"/>
+        </w:rPr>
+        <w:t>reviewed on</w:t>
+      </w:r>
+      <w:r>
+        <w:rPr>
+          <w:rFonts w:ascii="Arial" w:hAnsi="Arial" w:cs="Arial"/>
+        </w:rPr>
+        <w:t xml:space="preserve"> the same day it</w:t>
+      </w:r>
+      <w:r>
+        <w:rPr>
+          <w:rFonts w:ascii="Arial" w:hAnsi="Arial" w:cs="Arial"/>
+        </w:rPr>
+        <w:t>’</w:t>
+      </w:r>
+      <w:r>
+        <w:rPr>
+          <w:rFonts w:ascii="Arial" w:hAnsi="Arial" w:cs="Arial"/>
+        </w:rPr>
+        <w:t xml:space="preserve">s filed or by the next </w:t>
+      </w:r>
+      <w:r>
+        <w:rPr>
+          <w:rFonts w:ascii="Arial" w:hAnsi="Arial" w:cs="Arial"/>
+        </w:rPr>
+        <w:t>open court</w:t>
+      </w:r>
+      <w:r>
+        <w:rPr>
+          <w:rFonts w:ascii="Arial" w:hAnsi="Arial" w:cs="Arial"/>
+        </w:rPr>
+        <w:t xml:space="preserve"> day. </w:t>
       </w:r>
     </w:p>
     <w:p>
       <w:pPr>
-        <w:suppressAutoHyphens/>
-        <w:snapToGrid w:val="0"/>
-        <w:spacing w:after="80" w:line="259" w:lineRule="auto"/>
-        <w:rPr>
-          <w:rFonts w:ascii="Arial" w:eastAsia="Times New Roman" w:hAnsi="Arial" w:cs="Arial"/>
-          <w:kern w:val="0"/>
-          <w14:textOutline w14:w="9525" w14:cap="rnd" w14:cmpd="sng" w14:algn="ctr">
-            <w14:noFill/>
-            <w14:prstDash w14:val="solid"/>
-            <w14:bevel/>
-          </w14:textOutline>
-          <w14:ligatures w14:val="none"/>
-        </w:rPr>
-      </w:pPr>
+        <w:pStyle w:val="ListParagraph"/>
+        <w:numPr>
+          <w:ilvl w:val="0"/>
+          <w:numId w:val="9"/>
+        </w:numPr>
+        <w:rPr>
+          <w:rFonts w:ascii="Arial" w:hAnsi="Arial" w:cs="Arial"/>
+        </w:rPr>
+      </w:pPr>
+      <w:r>
+        <w:rPr>
+          <w:rFonts w:ascii="Arial" w:hAnsi="Arial" w:cs="Arial"/>
+        </w:rPr>
+        <w:t xml:space="preserve">The </w:t>
+      </w:r>
+      <w:r>
+        <w:rPr>
+          <w:rFonts w:ascii="Arial" w:hAnsi="Arial" w:cs="Arial"/>
+        </w:rPr>
+        <w:t>Tribal Court</w:t>
+      </w:r>
+      <w:r>
+        <w:rPr>
+          <w:rFonts w:ascii="Arial" w:hAnsi="Arial" w:cs="Arial"/>
+        </w:rPr>
+        <w:t xml:space="preserve"> </w:t>
+      </w:r>
+      <w:r>
+        <w:rPr>
+          <w:rFonts w:ascii="Arial" w:hAnsi="Arial" w:cs="Arial"/>
+        </w:rPr>
+        <w:t xml:space="preserve">may contact you if more information is needed. </w:t>
+      </w:r>
     </w:p>
     <w:p>
       <w:pPr>
-        <w:rPr>
-          <w:rFonts w:ascii="Arial" w:hAnsi="Arial" w:cs="Arial"/>
-        </w:rPr>
-      </w:pPr>
-      <w:r>
-        <w:rPr>
-          <w:rFonts w:ascii="Arial" w:hAnsi="Arial" w:cs="Arial"/>
-        </w:rPr>
-        <w:t>You should explain why you are asking for a protection order and describe what happened that led you to file your petition.</w:t>
+        <w:pStyle w:val="ListParagraph"/>
+        <w:numPr>
+          <w:ilvl w:val="0"/>
+          <w:numId w:val="9"/>
+        </w:numPr>
+        <w:rPr>
+          <w:rFonts w:ascii="Arial" w:hAnsi="Arial" w:cs="Arial"/>
+        </w:rPr>
+      </w:pPr>
+      <w:r>
+        <w:rPr>
+          <w:rFonts w:ascii="Arial" w:hAnsi="Arial" w:cs="Arial"/>
+        </w:rPr>
+        <w:t xml:space="preserve">The Tribal Court </w:t>
+      </w:r>
+      <w:r>
+        <w:rPr>
+          <w:rFonts w:ascii="Arial" w:hAnsi="Arial" w:cs="Arial"/>
+        </w:rPr>
+        <w:t>J</w:t>
+      </w:r>
+      <w:r>
+        <w:rPr>
+          <w:rFonts w:ascii="Arial" w:hAnsi="Arial" w:cs="Arial"/>
+        </w:rPr>
+        <w:t>udge will decide whether to issue a</w:t>
+      </w:r>
+      <w:r>
+        <w:rPr>
+          <w:rFonts w:ascii="Arial" w:hAnsi="Arial" w:cs="Arial"/>
+        </w:rPr>
+        <w:t xml:space="preserve">n </w:t>
+      </w:r>
+      <w:r>
+        <w:rPr>
+          <w:rFonts w:ascii="Arial" w:hAnsi="Arial" w:cs="Arial"/>
+        </w:rPr>
+        <w:t xml:space="preserve">ex </w:t>
+      </w:r>
+      <w:proofErr w:type="spellStart"/>
+      <w:r>
+        <w:rPr>
+          <w:rFonts w:ascii="Arial" w:hAnsi="Arial" w:cs="Arial"/>
+        </w:rPr>
+        <w:t>parte</w:t>
+      </w:r>
+      <w:proofErr w:type="spellEnd"/>
+      <w:r>
+        <w:rPr>
+          <w:rFonts w:ascii="Arial" w:hAnsi="Arial" w:cs="Arial"/>
+        </w:rPr>
+        <w:t xml:space="preserve"> protection order based on the information </w:t>
+      </w:r>
+      <w:r>
+        <w:rPr>
+          <w:rFonts w:ascii="Arial" w:hAnsi="Arial" w:cs="Arial"/>
+        </w:rPr>
+        <w:t>provided</w:t>
+      </w:r>
+      <w:r>
+        <w:rPr>
+          <w:rFonts w:ascii="Arial" w:hAnsi="Arial" w:cs="Arial"/>
+        </w:rPr>
+        <w:t xml:space="preserve">. </w:t>
       </w:r>
     </w:p>
     <w:p>
       <w:pPr>
-        <w:rPr>
-          <w:rFonts w:ascii="Arial" w:hAnsi="Arial" w:cs="Arial"/>
-        </w:rPr>
-      </w:pPr>
+        <w:pStyle w:val="ListParagraph"/>
+        <w:numPr>
+          <w:ilvl w:val="1"/>
+          <w:numId w:val="9"/>
+        </w:numPr>
+        <w:rPr>
+          <w:rFonts w:ascii="Arial" w:hAnsi="Arial" w:cs="Arial"/>
+        </w:rPr>
+      </w:pPr>
+      <w:r>
+        <w:rPr>
+          <w:rFonts w:ascii="Arial" w:hAnsi="Arial" w:cs="Arial"/>
+        </w:rPr>
+        <w:t xml:space="preserve">If no ex </w:t>
+      </w:r>
+      <w:proofErr w:type="spellStart"/>
+      <w:r>
+        <w:rPr>
+          <w:rFonts w:ascii="Arial" w:hAnsi="Arial" w:cs="Arial"/>
+        </w:rPr>
+        <w:t>parte</w:t>
+      </w:r>
+      <w:proofErr w:type="spellEnd"/>
+      <w:r>
+        <w:rPr>
+          <w:rFonts w:ascii="Arial" w:hAnsi="Arial" w:cs="Arial"/>
+        </w:rPr>
+        <w:t xml:space="preserve"> order is issued, a hearing will be scheduled within 14 days after you file your petition. </w:t>
+      </w:r>
     </w:p>
     <w:p>
       <w:pPr>
-        <w:rPr>
-          <w:rFonts w:ascii="Arial" w:hAnsi="Arial" w:cs="Arial"/>
-        </w:rPr>
-      </w:pPr>
-      <w:r>
-        <w:rPr>
-          <w:rFonts w:ascii="Arial" w:hAnsi="Arial" w:cs="Arial"/>
-        </w:rPr>
-        <w:t xml:space="preserve">You </w:t>
-      </w:r>
-      <w:r>
-        <w:rPr>
-          <w:rFonts w:ascii="Arial" w:hAnsi="Arial" w:cs="Arial"/>
-        </w:rPr>
-        <w:t>should</w:t>
-      </w:r>
-      <w:r>
-        <w:rPr>
-          <w:rFonts w:ascii="Arial" w:hAnsi="Arial" w:cs="Arial"/>
-        </w:rPr>
-        <w:t xml:space="preserve"> bring </w:t>
-      </w:r>
-      <w:r>
-        <w:rPr>
-          <w:rFonts w:ascii="Arial" w:hAnsi="Arial" w:cs="Arial"/>
-        </w:rPr>
-        <w:t xml:space="preserve">witnesses or </w:t>
-      </w:r>
-      <w:r>
-        <w:rPr>
-          <w:rFonts w:ascii="Arial" w:hAnsi="Arial" w:cs="Arial"/>
-        </w:rPr>
-        <w:t>evidence to support your request, such as text messages, emails, photos, medical records, police reports, or statements from witnesses.</w:t>
-      </w:r>
-      <w:r>
-        <w:rPr>
-          <w:rFonts w:ascii="Arial" w:hAnsi="Arial" w:cs="Arial"/>
-        </w:rPr>
-        <w:t xml:space="preserve"> </w:t>
-      </w:r>
-      <w:r>
-        <w:rPr>
-          <w:rFonts w:ascii="Arial" w:hAnsi="Arial" w:cs="Arial"/>
-        </w:rPr>
-        <w:t xml:space="preserve">The defendant will also have the opportunity to </w:t>
-      </w:r>
-      <w:r>
-        <w:rPr>
-          <w:rFonts w:ascii="Arial" w:hAnsi="Arial" w:cs="Arial"/>
-        </w:rPr>
-        <w:t>provide the same kind of material.</w:t>
+        <w:pStyle w:val="ListParagraph"/>
+        <w:numPr>
+          <w:ilvl w:val="1"/>
+          <w:numId w:val="9"/>
+        </w:numPr>
+        <w:rPr>
+          <w:rFonts w:ascii="Arial" w:hAnsi="Arial" w:cs="Arial"/>
+        </w:rPr>
+      </w:pPr>
+      <w:r>
+        <w:rPr>
+          <w:rFonts w:ascii="Arial" w:hAnsi="Arial" w:cs="Arial"/>
+        </w:rPr>
+        <w:t>If a</w:t>
+      </w:r>
+      <w:r>
+        <w:rPr>
+          <w:rFonts w:ascii="Arial" w:hAnsi="Arial" w:cs="Arial"/>
+        </w:rPr>
+        <w:t xml:space="preserve">n </w:t>
+      </w:r>
+      <w:r>
+        <w:rPr>
+          <w:rFonts w:ascii="Arial" w:hAnsi="Arial" w:cs="Arial"/>
+        </w:rPr>
+        <w:t xml:space="preserve">ex </w:t>
+      </w:r>
+      <w:proofErr w:type="spellStart"/>
+      <w:r>
+        <w:rPr>
+          <w:rFonts w:ascii="Arial" w:hAnsi="Arial" w:cs="Arial"/>
+        </w:rPr>
+        <w:t>parte</w:t>
+      </w:r>
+      <w:proofErr w:type="spellEnd"/>
+      <w:r>
+        <w:rPr>
+          <w:rFonts w:ascii="Arial" w:hAnsi="Arial" w:cs="Arial"/>
+        </w:rPr>
+        <w:t xml:space="preserve"> order is issued, a hearing will be scheduled within 30 days after the order is issued. </w:t>
       </w:r>
     </w:p>
     <w:p>
       <w:pPr>
-        <w:rPr>
-          <w:rFonts w:ascii="Arial" w:hAnsi="Arial" w:cs="Arial"/>
-        </w:rPr>
-      </w:pPr>
+        <w:pStyle w:val="ListParagraph"/>
+        <w:numPr>
+          <w:ilvl w:val="0"/>
+          <w:numId w:val="9"/>
+        </w:numPr>
+        <w:spacing w:line="259" w:lineRule="auto"/>
+        <w:rPr>
+          <w:rFonts w:ascii="Arial" w:hAnsi="Arial" w:cs="Arial"/>
+        </w:rPr>
+      </w:pPr>
+      <w:r>
+        <w:rPr>
+          <w:rFonts w:ascii="Arial" w:hAnsi="Arial" w:cs="Arial"/>
+        </w:rPr>
+        <w:t xml:space="preserve">The </w:t>
+      </w:r>
+      <w:r>
+        <w:rPr>
+          <w:rFonts w:ascii="Arial" w:hAnsi="Arial" w:cs="Arial"/>
+        </w:rPr>
+        <w:t>Tribal Court</w:t>
+      </w:r>
+      <w:r>
+        <w:rPr>
+          <w:rFonts w:ascii="Arial" w:hAnsi="Arial" w:cs="Arial"/>
+        </w:rPr>
+        <w:t xml:space="preserve"> </w:t>
+      </w:r>
+      <w:r>
+        <w:rPr>
+          <w:rFonts w:ascii="Arial" w:hAnsi="Arial" w:cs="Arial"/>
+        </w:rPr>
+        <w:t>C</w:t>
+      </w:r>
+      <w:r>
+        <w:rPr>
+          <w:rFonts w:ascii="Arial" w:hAnsi="Arial" w:cs="Arial"/>
+        </w:rPr>
+        <w:t>lerk will send notice of the hearing to both you and</w:t>
+      </w:r>
+      <w:r>
+        <w:rPr>
+          <w:rFonts w:ascii="Arial" w:hAnsi="Arial" w:cs="Arial"/>
+        </w:rPr>
+        <w:t xml:space="preserve"> the Defendant</w:t>
+      </w:r>
+      <w:r>
+        <w:rPr>
+          <w:rFonts w:ascii="Arial" w:hAnsi="Arial" w:cs="Arial"/>
+        </w:rPr>
+        <w:t xml:space="preserve">. </w:t>
+      </w:r>
+      <w:r>
+        <w:rPr>
+          <w:rFonts w:ascii="Arial" w:hAnsi="Arial" w:cs="Arial"/>
+        </w:rPr>
+        <w:t xml:space="preserve">You do not need to contact </w:t>
+      </w:r>
+      <w:r>
+        <w:rPr>
+          <w:rFonts w:ascii="Arial" w:hAnsi="Arial" w:cs="Arial"/>
+        </w:rPr>
+        <w:t xml:space="preserve">the Defendant </w:t>
+      </w:r>
+      <w:r>
+        <w:rPr>
+          <w:rFonts w:ascii="Arial" w:hAnsi="Arial" w:cs="Arial"/>
+        </w:rPr>
+        <w:t>or arrange service yourself.</w:t>
+      </w:r>
     </w:p>
     <w:p>
       <w:pPr>
-        <w:rPr>
-          <w:rFonts w:ascii="Arial" w:hAnsi="Arial" w:cs="Arial"/>
-        </w:rPr>
-      </w:pPr>
-      <w:r>
-        <w:rPr>
-          <w:rFonts w:ascii="Arial" w:hAnsi="Arial" w:cs="Arial"/>
-        </w:rPr>
-        <w:t xml:space="preserve">The Tribal Court </w:t>
-      </w:r>
-      <w:r>
-        <w:rPr>
-          <w:rFonts w:ascii="Arial" w:hAnsi="Arial" w:cs="Arial"/>
-        </w:rPr>
-        <w:t xml:space="preserve">Judge </w:t>
-      </w:r>
-      <w:r>
-        <w:rPr>
-          <w:rFonts w:ascii="Arial" w:hAnsi="Arial" w:cs="Arial"/>
-        </w:rPr>
-        <w:t>will decide whether it believes the harassment you described likely happened or could happen again.</w:t>
+        <w:pStyle w:val="ListParagraph"/>
+        <w:numPr>
+          <w:ilvl w:val="1"/>
+          <w:numId w:val="9"/>
+        </w:numPr>
+        <w:rPr>
+          <w:rFonts w:ascii="Arial" w:hAnsi="Arial" w:cs="Arial"/>
+        </w:rPr>
+      </w:pPr>
+      <w:r>
+        <w:rPr>
+          <w:rFonts w:ascii="Arial" w:hAnsi="Arial" w:cs="Arial"/>
+        </w:rPr>
+        <w:t>If a</w:t>
+      </w:r>
+      <w:r>
+        <w:rPr>
+          <w:rFonts w:ascii="Arial" w:hAnsi="Arial" w:cs="Arial"/>
+        </w:rPr>
+        <w:t xml:space="preserve">n </w:t>
+      </w:r>
+      <w:r>
+        <w:rPr>
+          <w:rFonts w:ascii="Arial" w:hAnsi="Arial" w:cs="Arial"/>
+        </w:rPr>
+        <w:t xml:space="preserve">ex </w:t>
+      </w:r>
+      <w:proofErr w:type="spellStart"/>
+      <w:r>
+        <w:rPr>
+          <w:rFonts w:ascii="Arial" w:hAnsi="Arial" w:cs="Arial"/>
+        </w:rPr>
+        <w:t>parte</w:t>
+      </w:r>
+      <w:proofErr w:type="spellEnd"/>
+      <w:r>
+        <w:rPr>
+          <w:rFonts w:ascii="Arial" w:hAnsi="Arial" w:cs="Arial"/>
+        </w:rPr>
+        <w:t xml:space="preserve"> order is issued, Tribal Police</w:t>
+      </w:r>
+      <w:r>
+        <w:rPr>
+          <w:rFonts w:ascii="Arial" w:hAnsi="Arial" w:cs="Arial"/>
+        </w:rPr>
+        <w:t xml:space="preserve"> </w:t>
+      </w:r>
+      <w:r>
+        <w:rPr>
+          <w:rFonts w:ascii="Arial" w:hAnsi="Arial" w:cs="Arial"/>
+        </w:rPr>
+        <w:t>will serve the defendant.</w:t>
+      </w:r>
+    </w:p>
+    <w:p>
+      <w:pPr>
+        <w:pStyle w:val="ListParagraph"/>
+        <w:numPr>
+          <w:ilvl w:val="0"/>
+          <w:numId w:val="9"/>
+        </w:numPr>
+        <w:rPr>
+          <w:rFonts w:ascii="Arial" w:hAnsi="Arial" w:cs="Arial"/>
+        </w:rPr>
+      </w:pPr>
+      <w:r>
+        <w:rPr>
+          <w:rFonts w:ascii="Arial" w:hAnsi="Arial" w:cs="Arial"/>
+        </w:rPr>
+        <w:t>If you can</w:t>
+      </w:r>
+      <w:r>
+        <w:rPr>
+          <w:rFonts w:ascii="Arial" w:hAnsi="Arial" w:cs="Arial"/>
+        </w:rPr>
+        <w:t>’</w:t>
+      </w:r>
+      <w:r>
+        <w:rPr>
+          <w:rFonts w:ascii="Arial" w:hAnsi="Arial" w:cs="Arial"/>
+        </w:rPr>
+        <w:t xml:space="preserve">t attend the hearing, contact the Tribal Court as soon as possible. Missing the hearing may result in your petition being dismissed or a temporary or ex </w:t>
+      </w:r>
+      <w:proofErr w:type="spellStart"/>
+      <w:r>
+        <w:rPr>
+          <w:rFonts w:ascii="Arial" w:hAnsi="Arial" w:cs="Arial"/>
+        </w:rPr>
+        <w:t>parte</w:t>
+      </w:r>
+      <w:proofErr w:type="spellEnd"/>
+      <w:r>
+        <w:rPr>
+          <w:rFonts w:ascii="Arial" w:hAnsi="Arial" w:cs="Arial"/>
+        </w:rPr>
+        <w:t xml:space="preserve"> order ending.</w:t>
       </w:r>
     </w:p>
     <w:p>
@@ -766,7 +844,29 @@
           <w:kern w:val="0"/>
           <w14:ligatures w14:val="none"/>
         </w:rPr>
-        <w:t>What are the possible outcomes?</w:t>
+        <w:t xml:space="preserve">Ex </w:t>
+      </w:r>
+      <w:proofErr w:type="spellStart"/>
+      <w:r>
+        <w:rPr>
+          <w:rFonts w:ascii="Arial" w:eastAsia="Times New Roman" w:hAnsi="Arial" w:cs="Arial"/>
+          <w:b/>
+          <w:color w:val="0B5294"/>
+          <w:kern w:val="0"/>
+          <w14:ligatures w14:val="none"/>
+        </w:rPr>
+        <w:t>Parte</w:t>
+      </w:r>
+      <w:proofErr w:type="spellEnd"/>
+      <w:r>
+        <w:rPr>
+          <w:rFonts w:ascii="Arial" w:eastAsia="Times New Roman" w:hAnsi="Arial" w:cs="Arial"/>
+          <w:b/>
+          <w:color w:val="0B5294"/>
+          <w:kern w:val="0"/>
+          <w14:ligatures w14:val="none"/>
+        </w:rPr>
+        <w:t xml:space="preserve"> Orders</w:t>
       </w:r>
     </w:p>
     <w:p>
@@ -779,27 +879,21 @@
         <w:rPr>
           <w:rFonts w:ascii="Arial" w:hAnsi="Arial" w:cs="Arial"/>
         </w:rPr>
-        <w:t>At or after the hearing, the Tribal Judge may grant a protection order, modify or extend a temporary protection order, or deny the petition.</w:t>
-      </w:r>
-    </w:p>
-    <w:p>
-      <w:pPr>
-        <w:rPr>
-          <w:rFonts w:ascii="Arial" w:hAnsi="Arial" w:cs="Arial"/>
-        </w:rPr>
-      </w:pPr>
-    </w:p>
-    <w:p>
-      <w:pPr>
-        <w:rPr>
-          <w:rFonts w:ascii="Arial" w:hAnsi="Arial" w:cs="Arial"/>
-        </w:rPr>
-      </w:pPr>
-      <w:r>
-        <w:rPr>
-          <w:rFonts w:ascii="Arial" w:hAnsi="Arial" w:cs="Arial"/>
-        </w:rPr>
-        <w:t>If the protection order is granted, it may require the defendant to stop contacting you, stay away from your home, job, or school, or follow other rules set by the court.</w:t>
+        <w:t xml:space="preserve">An ex </w:t>
+      </w:r>
+      <w:proofErr w:type="spellStart"/>
+      <w:r>
+        <w:rPr>
+          <w:rFonts w:ascii="Arial" w:hAnsi="Arial" w:cs="Arial"/>
+        </w:rPr>
+        <w:t>parte</w:t>
+      </w:r>
+      <w:proofErr w:type="spellEnd"/>
+      <w:r>
+        <w:rPr>
+          <w:rFonts w:ascii="Arial" w:hAnsi="Arial" w:cs="Arial"/>
+        </w:rPr>
+        <w:t xml:space="preserve"> order is a temporary protection order that may be issued if the Tribal Court believes you are in immediate danger. This order can provide protection until the court holds a full hearing.</w:t>
       </w:r>
     </w:p>
     <w:p>
@@ -827,47 +921,7 @@
           <w:kern w:val="0"/>
           <w14:ligatures w14:val="none"/>
         </w:rPr>
-        <w:t xml:space="preserve">What happens if the </w:t>
-      </w:r>
-      <w:r>
-        <w:rPr>
-          <w:rFonts w:ascii="Arial" w:eastAsia="Times New Roman" w:hAnsi="Arial" w:cs="Arial"/>
-          <w:b/>
-          <w:color w:val="0B5294"/>
-          <w:kern w:val="0"/>
-          <w14:ligatures w14:val="none"/>
-        </w:rPr>
-        <w:t>Tribal Judge</w:t>
-      </w:r>
-      <w:r>
-        <w:rPr>
-          <w:rFonts w:ascii="Arial" w:eastAsia="Times New Roman" w:hAnsi="Arial" w:cs="Arial"/>
-          <w:b/>
-          <w:color w:val="0B5294"/>
-          <w:kern w:val="0"/>
-          <w14:ligatures w14:val="none"/>
-        </w:rPr>
-        <w:t xml:space="preserve"> </w:t>
-      </w:r>
-      <w:r>
-        <w:rPr>
-          <w:rFonts w:ascii="Arial" w:eastAsia="Times New Roman" w:hAnsi="Arial" w:cs="Arial"/>
-          <w:b/>
-          <w:color w:val="0B5294"/>
-          <w:kern w:val="0"/>
-          <w14:ligatures w14:val="none"/>
-        </w:rPr>
-        <w:t>grants</w:t>
-      </w:r>
-      <w:r>
-        <w:rPr>
-          <w:rFonts w:ascii="Arial" w:eastAsia="Times New Roman" w:hAnsi="Arial" w:cs="Arial"/>
-          <w:b/>
-          <w:color w:val="0B5294"/>
-          <w:kern w:val="0"/>
-          <w14:ligatures w14:val="none"/>
-        </w:rPr>
-        <w:t xml:space="preserve"> the order?</w:t>
+        <w:t>Preparing for your Hearing</w:t>
       </w:r>
     </w:p>
     <w:p>
@@ -880,7 +934,155 @@
         <w:rPr>
           <w:rFonts w:ascii="Arial" w:hAnsi="Arial" w:cs="Arial"/>
         </w:rPr>
-        <w:t>The Tribal Police and local law enforcement will receive copies of your order to ensure enforcement both on and off Tribal Lands.</w:t>
+        <w:t>At the hearing, the Tribal Judge will review your petition and may ask you questions.</w:t>
+      </w:r>
+      <w:r>
+        <w:rPr>
+          <w:rFonts w:ascii="Arial" w:hAnsi="Arial" w:cs="Arial"/>
+        </w:rPr>
+        <w:t xml:space="preserve"> </w:t>
+      </w:r>
+      <w:r>
+        <w:rPr>
+          <w:rFonts w:ascii="Arial" w:hAnsi="Arial" w:cs="Arial"/>
+        </w:rPr>
+        <w:t>You should explain why you</w:t>
+      </w:r>
+      <w:r>
+        <w:rPr>
+          <w:rFonts w:ascii="Arial" w:hAnsi="Arial" w:cs="Arial"/>
+        </w:rPr>
+        <w:t>’</w:t>
+      </w:r>
+      <w:r>
+        <w:rPr>
+          <w:rFonts w:ascii="Arial" w:hAnsi="Arial" w:cs="Arial"/>
+        </w:rPr>
+        <w:t>re asking for a protection order and describe what happened that led you to file your petition.</w:t>
+      </w:r>
+    </w:p>
+    <w:p>
+      <w:pPr>
+        <w:rPr>
+          <w:rFonts w:ascii="Arial" w:hAnsi="Arial" w:cs="Arial"/>
+        </w:rPr>
+      </w:pPr>
+    </w:p>
+    <w:p>
+      <w:pPr>
+        <w:rPr>
+          <w:rFonts w:ascii="Arial" w:hAnsi="Arial" w:cs="Arial"/>
+        </w:rPr>
+      </w:pPr>
+      <w:r>
+        <w:rPr>
+          <w:rFonts w:ascii="Arial" w:hAnsi="Arial" w:cs="Arial"/>
+        </w:rPr>
+        <w:t xml:space="preserve">You </w:t>
+      </w:r>
+      <w:r>
+        <w:rPr>
+          <w:rFonts w:ascii="Arial" w:hAnsi="Arial" w:cs="Arial"/>
+        </w:rPr>
+        <w:t>should</w:t>
+      </w:r>
+      <w:r>
+        <w:rPr>
+          <w:rFonts w:ascii="Arial" w:hAnsi="Arial" w:cs="Arial"/>
+        </w:rPr>
+        <w:t xml:space="preserve"> bring </w:t>
+      </w:r>
+      <w:r>
+        <w:rPr>
+          <w:rFonts w:ascii="Arial" w:hAnsi="Arial" w:cs="Arial"/>
+        </w:rPr>
+        <w:t>witnesses</w:t>
+      </w:r>
+      <w:r>
+        <w:rPr>
+          <w:rFonts w:ascii="Arial" w:hAnsi="Arial" w:cs="Arial"/>
+        </w:rPr>
+        <w:t xml:space="preserve"> or </w:t>
+      </w:r>
+      <w:r>
+        <w:rPr>
+          <w:rFonts w:ascii="Arial" w:hAnsi="Arial" w:cs="Arial"/>
+        </w:rPr>
+        <w:t>evidence to support your request, such as text messages, emails, photos, medical records, police reports, or statements from witnesses.</w:t>
+      </w:r>
+      <w:r>
+        <w:rPr>
+          <w:rFonts w:ascii="Arial" w:hAnsi="Arial" w:cs="Arial"/>
+        </w:rPr>
+        <w:t xml:space="preserve"> </w:t>
+      </w:r>
+      <w:r>
+        <w:rPr>
+          <w:rFonts w:ascii="Arial" w:hAnsi="Arial" w:cs="Arial"/>
+        </w:rPr>
+        <w:t>The Defendant</w:t>
+      </w:r>
+      <w:r>
+        <w:rPr>
+          <w:rFonts w:ascii="Arial" w:hAnsi="Arial" w:cs="Arial"/>
+        </w:rPr>
+        <w:t xml:space="preserve"> </w:t>
+      </w:r>
+      <w:r>
+        <w:rPr>
+          <w:rFonts w:ascii="Arial" w:hAnsi="Arial" w:cs="Arial"/>
+        </w:rPr>
+        <w:t xml:space="preserve">will also have the opportunity to </w:t>
+      </w:r>
+      <w:r>
+        <w:rPr>
+          <w:rFonts w:ascii="Arial" w:hAnsi="Arial" w:cs="Arial"/>
+        </w:rPr>
+        <w:t xml:space="preserve">provide the same </w:t>
+      </w:r>
+      <w:r>
+        <w:rPr>
+          <w:rFonts w:ascii="Arial" w:hAnsi="Arial" w:cs="Arial"/>
+        </w:rPr>
+        <w:t xml:space="preserve">kind of </w:t>
+      </w:r>
+      <w:r>
+        <w:rPr>
+          <w:rFonts w:ascii="Arial" w:hAnsi="Arial" w:cs="Arial"/>
+        </w:rPr>
+        <w:t>material.</w:t>
+      </w:r>
+    </w:p>
+    <w:p>
+      <w:pPr>
+        <w:rPr>
+          <w:rFonts w:ascii="Arial" w:hAnsi="Arial" w:cs="Arial"/>
+        </w:rPr>
+      </w:pPr>
+    </w:p>
+    <w:p>
+      <w:pPr>
+        <w:rPr>
+          <w:rFonts w:ascii="Arial" w:hAnsi="Arial" w:cs="Arial"/>
+        </w:rPr>
+      </w:pPr>
+      <w:r>
+        <w:rPr>
+          <w:rFonts w:ascii="Arial" w:hAnsi="Arial" w:cs="Arial"/>
+        </w:rPr>
+        <w:t xml:space="preserve">The Tribal Court </w:t>
+      </w:r>
+      <w:r>
+        <w:rPr>
+          <w:rFonts w:ascii="Arial" w:hAnsi="Arial" w:cs="Arial"/>
+        </w:rPr>
+        <w:t xml:space="preserve">Judge </w:t>
+      </w:r>
+      <w:r>
+        <w:rPr>
+          <w:rFonts w:ascii="Arial" w:hAnsi="Arial" w:cs="Arial"/>
+        </w:rPr>
+        <w:t>will decide whether it believes the harassment you described likely happened or could happen again.</w:t>
       </w:r>
     </w:p>
     <w:p>
@@ -908,12 +1110,154 @@
           <w:kern w:val="0"/>
           <w14:ligatures w14:val="none"/>
         </w:rPr>
-        <w:lastRenderedPageBreak/>
-        <w:t>If you Need Help</w:t>
+        <w:t>What are the possible outcomes?</w:t>
       </w:r>
     </w:p>
     <w:p>
       <w:pPr>
+        <w:rPr>
+          <w:rFonts w:ascii="Arial" w:hAnsi="Arial" w:cs="Arial"/>
+        </w:rPr>
+      </w:pPr>
+      <w:r>
+        <w:rPr>
+          <w:rFonts w:ascii="Arial" w:hAnsi="Arial" w:cs="Arial"/>
+        </w:rPr>
+        <w:t>At or after the hearing, the Tribal Judge may grant a protection order, modify or extend a temporary protection order, or deny the petition.</w:t>
+      </w:r>
+    </w:p>
+    <w:p>
+      <w:pPr>
+        <w:rPr>
+          <w:rFonts w:ascii="Arial" w:hAnsi="Arial" w:cs="Arial"/>
+        </w:rPr>
+      </w:pPr>
+    </w:p>
+    <w:p>
+      <w:pPr>
+        <w:rPr>
+          <w:rFonts w:ascii="Arial" w:hAnsi="Arial" w:cs="Arial"/>
+        </w:rPr>
+      </w:pPr>
+      <w:r>
+        <w:rPr>
+          <w:rFonts w:ascii="Arial" w:hAnsi="Arial" w:cs="Arial"/>
+        </w:rPr>
+        <w:t>If the protection order is granted, it may require the defendant to stop contacting you, stay away from your home, job, or school, or follow other rules set by the court.</w:t>
+      </w:r>
+    </w:p>
+    <w:p>
+      <w:pPr>
+        <w:keepNext/>
+        <w:keepLines/>
+        <w:pBdr>
+          <w:bottom w:val="single" w:sz="12" w:space="1" w:color="0B5294"/>
+        </w:pBdr>
+        <w:spacing w:before="240" w:line="259" w:lineRule="auto"/>
+        <w:outlineLvl w:val="1"/>
+        <w:rPr>
+          <w:rFonts w:ascii="Arial" w:eastAsia="Times New Roman" w:hAnsi="Arial" w:cs="Arial"/>
+          <w:b/>
+          <w:color w:val="0B5294"/>
+          <w:kern w:val="0"/>
+          <w14:ligatures w14:val="none"/>
+        </w:rPr>
+      </w:pPr>
+      <w:r>
+        <w:rPr>
+          <w:rFonts w:ascii="Arial" w:eastAsia="Times New Roman" w:hAnsi="Arial" w:cs="Arial"/>
+          <w:b/>
+          <w:color w:val="0B5294"/>
+          <w:kern w:val="0"/>
+          <w14:ligatures w14:val="none"/>
+        </w:rPr>
+        <w:lastRenderedPageBreak/>
+        <w:t xml:space="preserve">What happens if the </w:t>
+      </w:r>
+      <w:r>
+        <w:rPr>
+          <w:rFonts w:ascii="Arial" w:eastAsia="Times New Roman" w:hAnsi="Arial" w:cs="Arial"/>
+          <w:b/>
+          <w:color w:val="0B5294"/>
+          <w:kern w:val="0"/>
+          <w14:ligatures w14:val="none"/>
+        </w:rPr>
+        <w:t>Tribal Judge</w:t>
+      </w:r>
+      <w:r>
+        <w:rPr>
+          <w:rFonts w:ascii="Arial" w:eastAsia="Times New Roman" w:hAnsi="Arial" w:cs="Arial"/>
+          <w:b/>
+          <w:color w:val="0B5294"/>
+          <w:kern w:val="0"/>
+          <w14:ligatures w14:val="none"/>
+        </w:rPr>
+        <w:t xml:space="preserve"> </w:t>
+      </w:r>
+      <w:r>
+        <w:rPr>
+          <w:rFonts w:ascii="Arial" w:eastAsia="Times New Roman" w:hAnsi="Arial" w:cs="Arial"/>
+          <w:b/>
+          <w:color w:val="0B5294"/>
+          <w:kern w:val="0"/>
+          <w14:ligatures w14:val="none"/>
+        </w:rPr>
+        <w:t>grants</w:t>
+      </w:r>
+      <w:r>
+        <w:rPr>
+          <w:rFonts w:ascii="Arial" w:eastAsia="Times New Roman" w:hAnsi="Arial" w:cs="Arial"/>
+          <w:b/>
+          <w:color w:val="0B5294"/>
+          <w:kern w:val="0"/>
+          <w14:ligatures w14:val="none"/>
+        </w:rPr>
+        <w:t xml:space="preserve"> the order?</w:t>
+      </w:r>
+    </w:p>
+    <w:p>
+      <w:pPr>
+        <w:rPr>
+          <w:rFonts w:ascii="Arial" w:hAnsi="Arial" w:cs="Arial"/>
+        </w:rPr>
+      </w:pPr>
+      <w:r>
+        <w:rPr>
+          <w:rFonts w:ascii="Arial" w:hAnsi="Arial" w:cs="Arial"/>
+        </w:rPr>
+        <w:t>The Tribal Police and local law enforcement will receive copies of your order to ensure enforcement both on and off Tribal Lands.</w:t>
+      </w:r>
+    </w:p>
+    <w:p>
+      <w:pPr>
+        <w:keepNext/>
+        <w:keepLines/>
+        <w:pBdr>
+          <w:bottom w:val="single" w:sz="12" w:space="1" w:color="0B5294"/>
+        </w:pBdr>
+        <w:spacing w:before="240" w:line="259" w:lineRule="auto"/>
+        <w:outlineLvl w:val="1"/>
+        <w:rPr>
+          <w:rFonts w:ascii="Arial" w:eastAsia="Times New Roman" w:hAnsi="Arial" w:cs="Arial"/>
+          <w:b/>
+          <w:color w:val="0B5294"/>
+          <w:kern w:val="0"/>
+          <w14:ligatures w14:val="none"/>
+        </w:rPr>
+      </w:pPr>
+      <w:r>
+        <w:rPr>
+          <w:rFonts w:ascii="Arial" w:eastAsia="Times New Roman" w:hAnsi="Arial" w:cs="Arial"/>
+          <w:b/>
+          <w:color w:val="0B5294"/>
+          <w:kern w:val="0"/>
+          <w14:ligatures w14:val="none"/>
+        </w:rPr>
+        <w:t>If you Need Help</w:t>
+      </w:r>
+    </w:p>
+    <w:p>
+      <w:pPr>
         <w:keepNext/>
         <w:spacing w:after="160" w:line="259" w:lineRule="auto"/>
         <w:rPr>
@@ -976,7 +1320,7 @@
         </w:rPr>
         <w:t xml:space="preserve">: </w:t>
       </w:r>
-      <w:hyperlink r:id="rId6" w:history="1">
+      <w:hyperlink r:id="rId8" w:history="1">
         <w:r>
           <w:rPr>
             <w:rFonts w:ascii="Arial" w:eastAsia="Calibri" w:hAnsi="Arial" w:cs="Arial"/>
@@ -1025,9 +1369,8 @@
         <w:t xml:space="preserve"> ext. 109</w:t>
       </w:r>
     </w:p>
-    <w:p/>
     <w:sectPr>
-      <w:footerReference w:type="default" r:id="rId7"/>
+      <w:footerReference w:type="default" r:id="rId9"/>
       <w:type w:val="continuous"/>
       <w:pgSz w:w="12240" w:h="15840"/>
       <w:pgMar w:top="720" w:right="720" w:bottom="720" w:left="720" w:header="720" w:footer="720" w:gutter="0"/>
@@ -1038,6 +1381,25 @@
 </w:document>
 </file>
 
+<file path=word/endnotes.xml><?xml version="1.0" encoding="utf-8"?>
+<w:endnotes xmlns:wpc="http://schemas.microsoft.com/office/word/2010/wordprocessingCanvas" xmlns:cx="http://schemas.microsoft.com/office/drawing/2014/chartex" xmlns:cx1="http://schemas.microsoft.com/office/drawing/2015/9/8/chartex" xmlns:cx2="http://schemas.microsoft.com/office/drawing/2015/10/21/chartex" xmlns:cx3="http://schemas.microsoft.com/office/drawing/2016/5/9/chartex" xmlns:cx4="http://schemas.microsoft.com/office/drawing/2016/5/10/chartex" xmlns:cx5="http://schemas.microsoft.com/office/drawing/2016/5/11/chartex" xmlns:cx6="http://schemas.microsoft.com/office/drawing/2016/5/12/chartex" xmlns:cx7="http://schemas.microsoft.com/office/drawing/2016/5/13/chartex" xmlns:cx8="http://schemas.microsoft.com/office/drawing/2016/5/14/chartex" xmlns:mc="http://schemas.openxmlformats.org/markup-compatibility/2006" xmlns:aink="http://schemas.microsoft.com/office/drawing/2016/ink" xmlns:am3d="http://schemas.microsoft.com/office/drawing/2017/model3d" xmlns:o="urn:schemas-microsoft-com:office:office" xmlns:oel="http://schemas.microsoft.com/office/2019/extlst" xmlns:r="http://schemas.openxmlformats.org/officeDocument/2006/relationships" xmlns:m="http://schemas.openxmlformats.org/officeDocument/2006/math" xmlns:v="urn:schemas-microsoft-com:vml" xmlns:wp14="http://schemas.microsoft.com/office/word/2010/wordprocessingDrawing" xmlns:wp="http://schemas.openxmlformats.org/drawingml/2006/wordprocessingDrawing" xmlns:w10="urn:schemas-microsoft-com:office:word" xmlns:w="http://schemas.openxmlformats.org/wordprocessingml/2006/main" xmlns:w14="http://schemas.microsoft.com/office/word/2010/wordml" xmlns:w15="http://schemas.microsoft.com/office/word/2012/wordml" xmlns:w16cex="http://schemas.microsoft.com/office/word/2018/wordml/cex" xmlns:w16cid="http://schemas.microsoft.com/office/word/2016/wordml/cid" xmlns:w16="http://schemas.microsoft.com/office/word/2018/wordml" xmlns:w16du="http://schemas.microsoft.com/office/word/2023/wordml/word16du" xmlns:w16sdtdh="http://schemas.microsoft.com/office/word/2020/wordml/sdtdatahash" xmlns:w16sdtfl="http://schemas.microsoft.com/office/word/2024/wordml/sdtformatlock" xmlns:w16se="http://schemas.microsoft.com/office/word/2015/wordml/symex" xmlns:wpg="http://schemas.microsoft.com/office/word/2010/wordprocessingGroup" xmlns:wpi="http://schemas.microsoft.com/office/word/2010/wordprocessingInk" xmlns:wne="http://schemas.microsoft.com/office/word/2006/wordml" xmlns:wps="http://schemas.microsoft.com/office/word/2010/wordprocessingShape" mc:Ignorable="w14 w15 w16se w16cid w16 w16cex w16sdtdh w16sdtfl w16du wp14">
+  <w:endnote w:type="separator" w:id="-1">
+    <w:p>
+      <w:r>
+        <w:separator/>
+      </w:r>
+    </w:p>
+  </w:endnote>
+  <w:endnote w:type="continuationSeparator" w:id="0">
+    <w:p>
+      <w:r>
+        <w:continuationSeparator/>
+      </w:r>
+    </w:p>
+  </w:endnote>
+</w:endnotes>
+</file>
+
 <file path=word/footer1.xml><?xml version="1.0" encoding="utf-8"?>
 <w:ftr xmlns:wpc="http://schemas.microsoft.com/office/word/2010/wordprocessingCanvas" xmlns:cx="http://schemas.microsoft.com/office/drawing/2014/chartex" xmlns:cx1="http://schemas.microsoft.com/office/drawing/2015/9/8/chartex" xmlns:cx2="http://schemas.microsoft.com/office/drawing/2015/10/21/chartex" xmlns:cx3="http://schemas.microsoft.com/office/drawing/2016/5/9/chartex" xmlns:cx4="http://schemas.microsoft.com/office/drawing/2016/5/10/chartex" xmlns:cx5="http://schemas.microsoft.com/office/drawing/2016/5/11/chartex" xmlns:cx6="http://schemas.microsoft.com/office/drawing/2016/5/12/chartex" xmlns:cx7="http://schemas.microsoft.com/office/drawing/2016/5/13/chartex" xmlns:cx8="http://schemas.microsoft.com/office/drawing/2016/5/14/chartex" xmlns:mc="http://schemas.openxmlformats.org/markup-compatibility/2006" xmlns:aink="http://schemas.microsoft.com/office/drawing/2016/ink" xmlns:am3d="http://schemas.microsoft.com/office/drawing/2017/model3d" xmlns:o="urn:schemas-microsoft-com:office:office" xmlns:oel="http://schemas.microsoft.com/office/2019/extlst" xmlns:r="http://schemas.openxmlformats.org/officeDocument/2006/relationships" xmlns:m="http://schemas.openxmlformats.org/officeDocument/2006/math" xmlns:v="urn:schemas-microsoft-com:vml" xmlns:wp14="http://schemas.microsoft.com/office/word/2010/wordprocessingDrawing" xmlns:wp="http://schemas.openxmlformats.org/drawingml/2006/wordprocessingDrawing" xmlns:w10="urn:schemas-microsoft-com:office:word" xmlns:w="http://schemas.openxmlformats.org/wordprocessingml/2006/main" xmlns:w14="http://schemas.microsoft.com/office/word/2010/wordml" xmlns:w15="http://schemas.microsoft.com/office/word/2012/wordml" xmlns:w16cex="http://schemas.microsoft.com/office/word/2018/wordml/cex" xmlns:w16cid="http://schemas.microsoft.com/office/word/2016/wordml/cid" xmlns:w16="http://schemas.microsoft.com/office/word/2018/wordml" xmlns:w16du="http://schemas.microsoft.com/office/word/2023/wordml/word16du" xmlns:w16sdtdh="http://schemas.microsoft.com/office/word/2020/wordml/sdtdatahash" xmlns:w16sdtfl="http://schemas.microsoft.com/office/word/2024/wordml/sdtformatlock" xmlns:w16se="http://schemas.microsoft.com/office/word/2015/wordml/symex" xmlns:wpg="http://schemas.microsoft.com/office/word/2010/wordprocessingGroup" xmlns:wpi="http://schemas.microsoft.com/office/word/2010/wordprocessingInk" xmlns:wne="http://schemas.microsoft.com/office/word/2006/wordml" xmlns:wps="http://schemas.microsoft.com/office/word/2010/wordprocessingShape" mc:Ignorable="w14 w15 w16se w16cid w16 w16cex w16sdtdh w16sdtfl w16du wp14">
   <w:p>
@@ -1051,10 +1413,16 @@
       <mc:AlternateContent>
         <mc:Choice Requires="wps">
           <w:drawing>
-            <wp:inline distT="0" distB="0" distL="0" distR="0" wp14:anchorId="4ED15347" wp14:editId="4F74BB56">
+            <wp:inline distT="0" distB="0" distL="0" distR="0" wp14:anchorId="12C69DC0" wp14:editId="689E8D76">
               <wp:extent cx="6855460" cy="806450"/>
               <wp:effectExtent l="0" t="0" r="21590" b="12700"/>
-              <wp:docPr id="395233668" name="Rounded Rectangle 6"/>
+              <wp:docPr id="395233668" name="Rounded Rectangle 6">
+                <a:extLst xmlns:a="http://schemas.openxmlformats.org/drawingml/2006/main">
+                  <a:ext uri="{FF2B5EF4-FFF2-40B4-BE49-F238E27FC236}">
+                    <a16:creationId xmlns:a16="http://schemas.microsoft.com/office/drawing/2014/main" id="{E94739E4-82AF-4AA2-9061-5A0236EBCC02}"/>
+                  </a:ext>
+                </a:extLst>
+              </wp:docPr>
               <wp:cNvGraphicFramePr/>
               <a:graphic xmlns:a="http://schemas.openxmlformats.org/drawingml/2006/main">
                 <a:graphicData uri="http://schemas.microsoft.com/office/word/2010/wordprocessingShape">
@@ -1123,7 +1491,7 @@
         </mc:Choice>
         <mc:Fallback>
           <w:pict>
-            <v:roundrect w14:anchorId="4ED15347" id="Rounded Rectangle 6" o:spid="_x0000_s1026" style="width:539.8pt;height:63.5pt;visibility:visible;mso-wrap-style:square;mso-left-percent:-10001;mso-top-percent:-10001;mso-position-horizontal:absolute;mso-position-horizontal-relative:char;mso-position-vertical:absolute;mso-position-vertical-relative:line;mso-left-percent:-10001;mso-top-percent:-10001;v-text-anchor:middle" arcsize="10923f" o:gfxdata="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" fillcolor="#f2f2f2" strokecolor="#bfbfbf" strokeweight=".18mm">
+            <v:roundrect w14:anchorId="12C69DC0" id="Rounded Rectangle 6" o:spid="_x0000_s1026" style="width:539.8pt;height:63.5pt;visibility:visible;mso-wrap-style:square;mso-left-percent:-10001;mso-top-percent:-10001;mso-position-horizontal:absolute;mso-position-horizontal-relative:char;mso-position-vertical:absolute;mso-position-vertical-relative:line;mso-left-percent:-10001;mso-top-percent:-10001;v-text-anchor:middle" arcsize="10923f" o:gfxdata="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" fillcolor="#f2f2f2" strokecolor="#bfbfbf" strokeweight=".18mm">
               <v:stroke joinstyle="miter"/>
               <v:textbox inset="14.4pt,14.4pt,14.4pt,14.4pt">
                 <w:txbxContent>
@@ -1162,121 +1530,988 @@
     <w:pPr>
       <w:pStyle w:val="Footer"/>
     </w:pPr>
-    <w:r>
-      <w:rPr>
-        <w:noProof/>
-      </w:rPr>
-      <mc:AlternateContent>
-        <mc:Choice Requires="wps">
-          <w:drawing>
-            <wp:inline distT="0" distB="0" distL="0" distR="0" wp14:anchorId="01B42ADF" wp14:editId="77DD5864">
-              <wp:extent cx="6855460" cy="806450"/>
-              <wp:effectExtent l="0" t="0" r="21590" b="12700"/>
-              <wp:docPr id="1" name="Rounded Rectangle 6"/>
-              <wp:cNvGraphicFramePr/>
-              <a:graphic xmlns:a="http://schemas.openxmlformats.org/drawingml/2006/main">
-                <a:graphicData uri="http://schemas.microsoft.com/office/word/2010/wordprocessingShape">
-                  <wps:wsp>
-                    <wps:cNvSpPr/>
-                    <wps:spPr>
-                      <a:xfrm>
-                        <a:off x="0" y="0"/>
-                        <a:ext cx="6855460" cy="806450"/>
-                      </a:xfrm>
-                      <a:prstGeom prst="roundRect">
-                        <a:avLst>
-                          <a:gd name="adj" fmla="val 16667"/>
-                        </a:avLst>
-                      </a:prstGeom>
-                      <a:solidFill>
-                        <a:sysClr val="window" lastClr="FFFFFF">
-                          <a:lumMod val="95000"/>
-                        </a:sysClr>
-                      </a:solidFill>
-                      <a:ln w="6480" cap="flat" cmpd="sng" algn="ctr">
-                        <a:solidFill>
-                          <a:sysClr val="window" lastClr="FFFFFF">
-                            <a:lumMod val="75000"/>
-                          </a:sysClr>
-                        </a:solidFill>
-                        <a:prstDash val="solid"/>
-                        <a:miter lim="800000"/>
-                      </a:ln>
-                      <a:effectLst>
-                        <a:softEdge rad="0"/>
-                      </a:effectLst>
-                    </wps:spPr>
-                    <wps:txbx>
-                      <w:txbxContent>
-                        <w:p>
-                          <w:pPr>
-                            <w:rPr>
-                              <w:rFonts w:ascii="Arial" w:hAnsi="Arial" w:cs="Arial"/>
-                              <w:sz w:val="22"/>
-                            </w:rPr>
-                          </w:pPr>
-                          <w:r>
-                            <w:rPr>
-                              <w:rFonts w:ascii="Arial" w:hAnsi="Arial" w:cs="Arial"/>
-                              <w:color w:val="000000"/>
-                              <w:sz w:val="22"/>
-                            </w:rPr>
-                            <w:t xml:space="preserve">Find out more about what to do : </w:t>
-                          </w:r>
-                        </w:p>
-                        <w:p/>
-                      </w:txbxContent>
-                    </wps:txbx>
-                    <wps:bodyPr lIns="182880" tIns="182880" rIns="182880" bIns="182880" anchor="ctr">
-                      <a:prstTxWarp prst="textNoShape">
-                        <a:avLst/>
-                      </a:prstTxWarp>
-                      <a:noAutofit/>
-                    </wps:bodyPr>
-                  </wps:wsp>
-                </a:graphicData>
-              </a:graphic>
-            </wp:inline>
-          </w:drawing>
-        </mc:Choice>
-        <mc:Fallback>
-          <w:pict>
-            <v:roundrect w14:anchorId="01B42ADF" id="_x0000_s1027" style="width:539.8pt;height:63.5pt;visibility:visible;mso-wrap-style:square;mso-left-percent:-10001;mso-top-percent:-10001;mso-position-horizontal:absolute;mso-position-horizontal-relative:char;mso-position-vertical:absolute;mso-position-vertical-relative:line;mso-left-percent:-10001;mso-top-percent:-10001;v-text-anchor:middle" arcsize="10923f" o:gfxdata="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" fillcolor="#f2f2f2" strokecolor="#bfbfbf" strokeweight=".18mm">
-              <v:stroke joinstyle="miter"/>
-              <v:textbox inset="14.4pt,14.4pt,14.4pt,14.4pt">
-                <w:txbxContent>
-                  <w:p>
-                    <w:pPr>
-                      <w:rPr>
-                        <w:rFonts w:ascii="Arial" w:hAnsi="Arial" w:cs="Arial"/>
-                        <w:sz w:val="22"/>
-                      </w:rPr>
-                    </w:pPr>
-                    <w:r>
-                      <w:rPr>
-                        <w:rFonts w:ascii="Arial" w:hAnsi="Arial" w:cs="Arial"/>
-                        <w:color w:val="000000"/>
-                        <w:sz w:val="22"/>
-                      </w:rPr>
-                      <w:t xml:space="preserve">Find out more about what to do : </w:t>
-                    </w:r>
-                  </w:p>
-                  <w:p/>
-                </w:txbxContent>
-              </v:textbox>
-              <w10:anchorlock/>
-            </v:roundrect>
-          </w:pict>
-        </mc:Fallback>
-      </mc:AlternateContent>
-    </w:r>
   </w:p>
 </w:ftr>
+</file>
+
+<file path=word/footnotes.xml><?xml version="1.0" encoding="utf-8"?>
+<w:footnotes xmlns:wpc="http://schemas.microsoft.com/office/word/2010/wordprocessingCanvas" xmlns:cx="http://schemas.microsoft.com/office/drawing/2014/chartex" xmlns:cx1="http://schemas.microsoft.com/office/drawing/2015/9/8/chartex" xmlns:cx2="http://schemas.microsoft.com/office/drawing/2015/10/21/chartex" xmlns:cx3="http://schemas.microsoft.com/office/drawing/2016/5/9/chartex" xmlns:cx4="http://schemas.microsoft.com/office/drawing/2016/5/10/chartex" xmlns:cx5="http://schemas.microsoft.com/office/drawing/2016/5/11/chartex" xmlns:cx6="http://schemas.microsoft.com/office/drawing/2016/5/12/chartex" xmlns:cx7="http://schemas.microsoft.com/office/drawing/2016/5/13/chartex" xmlns:cx8="http://schemas.microsoft.com/office/drawing/2016/5/14/chartex" xmlns:mc="http://schemas.openxmlformats.org/markup-compatibility/2006" xmlns:aink="http://schemas.microsoft.com/office/drawing/2016/ink" xmlns:am3d="http://schemas.microsoft.com/office/drawing/2017/model3d" xmlns:o="urn:schemas-microsoft-com:office:office" xmlns:oel="http://schemas.microsoft.com/office/2019/extlst" xmlns:r="http://schemas.openxmlformats.org/officeDocument/2006/relationships" xmlns:m="http://schemas.openxmlformats.org/officeDocument/2006/math" xmlns:v="urn:schemas-microsoft-com:vml" xmlns:wp14="http://schemas.microsoft.com/office/word/2010/wordprocessingDrawing" xmlns:wp="http://schemas.openxmlformats.org/drawingml/2006/wordprocessingDrawing" xmlns:w10="urn:schemas-microsoft-com:office:word" xmlns:w="http://schemas.openxmlformats.org/wordprocessingml/2006/main" xmlns:w14="http://schemas.microsoft.com/office/word/2010/wordml" xmlns:w15="http://schemas.microsoft.com/office/word/2012/wordml" xmlns:w16cex="http://schemas.microsoft.com/office/word/2018/wordml/cex" xmlns:w16cid="http://schemas.microsoft.com/office/word/2016/wordml/cid" xmlns:w16="http://schemas.microsoft.com/office/word/2018/wordml" xmlns:w16du="http://schemas.microsoft.com/office/word/2023/wordml/word16du" xmlns:w16sdtdh="http://schemas.microsoft.com/office/word/2020/wordml/sdtdatahash" xmlns:w16sdtfl="http://schemas.microsoft.com/office/word/2024/wordml/sdtformatlock" xmlns:w16se="http://schemas.microsoft.com/office/word/2015/wordml/symex" xmlns:wpg="http://schemas.microsoft.com/office/word/2010/wordprocessingGroup" xmlns:wpi="http://schemas.microsoft.com/office/word/2010/wordprocessingInk" xmlns:wne="http://schemas.microsoft.com/office/word/2006/wordml" xmlns:wps="http://schemas.microsoft.com/office/word/2010/wordprocessingShape" mc:Ignorable="w14 w15 w16se w16cid w16 w16cex w16sdtdh w16sdtfl w16du wp14">
+  <w:footnote w:type="separator" w:id="-1">
+    <w:p>
+      <w:r>
+        <w:separator/>
+      </w:r>
+    </w:p>
+  </w:footnote>
+  <w:footnote w:type="continuationSeparator" w:id="0">
+    <w:p>
+      <w:r>
+        <w:continuationSeparator/>
+      </w:r>
+    </w:p>
+  </w:footnote>
+</w:footnotes>
 </file>
 
 <file path=word/numbering.xml><?xml version="1.0" encoding="utf-8"?>
 <w:numbering xmlns:wpc="http://schemas.microsoft.com/office/word/2010/wordprocessingCanvas" xmlns:cx="http://schemas.microsoft.com/office/drawing/2014/chartex" xmlns:cx1="http://schemas.microsoft.com/office/drawing/2015/9/8/chartex" xmlns:cx2="http://schemas.microsoft.com/office/drawing/2015/10/21/chartex" xmlns:cx3="http://schemas.microsoft.com/office/drawing/2016/5/9/chartex" xmlns:cx4="http://schemas.microsoft.com/office/drawing/2016/5/10/chartex" xmlns:cx5="http://schemas.microsoft.com/office/drawing/2016/5/11/chartex" xmlns:cx6="http://schemas.microsoft.com/office/drawing/2016/5/12/chartex" xmlns:cx7="http://schemas.microsoft.com/office/drawing/2016/5/13/chartex" xmlns:cx8="http://schemas.microsoft.com/office/drawing/2016/5/14/chartex" xmlns:mc="http://schemas.openxmlformats.org/markup-compatibility/2006" xmlns:aink="http://schemas.microsoft.com/office/drawing/2016/ink" xmlns:am3d="http://schemas.microsoft.com/office/drawing/2017/model3d" xmlns:o="urn:schemas-microsoft-com:office:office" xmlns:oel="http://schemas.microsoft.com/office/2019/extlst" xmlns:r="http://schemas.openxmlformats.org/officeDocument/2006/relationships" xmlns:m="http://schemas.openxmlformats.org/officeDocument/2006/math" xmlns:v="urn:schemas-microsoft-com:vml" xmlns:wp14="http://schemas.microsoft.com/office/word/2010/wordprocessingDrawing" xmlns:wp="http://schemas.openxmlformats.org/drawingml/2006/wordprocessingDrawing" xmlns:w10="urn:schemas-microsoft-com:office:word" xmlns:w="http://schemas.openxmlformats.org/wordprocessingml/2006/main" xmlns:w14="http://schemas.microsoft.com/office/word/2010/wordml" xmlns:w15="http://schemas.microsoft.com/office/word/2012/wordml" xmlns:w16cex="http://schemas.microsoft.com/office/word/2018/wordml/cex" xmlns:w16cid="http://schemas.microsoft.com/office/word/2016/wordml/cid" xmlns:w16="http://schemas.microsoft.com/office/word/2018/wordml" xmlns:w16du="http://schemas.microsoft.com/office/word/2023/wordml/word16du" xmlns:w16sdtdh="http://schemas.microsoft.com/office/word/2020/wordml/sdtdatahash" xmlns:w16sdtfl="http://schemas.microsoft.com/office/word/2024/wordml/sdtformatlock" xmlns:w16se="http://schemas.microsoft.com/office/word/2015/wordml/symex" xmlns:wpg="http://schemas.microsoft.com/office/word/2010/wordprocessingGroup" xmlns:wpi="http://schemas.microsoft.com/office/word/2010/wordprocessingInk" xmlns:wne="http://schemas.microsoft.com/office/word/2006/wordml" xmlns:wps="http://schemas.microsoft.com/office/word/2010/wordprocessingShape" mc:Ignorable="w14 w15 w16se w16cid w16 w16cex w16sdtdh w16sdtfl w16du wp14">
   <w:abstractNum w:abstractNumId="0" w15:restartNumberingAfterBreak="0">
+    <w:nsid w:val="07F1592B"/>
+    <w:multiLevelType w:val="hybridMultilevel"/>
+    <w:tmpl w:val="4504F7C8"/>
+    <w:lvl w:ilvl="0" w:tplc="52FCDE7E">
+      <w:numFmt w:val="bullet"/>
+      <w:lvlText w:val="-"/>
+      <w:lvlJc w:val="left"/>
+      <w:pPr>
+        <w:ind w:left="720" w:hanging="360"/>
+      </w:pPr>
+      <w:rPr>
+        <w:rFonts w:ascii="Arial" w:eastAsia="Times New Roman" w:hAnsi="Arial" w:cs="Arial" w:hint="default"/>
+      </w:rPr>
+    </w:lvl>
+    <w:lvl w:ilvl="1" w:tplc="04090003" w:tentative="1">
+      <w:start w:val="1"/>
+      <w:numFmt w:val="bullet"/>
+      <w:lvlText w:val="o"/>
+      <w:lvlJc w:val="left"/>
+      <w:pPr>
+        <w:ind w:left="1440" w:hanging="360"/>
+      </w:pPr>
+      <w:rPr>
+        <w:rFonts w:ascii="Courier New" w:hAnsi="Courier New" w:cs="Courier New" w:hint="default"/>
+      </w:rPr>
+    </w:lvl>
+    <w:lvl w:ilvl="2" w:tplc="04090005" w:tentative="1">
+      <w:start w:val="1"/>
+      <w:numFmt w:val="bullet"/>
+      <w:lvlText w:val=""/>
+      <w:lvlJc w:val="left"/>
+      <w:pPr>
+        <w:ind w:left="2160" w:hanging="360"/>
+      </w:pPr>
+      <w:rPr>
+        <w:rFonts w:ascii="Wingdings" w:hAnsi="Wingdings" w:hint="default"/>
+      </w:rPr>
+    </w:lvl>
+    <w:lvl w:ilvl="3" w:tplc="04090001" w:tentative="1">
+      <w:start w:val="1"/>
+      <w:numFmt w:val="bullet"/>
+      <w:lvlText w:val=""/>
+      <w:lvlJc w:val="left"/>
+      <w:pPr>
+        <w:ind w:left="2880" w:hanging="360"/>
+      </w:pPr>
+      <w:rPr>
+        <w:rFonts w:ascii="Symbol" w:hAnsi="Symbol" w:hint="default"/>
+      </w:rPr>
+    </w:lvl>
+    <w:lvl w:ilvl="4" w:tplc="04090003" w:tentative="1">
+      <w:start w:val="1"/>
+      <w:numFmt w:val="bullet"/>
+      <w:lvlText w:val="o"/>
+      <w:lvlJc w:val="left"/>
+      <w:pPr>
+        <w:ind w:left="3600" w:hanging="360"/>
+      </w:pPr>
+      <w:rPr>
+        <w:rFonts w:ascii="Courier New" w:hAnsi="Courier New" w:cs="Courier New" w:hint="default"/>
+      </w:rPr>
+    </w:lvl>
+    <w:lvl w:ilvl="5" w:tplc="04090005" w:tentative="1">
+      <w:start w:val="1"/>
+      <w:numFmt w:val="bullet"/>
+      <w:lvlText w:val=""/>
+      <w:lvlJc w:val="left"/>
+      <w:pPr>
+        <w:ind w:left="4320" w:hanging="360"/>
+      </w:pPr>
+      <w:rPr>
+        <w:rFonts w:ascii="Wingdings" w:hAnsi="Wingdings" w:hint="default"/>
+      </w:rPr>
+    </w:lvl>
+    <w:lvl w:ilvl="6" w:tplc="04090001" w:tentative="1">
+      <w:start w:val="1"/>
+      <w:numFmt w:val="bullet"/>
+      <w:lvlText w:val=""/>
+      <w:lvlJc w:val="left"/>
+      <w:pPr>
+        <w:ind w:left="5040" w:hanging="360"/>
+      </w:pPr>
+      <w:rPr>
+        <w:rFonts w:ascii="Symbol" w:hAnsi="Symbol" w:hint="default"/>
+      </w:rPr>
+    </w:lvl>
+    <w:lvl w:ilvl="7" w:tplc="04090003" w:tentative="1">
+      <w:start w:val="1"/>
+      <w:numFmt w:val="bullet"/>
+      <w:lvlText w:val="o"/>
+      <w:lvlJc w:val="left"/>
+      <w:pPr>
+        <w:ind w:left="5760" w:hanging="360"/>
+      </w:pPr>
+      <w:rPr>
+        <w:rFonts w:ascii="Courier New" w:hAnsi="Courier New" w:cs="Courier New" w:hint="default"/>
+      </w:rPr>
+    </w:lvl>
+    <w:lvl w:ilvl="8" w:tplc="04090005" w:tentative="1">
+      <w:start w:val="1"/>
+      <w:numFmt w:val="bullet"/>
+      <w:lvlText w:val=""/>
+      <w:lvlJc w:val="left"/>
+      <w:pPr>
+        <w:ind w:left="6480" w:hanging="360"/>
+      </w:pPr>
+      <w:rPr>
+        <w:rFonts w:ascii="Wingdings" w:hAnsi="Wingdings" w:hint="default"/>
+      </w:rPr>
+    </w:lvl>
+  </w:abstractNum>
+  <w:abstractNum w:abstractNumId="1" w15:restartNumberingAfterBreak="0">
+    <w:nsid w:val="0C623A4C"/>
+    <w:multiLevelType w:val="hybridMultilevel"/>
+    <w:tmpl w:val="B29EFA7A"/>
+    <w:lvl w:ilvl="0" w:tplc="FFFFFFFF">
+      <w:start w:val="1"/>
+      <w:numFmt w:val="decimal"/>
+      <w:lvlText w:val="%1)"/>
+      <w:lvlJc w:val="left"/>
+      <w:pPr>
+        <w:ind w:left="360" w:hanging="360"/>
+      </w:pPr>
+      <w:rPr>
+        <w:rFonts w:hint="default"/>
+      </w:rPr>
+    </w:lvl>
+    <w:lvl w:ilvl="1" w:tplc="04090017">
+      <w:start w:val="1"/>
+      <w:numFmt w:val="lowerLetter"/>
+      <w:lvlText w:val="%2)"/>
+      <w:lvlJc w:val="left"/>
+      <w:pPr>
+        <w:ind w:left="1080" w:hanging="360"/>
+      </w:pPr>
+    </w:lvl>
+    <w:lvl w:ilvl="2" w:tplc="FFFFFFFF" w:tentative="1">
+      <w:start w:val="1"/>
+      <w:numFmt w:val="lowerRoman"/>
+      <w:lvlText w:val="%3."/>
+      <w:lvlJc w:val="right"/>
+      <w:pPr>
+        <w:ind w:left="1800" w:hanging="180"/>
+      </w:pPr>
+    </w:lvl>
+    <w:lvl w:ilvl="3" w:tplc="FFFFFFFF" w:tentative="1">
+      <w:start w:val="1"/>
+      <w:numFmt w:val="decimal"/>
+      <w:lvlText w:val="%4."/>
+      <w:lvlJc w:val="left"/>
+      <w:pPr>
+        <w:ind w:left="2520" w:hanging="360"/>
+      </w:pPr>
+    </w:lvl>
+    <w:lvl w:ilvl="4" w:tplc="FFFFFFFF" w:tentative="1">
+      <w:start w:val="1"/>
+      <w:numFmt w:val="lowerLetter"/>
+      <w:lvlText w:val="%5."/>
+      <w:lvlJc w:val="left"/>
+      <w:pPr>
+        <w:ind w:left="3240" w:hanging="360"/>
+      </w:pPr>
+    </w:lvl>
+    <w:lvl w:ilvl="5" w:tplc="FFFFFFFF" w:tentative="1">
+      <w:start w:val="1"/>
+      <w:numFmt w:val="lowerRoman"/>
+      <w:lvlText w:val="%6."/>
+      <w:lvlJc w:val="right"/>
+      <w:pPr>
+        <w:ind w:left="3960" w:hanging="180"/>
+      </w:pPr>
+    </w:lvl>
+    <w:lvl w:ilvl="6" w:tplc="FFFFFFFF" w:tentative="1">
+      <w:start w:val="1"/>
+      <w:numFmt w:val="decimal"/>
+      <w:lvlText w:val="%7."/>
+      <w:lvlJc w:val="left"/>
+      <w:pPr>
+        <w:ind w:left="4680" w:hanging="360"/>
+      </w:pPr>
+    </w:lvl>
+    <w:lvl w:ilvl="7" w:tplc="FFFFFFFF" w:tentative="1">
+      <w:start w:val="1"/>
+      <w:numFmt w:val="lowerLetter"/>
+      <w:lvlText w:val="%8."/>
+      <w:lvlJc w:val="left"/>
+      <w:pPr>
+        <w:ind w:left="5400" w:hanging="360"/>
+      </w:pPr>
+    </w:lvl>
+    <w:lvl w:ilvl="8" w:tplc="FFFFFFFF" w:tentative="1">
+      <w:start w:val="1"/>
+      <w:numFmt w:val="lowerRoman"/>
+      <w:lvlText w:val="%9."/>
+      <w:lvlJc w:val="right"/>
+      <w:pPr>
+        <w:ind w:left="6120" w:hanging="180"/>
+      </w:pPr>
+    </w:lvl>
+  </w:abstractNum>
+  <w:abstractNum w:abstractNumId="2" w15:restartNumberingAfterBreak="0">
+    <w:nsid w:val="20E81A46"/>
+    <w:multiLevelType w:val="hybridMultilevel"/>
+    <w:tmpl w:val="4E662BEC"/>
+    <w:lvl w:ilvl="0" w:tplc="D930AC82">
+      <w:numFmt w:val="bullet"/>
+      <w:lvlText w:val="-"/>
+      <w:lvlJc w:val="left"/>
+      <w:pPr>
+        <w:ind w:left="1530" w:hanging="360"/>
+      </w:pPr>
+      <w:rPr>
+        <w:rFonts w:ascii="Times New Roman" w:eastAsiaTheme="minorHAnsi" w:hAnsi="Times New Roman" w:cs="Times New Roman" w:hint="default"/>
+      </w:rPr>
+    </w:lvl>
+    <w:lvl w:ilvl="1" w:tplc="04090003" w:tentative="1">
+      <w:start w:val="1"/>
+      <w:numFmt w:val="bullet"/>
+      <w:lvlText w:val="o"/>
+      <w:lvlJc w:val="left"/>
+      <w:pPr>
+        <w:ind w:left="1800" w:hanging="360"/>
+      </w:pPr>
+      <w:rPr>
+        <w:rFonts w:ascii="Courier New" w:hAnsi="Courier New" w:cs="Courier New" w:hint="default"/>
+      </w:rPr>
+    </w:lvl>
+    <w:lvl w:ilvl="2" w:tplc="04090005" w:tentative="1">
+      <w:start w:val="1"/>
+      <w:numFmt w:val="bullet"/>
+      <w:lvlText w:val=""/>
+      <w:lvlJc w:val="left"/>
+      <w:pPr>
+        <w:ind w:left="2520" w:hanging="360"/>
+      </w:pPr>
+      <w:rPr>
+        <w:rFonts w:ascii="Wingdings" w:hAnsi="Wingdings" w:hint="default"/>
+      </w:rPr>
+    </w:lvl>
+    <w:lvl w:ilvl="3" w:tplc="04090001" w:tentative="1">
+      <w:start w:val="1"/>
+      <w:numFmt w:val="bullet"/>
+      <w:lvlText w:val=""/>
+      <w:lvlJc w:val="left"/>
+      <w:pPr>
+        <w:ind w:left="3240" w:hanging="360"/>
+      </w:pPr>
+      <w:rPr>
+        <w:rFonts w:ascii="Symbol" w:hAnsi="Symbol" w:hint="default"/>
+      </w:rPr>
+    </w:lvl>
+    <w:lvl w:ilvl="4" w:tplc="04090003" w:tentative="1">
+      <w:start w:val="1"/>
+      <w:numFmt w:val="bullet"/>
+      <w:lvlText w:val="o"/>
+      <w:lvlJc w:val="left"/>
+      <w:pPr>
+        <w:ind w:left="3960" w:hanging="360"/>
+      </w:pPr>
+      <w:rPr>
+        <w:rFonts w:ascii="Courier New" w:hAnsi="Courier New" w:cs="Courier New" w:hint="default"/>
+      </w:rPr>
+    </w:lvl>
+    <w:lvl w:ilvl="5" w:tplc="04090005" w:tentative="1">
+      <w:start w:val="1"/>
+      <w:numFmt w:val="bullet"/>
+      <w:lvlText w:val=""/>
+      <w:lvlJc w:val="left"/>
+      <w:pPr>
+        <w:ind w:left="4680" w:hanging="360"/>
+      </w:pPr>
+      <w:rPr>
+        <w:rFonts w:ascii="Wingdings" w:hAnsi="Wingdings" w:hint="default"/>
+      </w:rPr>
+    </w:lvl>
+    <w:lvl w:ilvl="6" w:tplc="04090001" w:tentative="1">
+      <w:start w:val="1"/>
+      <w:numFmt w:val="bullet"/>
+      <w:lvlText w:val=""/>
+      <w:lvlJc w:val="left"/>
+      <w:pPr>
+        <w:ind w:left="5400" w:hanging="360"/>
+      </w:pPr>
+      <w:rPr>
+        <w:rFonts w:ascii="Symbol" w:hAnsi="Symbol" w:hint="default"/>
+      </w:rPr>
+    </w:lvl>
+    <w:lvl w:ilvl="7" w:tplc="04090003" w:tentative="1">
+      <w:start w:val="1"/>
+      <w:numFmt w:val="bullet"/>
+      <w:lvlText w:val="o"/>
+      <w:lvlJc w:val="left"/>
+      <w:pPr>
+        <w:ind w:left="6120" w:hanging="360"/>
+      </w:pPr>
+      <w:rPr>
+        <w:rFonts w:ascii="Courier New" w:hAnsi="Courier New" w:cs="Courier New" w:hint="default"/>
+      </w:rPr>
+    </w:lvl>
+    <w:lvl w:ilvl="8" w:tplc="04090005" w:tentative="1">
+      <w:start w:val="1"/>
+      <w:numFmt w:val="bullet"/>
+      <w:lvlText w:val=""/>
+      <w:lvlJc w:val="left"/>
+      <w:pPr>
+        <w:ind w:left="6840" w:hanging="360"/>
+      </w:pPr>
+      <w:rPr>
+        <w:rFonts w:ascii="Wingdings" w:hAnsi="Wingdings" w:hint="default"/>
+      </w:rPr>
+    </w:lvl>
+  </w:abstractNum>
+  <w:abstractNum w:abstractNumId="3" w15:restartNumberingAfterBreak="0">
+    <w:nsid w:val="499D4C36"/>
+    <w:multiLevelType w:val="multilevel"/>
+    <w:tmpl w:val="CD502C96"/>
+    <w:lvl w:ilvl="0">
+      <w:start w:val="1"/>
+      <w:numFmt w:val="decimal"/>
+      <w:lvlText w:val="%1."/>
+      <w:lvlJc w:val="left"/>
+      <w:pPr>
+        <w:tabs>
+          <w:tab w:val="num" w:pos="0"/>
+        </w:tabs>
+        <w:ind w:left="360" w:hanging="360"/>
+      </w:pPr>
+      <w:rPr>
+        <w:b/>
+        <w:bCs w:val="0"/>
+        <w:i w:val="0"/>
+        <w:color w:val="000000"/>
+        <w:sz w:val="20"/>
+        <w:u w:val="none"/>
+      </w:rPr>
+    </w:lvl>
+    <w:lvl w:ilvl="1">
+      <w:start w:val="1"/>
+      <w:numFmt w:val="bullet"/>
+      <w:lvlText w:val=""/>
+      <w:lvlJc w:val="left"/>
+      <w:pPr>
+        <w:tabs>
+          <w:tab w:val="num" w:pos="0"/>
+        </w:tabs>
+        <w:ind w:left="1440" w:hanging="360"/>
+      </w:pPr>
+      <w:rPr>
+        <w:rFonts w:ascii="Wingdings 2" w:hAnsi="Wingdings 2" w:cs="Wingdings 2" w:hint="default"/>
+      </w:rPr>
+    </w:lvl>
+    <w:lvl w:ilvl="2">
+      <w:start w:val="1"/>
+      <w:numFmt w:val="lowerRoman"/>
+      <w:lvlText w:val="%3."/>
+      <w:lvlJc w:val="right"/>
+      <w:pPr>
+        <w:tabs>
+          <w:tab w:val="num" w:pos="0"/>
+        </w:tabs>
+        <w:ind w:left="2160" w:hanging="360"/>
+      </w:pPr>
+      <w:rPr>
+        <w:u w:val="none"/>
+      </w:rPr>
+    </w:lvl>
+    <w:lvl w:ilvl="3">
+      <w:start w:val="1"/>
+      <w:numFmt w:val="decimal"/>
+      <w:lvlText w:val="%4."/>
+      <w:lvlJc w:val="left"/>
+      <w:pPr>
+        <w:tabs>
+          <w:tab w:val="num" w:pos="0"/>
+        </w:tabs>
+        <w:ind w:left="2880" w:hanging="360"/>
+      </w:pPr>
+      <w:rPr>
+        <w:u w:val="none"/>
+      </w:rPr>
+    </w:lvl>
+    <w:lvl w:ilvl="4">
+      <w:start w:val="1"/>
+      <w:numFmt w:val="lowerLetter"/>
+      <w:lvlText w:val="%5."/>
+      <w:lvlJc w:val="left"/>
+      <w:pPr>
+        <w:tabs>
+          <w:tab w:val="num" w:pos="0"/>
+        </w:tabs>
+        <w:ind w:left="3600" w:hanging="360"/>
+      </w:pPr>
+      <w:rPr>
+        <w:u w:val="none"/>
+      </w:rPr>
+    </w:lvl>
+    <w:lvl w:ilvl="5">
+      <w:start w:val="1"/>
+      <w:numFmt w:val="lowerRoman"/>
+      <w:lvlText w:val="%6."/>
+      <w:lvlJc w:val="right"/>
+      <w:pPr>
+        <w:tabs>
+          <w:tab w:val="num" w:pos="0"/>
+        </w:tabs>
+        <w:ind w:left="4320" w:hanging="360"/>
+      </w:pPr>
+      <w:rPr>
+        <w:u w:val="none"/>
+      </w:rPr>
+    </w:lvl>
+    <w:lvl w:ilvl="6">
+      <w:start w:val="1"/>
+      <w:numFmt w:val="decimal"/>
+      <w:lvlText w:val="%7."/>
+      <w:lvlJc w:val="left"/>
+      <w:pPr>
+        <w:tabs>
+          <w:tab w:val="num" w:pos="0"/>
+        </w:tabs>
+        <w:ind w:left="5040" w:hanging="360"/>
+      </w:pPr>
+      <w:rPr>
+        <w:u w:val="none"/>
+      </w:rPr>
+    </w:lvl>
+    <w:lvl w:ilvl="7">
+      <w:start w:val="1"/>
+      <w:numFmt w:val="lowerLetter"/>
+      <w:lvlText w:val="%8."/>
+      <w:lvlJc w:val="left"/>
+      <w:pPr>
+        <w:tabs>
+          <w:tab w:val="num" w:pos="0"/>
+        </w:tabs>
+        <w:ind w:left="5760" w:hanging="360"/>
+      </w:pPr>
+      <w:rPr>
+        <w:u w:val="none"/>
+      </w:rPr>
+    </w:lvl>
+    <w:lvl w:ilvl="8">
+      <w:start w:val="1"/>
+      <w:numFmt w:val="lowerRoman"/>
+      <w:lvlText w:val="%9."/>
+      <w:lvlJc w:val="right"/>
+      <w:pPr>
+        <w:tabs>
+          <w:tab w:val="num" w:pos="0"/>
+        </w:tabs>
+        <w:ind w:left="6480" w:hanging="360"/>
+      </w:pPr>
+      <w:rPr>
+        <w:u w:val="none"/>
+      </w:rPr>
+    </w:lvl>
+  </w:abstractNum>
+  <w:abstractNum w:abstractNumId="4" w15:restartNumberingAfterBreak="0">
+    <w:nsid w:val="4E0E2B6D"/>
+    <w:multiLevelType w:val="hybridMultilevel"/>
+    <w:tmpl w:val="9216F4D4"/>
+    <w:lvl w:ilvl="0" w:tplc="0409000F">
+      <w:start w:val="1"/>
+      <w:numFmt w:val="decimal"/>
+      <w:lvlText w:val="%1."/>
+      <w:lvlJc w:val="left"/>
+      <w:pPr>
+        <w:ind w:left="360" w:hanging="360"/>
+      </w:pPr>
+      <w:rPr>
+        <w:rFonts w:hint="default"/>
+      </w:rPr>
+    </w:lvl>
+    <w:lvl w:ilvl="1" w:tplc="04090019" w:tentative="1">
+      <w:start w:val="1"/>
+      <w:numFmt w:val="lowerLetter"/>
+      <w:lvlText w:val="%2."/>
+      <w:lvlJc w:val="left"/>
+      <w:pPr>
+        <w:ind w:left="1440" w:hanging="360"/>
+      </w:pPr>
+    </w:lvl>
+    <w:lvl w:ilvl="2" w:tplc="0409001B" w:tentative="1">
+      <w:start w:val="1"/>
+      <w:numFmt w:val="lowerRoman"/>
+      <w:lvlText w:val="%3."/>
+      <w:lvlJc w:val="right"/>
+      <w:pPr>
+        <w:ind w:left="2160" w:hanging="180"/>
+      </w:pPr>
+    </w:lvl>
+    <w:lvl w:ilvl="3" w:tplc="0409000F" w:tentative="1">
+      <w:start w:val="1"/>
+      <w:numFmt w:val="decimal"/>
+      <w:lvlText w:val="%4."/>
+      <w:lvlJc w:val="left"/>
+      <w:pPr>
+        <w:ind w:left="2880" w:hanging="360"/>
+      </w:pPr>
+    </w:lvl>
+    <w:lvl w:ilvl="4" w:tplc="04090019" w:tentative="1">
+      <w:start w:val="1"/>
+      <w:numFmt w:val="lowerLetter"/>
+      <w:lvlText w:val="%5."/>
+      <w:lvlJc w:val="left"/>
+      <w:pPr>
+        <w:ind w:left="3600" w:hanging="360"/>
+      </w:pPr>
+    </w:lvl>
+    <w:lvl w:ilvl="5" w:tplc="0409001B" w:tentative="1">
+      <w:start w:val="1"/>
+      <w:numFmt w:val="lowerRoman"/>
+      <w:lvlText w:val="%6."/>
+      <w:lvlJc w:val="right"/>
+      <w:pPr>
+        <w:ind w:left="4320" w:hanging="180"/>
+      </w:pPr>
+    </w:lvl>
+    <w:lvl w:ilvl="6" w:tplc="0409000F" w:tentative="1">
+      <w:start w:val="1"/>
+      <w:numFmt w:val="decimal"/>
+      <w:lvlText w:val="%7."/>
+      <w:lvlJc w:val="left"/>
+      <w:pPr>
+        <w:ind w:left="5040" w:hanging="360"/>
+      </w:pPr>
+    </w:lvl>
+    <w:lvl w:ilvl="7" w:tplc="04090019" w:tentative="1">
+      <w:start w:val="1"/>
+      <w:numFmt w:val="lowerLetter"/>
+      <w:lvlText w:val="%8."/>
+      <w:lvlJc w:val="left"/>
+      <w:pPr>
+        <w:ind w:left="5760" w:hanging="360"/>
+      </w:pPr>
+    </w:lvl>
+    <w:lvl w:ilvl="8" w:tplc="0409001B" w:tentative="1">
+      <w:start w:val="1"/>
+      <w:numFmt w:val="lowerRoman"/>
+      <w:lvlText w:val="%9."/>
+      <w:lvlJc w:val="right"/>
+      <w:pPr>
+        <w:ind w:left="6480" w:hanging="180"/>
+      </w:pPr>
+    </w:lvl>
+  </w:abstractNum>
+  <w:abstractNum w:abstractNumId="5" w15:restartNumberingAfterBreak="0">
+    <w:nsid w:val="56AF4AF1"/>
+    <w:multiLevelType w:val="hybridMultilevel"/>
+    <w:tmpl w:val="968E4224"/>
+    <w:lvl w:ilvl="0" w:tplc="04090011">
+      <w:start w:val="1"/>
+      <w:numFmt w:val="decimal"/>
+      <w:lvlText w:val="%1)"/>
+      <w:lvlJc w:val="left"/>
+      <w:pPr>
+        <w:ind w:left="360" w:hanging="360"/>
+      </w:pPr>
+      <w:rPr>
+        <w:rFonts w:hint="default"/>
+      </w:rPr>
+    </w:lvl>
+    <w:lvl w:ilvl="1" w:tplc="04090019" w:tentative="1">
+      <w:start w:val="1"/>
+      <w:numFmt w:val="lowerLetter"/>
+      <w:lvlText w:val="%2."/>
+      <w:lvlJc w:val="left"/>
+      <w:pPr>
+        <w:ind w:left="1080" w:hanging="360"/>
+      </w:pPr>
+    </w:lvl>
+    <w:lvl w:ilvl="2" w:tplc="0409001B" w:tentative="1">
+      <w:start w:val="1"/>
+      <w:numFmt w:val="lowerRoman"/>
+      <w:lvlText w:val="%3."/>
+      <w:lvlJc w:val="right"/>
+      <w:pPr>
+        <w:ind w:left="1800" w:hanging="180"/>
+      </w:pPr>
+    </w:lvl>
+    <w:lvl w:ilvl="3" w:tplc="0409000F" w:tentative="1">
+      <w:start w:val="1"/>
+      <w:numFmt w:val="decimal"/>
+      <w:lvlText w:val="%4."/>
+      <w:lvlJc w:val="left"/>
+      <w:pPr>
+        <w:ind w:left="2520" w:hanging="360"/>
+      </w:pPr>
+    </w:lvl>
+    <w:lvl w:ilvl="4" w:tplc="04090019" w:tentative="1">
+      <w:start w:val="1"/>
+      <w:numFmt w:val="lowerLetter"/>
+      <w:lvlText w:val="%5."/>
+      <w:lvlJc w:val="left"/>
+      <w:pPr>
+        <w:ind w:left="3240" w:hanging="360"/>
+      </w:pPr>
+    </w:lvl>
+    <w:lvl w:ilvl="5" w:tplc="0409001B" w:tentative="1">
+      <w:start w:val="1"/>
+      <w:numFmt w:val="lowerRoman"/>
+      <w:lvlText w:val="%6."/>
+      <w:lvlJc w:val="right"/>
+      <w:pPr>
+        <w:ind w:left="3960" w:hanging="180"/>
+      </w:pPr>
+    </w:lvl>
+    <w:lvl w:ilvl="6" w:tplc="0409000F" w:tentative="1">
+      <w:start w:val="1"/>
+      <w:numFmt w:val="decimal"/>
+      <w:lvlText w:val="%7."/>
+      <w:lvlJc w:val="left"/>
+      <w:pPr>
+        <w:ind w:left="4680" w:hanging="360"/>
+      </w:pPr>
+    </w:lvl>
+    <w:lvl w:ilvl="7" w:tplc="04090019" w:tentative="1">
+      <w:start w:val="1"/>
+      <w:numFmt w:val="lowerLetter"/>
+      <w:lvlText w:val="%8."/>
+      <w:lvlJc w:val="left"/>
+      <w:pPr>
+        <w:ind w:left="5400" w:hanging="360"/>
+      </w:pPr>
+    </w:lvl>
+    <w:lvl w:ilvl="8" w:tplc="0409001B" w:tentative="1">
+      <w:start w:val="1"/>
+      <w:numFmt w:val="lowerRoman"/>
+      <w:lvlText w:val="%9."/>
+      <w:lvlJc w:val="right"/>
+      <w:pPr>
+        <w:ind w:left="6120" w:hanging="180"/>
+      </w:pPr>
+    </w:lvl>
+  </w:abstractNum>
+  <w:abstractNum w:abstractNumId="6" w15:restartNumberingAfterBreak="0">
+    <w:nsid w:val="5DB122E3"/>
+    <w:multiLevelType w:val="hybridMultilevel"/>
+    <w:tmpl w:val="70585A66"/>
+    <w:lvl w:ilvl="0" w:tplc="D930AC82">
+      <w:numFmt w:val="bullet"/>
+      <w:lvlText w:val="-"/>
+      <w:lvlJc w:val="left"/>
+      <w:pPr>
+        <w:ind w:left="1170" w:hanging="360"/>
+      </w:pPr>
+      <w:rPr>
+        <w:rFonts w:ascii="Times New Roman" w:eastAsiaTheme="minorHAnsi" w:hAnsi="Times New Roman" w:cs="Times New Roman" w:hint="default"/>
+      </w:rPr>
+    </w:lvl>
+    <w:lvl w:ilvl="1" w:tplc="04090003" w:tentative="1">
+      <w:start w:val="1"/>
+      <w:numFmt w:val="bullet"/>
+      <w:lvlText w:val="o"/>
+      <w:lvlJc w:val="left"/>
+      <w:pPr>
+        <w:ind w:left="1890" w:hanging="360"/>
+      </w:pPr>
+      <w:rPr>
+        <w:rFonts w:ascii="Courier New" w:hAnsi="Courier New" w:cs="Courier New" w:hint="default"/>
+      </w:rPr>
+    </w:lvl>
+    <w:lvl w:ilvl="2" w:tplc="04090005" w:tentative="1">
+      <w:start w:val="1"/>
+      <w:numFmt w:val="bullet"/>
+      <w:lvlText w:val=""/>
+      <w:lvlJc w:val="left"/>
+      <w:pPr>
+        <w:ind w:left="2610" w:hanging="360"/>
+      </w:pPr>
+      <w:rPr>
+        <w:rFonts w:ascii="Wingdings" w:hAnsi="Wingdings" w:hint="default"/>
+      </w:rPr>
+    </w:lvl>
+    <w:lvl w:ilvl="3" w:tplc="04090001" w:tentative="1">
+      <w:start w:val="1"/>
+      <w:numFmt w:val="bullet"/>
+      <w:lvlText w:val=""/>
+      <w:lvlJc w:val="left"/>
+      <w:pPr>
+        <w:ind w:left="3330" w:hanging="360"/>
+      </w:pPr>
+      <w:rPr>
+        <w:rFonts w:ascii="Symbol" w:hAnsi="Symbol" w:hint="default"/>
+      </w:rPr>
+    </w:lvl>
+    <w:lvl w:ilvl="4" w:tplc="04090003" w:tentative="1">
+      <w:start w:val="1"/>
+      <w:numFmt w:val="bullet"/>
+      <w:lvlText w:val="o"/>
+      <w:lvlJc w:val="left"/>
+      <w:pPr>
+        <w:ind w:left="4050" w:hanging="360"/>
+      </w:pPr>
+      <w:rPr>
+        <w:rFonts w:ascii="Courier New" w:hAnsi="Courier New" w:cs="Courier New" w:hint="default"/>
+      </w:rPr>
+    </w:lvl>
+    <w:lvl w:ilvl="5" w:tplc="04090005" w:tentative="1">
+      <w:start w:val="1"/>
+      <w:numFmt w:val="bullet"/>
+      <w:lvlText w:val=""/>
+      <w:lvlJc w:val="left"/>
+      <w:pPr>
+        <w:ind w:left="4770" w:hanging="360"/>
+      </w:pPr>
+      <w:rPr>
+        <w:rFonts w:ascii="Wingdings" w:hAnsi="Wingdings" w:hint="default"/>
+      </w:rPr>
+    </w:lvl>
+    <w:lvl w:ilvl="6" w:tplc="04090001" w:tentative="1">
+      <w:start w:val="1"/>
+      <w:numFmt w:val="bullet"/>
+      <w:lvlText w:val=""/>
+      <w:lvlJc w:val="left"/>
+      <w:pPr>
+        <w:ind w:left="5490" w:hanging="360"/>
+      </w:pPr>
+      <w:rPr>
+        <w:rFonts w:ascii="Symbol" w:hAnsi="Symbol" w:hint="default"/>
+      </w:rPr>
+    </w:lvl>
+    <w:lvl w:ilvl="7" w:tplc="04090003" w:tentative="1">
+      <w:start w:val="1"/>
+      <w:numFmt w:val="bullet"/>
+      <w:lvlText w:val="o"/>
+      <w:lvlJc w:val="left"/>
+      <w:pPr>
+        <w:ind w:left="6210" w:hanging="360"/>
+      </w:pPr>
+      <w:rPr>
+        <w:rFonts w:ascii="Courier New" w:hAnsi="Courier New" w:cs="Courier New" w:hint="default"/>
+      </w:rPr>
+    </w:lvl>
+    <w:lvl w:ilvl="8" w:tplc="04090005" w:tentative="1">
+      <w:start w:val="1"/>
+      <w:numFmt w:val="bullet"/>
+      <w:lvlText w:val=""/>
+      <w:lvlJc w:val="left"/>
+      <w:pPr>
+        <w:ind w:left="6930" w:hanging="360"/>
+      </w:pPr>
+      <w:rPr>
+        <w:rFonts w:ascii="Wingdings" w:hAnsi="Wingdings" w:hint="default"/>
+      </w:rPr>
+    </w:lvl>
+  </w:abstractNum>
+  <w:abstractNum w:abstractNumId="7" w15:restartNumberingAfterBreak="0">
+    <w:nsid w:val="6BBC63F2"/>
+    <w:multiLevelType w:val="hybridMultilevel"/>
+    <w:tmpl w:val="AF6EA2C6"/>
+    <w:lvl w:ilvl="0" w:tplc="04090011">
+      <w:start w:val="1"/>
+      <w:numFmt w:val="decimal"/>
+      <w:lvlText w:val="%1)"/>
+      <w:lvlJc w:val="left"/>
+      <w:pPr>
+        <w:ind w:left="360" w:hanging="360"/>
+      </w:pPr>
+      <w:rPr>
+        <w:rFonts w:hint="default"/>
+      </w:rPr>
+    </w:lvl>
+    <w:lvl w:ilvl="1" w:tplc="04090019">
+      <w:start w:val="1"/>
+      <w:numFmt w:val="lowerLetter"/>
+      <w:lvlText w:val="%2."/>
+      <w:lvlJc w:val="left"/>
+      <w:pPr>
+        <w:ind w:left="1080" w:hanging="360"/>
+      </w:pPr>
+    </w:lvl>
+    <w:lvl w:ilvl="2" w:tplc="0409001B" w:tentative="1">
+      <w:start w:val="1"/>
+      <w:numFmt w:val="lowerRoman"/>
+      <w:lvlText w:val="%3."/>
+      <w:lvlJc w:val="right"/>
+      <w:pPr>
+        <w:ind w:left="1800" w:hanging="180"/>
+      </w:pPr>
+    </w:lvl>
+    <w:lvl w:ilvl="3" w:tplc="0409000F" w:tentative="1">
+      <w:start w:val="1"/>
+      <w:numFmt w:val="decimal"/>
+      <w:lvlText w:val="%4."/>
+      <w:lvlJc w:val="left"/>
+      <w:pPr>
+        <w:ind w:left="2520" w:hanging="360"/>
+      </w:pPr>
+    </w:lvl>
+    <w:lvl w:ilvl="4" w:tplc="04090019" w:tentative="1">
+      <w:start w:val="1"/>
+      <w:numFmt w:val="lowerLetter"/>
+      <w:lvlText w:val="%5."/>
+      <w:lvlJc w:val="left"/>
+      <w:pPr>
+        <w:ind w:left="3240" w:hanging="360"/>
+      </w:pPr>
+    </w:lvl>
+    <w:lvl w:ilvl="5" w:tplc="0409001B" w:tentative="1">
+      <w:start w:val="1"/>
+      <w:numFmt w:val="lowerRoman"/>
+      <w:lvlText w:val="%6."/>
+      <w:lvlJc w:val="right"/>
+      <w:pPr>
+        <w:ind w:left="3960" w:hanging="180"/>
+      </w:pPr>
+    </w:lvl>
+    <w:lvl w:ilvl="6" w:tplc="0409000F" w:tentative="1">
+      <w:start w:val="1"/>
+      <w:numFmt w:val="decimal"/>
+      <w:lvlText w:val="%7."/>
+      <w:lvlJc w:val="left"/>
+      <w:pPr>
+        <w:ind w:left="4680" w:hanging="360"/>
+      </w:pPr>
+    </w:lvl>
+    <w:lvl w:ilvl="7" w:tplc="04090019" w:tentative="1">
+      <w:start w:val="1"/>
+      <w:numFmt w:val="lowerLetter"/>
+      <w:lvlText w:val="%8."/>
+      <w:lvlJc w:val="left"/>
+      <w:pPr>
+        <w:ind w:left="5400" w:hanging="360"/>
+      </w:pPr>
+    </w:lvl>
+    <w:lvl w:ilvl="8" w:tplc="0409001B" w:tentative="1">
+      <w:start w:val="1"/>
+      <w:numFmt w:val="lowerRoman"/>
+      <w:lvlText w:val="%9."/>
+      <w:lvlJc w:val="right"/>
+      <w:pPr>
+        <w:ind w:left="6120" w:hanging="180"/>
+      </w:pPr>
+    </w:lvl>
+  </w:abstractNum>
+  <w:abstractNum w:abstractNumId="8" w15:restartNumberingAfterBreak="0">
+    <w:nsid w:val="70F12DF3"/>
+    <w:multiLevelType w:val="multilevel"/>
+    <w:tmpl w:val="11EAA22A"/>
+    <w:lvl w:ilvl="0">
+      <w:start w:val="1"/>
+      <w:numFmt w:val="decimal"/>
+      <w:lvlText w:val="%1."/>
+      <w:lvlJc w:val="left"/>
+      <w:pPr>
+        <w:ind w:left="360" w:hanging="360"/>
+      </w:pPr>
+      <w:rPr>
+        <w:b/>
+        <w:bCs w:val="0"/>
+        <w:i w:val="0"/>
+        <w:color w:val="000000"/>
+        <w:sz w:val="20"/>
+        <w:u w:val="none"/>
+      </w:rPr>
+    </w:lvl>
+    <w:lvl w:ilvl="1">
+      <w:start w:val="1"/>
+      <w:numFmt w:val="bullet"/>
+      <w:lvlText w:val=""/>
+      <w:lvlJc w:val="left"/>
+      <w:pPr>
+        <w:ind w:left="1440" w:hanging="360"/>
+      </w:pPr>
+      <w:rPr>
+        <w:rFonts w:ascii="Wingdings 2" w:hAnsi="Wingdings 2" w:cs="Wingdings 2" w:hint="default"/>
+        <w:u w:val="none"/>
+      </w:rPr>
+    </w:lvl>
+    <w:lvl w:ilvl="2">
+      <w:start w:val="1"/>
+      <w:numFmt w:val="lowerRoman"/>
+      <w:lvlText w:val="%3."/>
+      <w:lvlJc w:val="right"/>
+      <w:pPr>
+        <w:ind w:left="2160" w:hanging="360"/>
+      </w:pPr>
+      <w:rPr>
+        <w:u w:val="none"/>
+      </w:rPr>
+    </w:lvl>
+    <w:lvl w:ilvl="3">
+      <w:start w:val="1"/>
+      <w:numFmt w:val="decimal"/>
+      <w:lvlText w:val="%4."/>
+      <w:lvlJc w:val="left"/>
+      <w:pPr>
+        <w:ind w:left="2880" w:hanging="360"/>
+      </w:pPr>
+      <w:rPr>
+        <w:u w:val="none"/>
+      </w:rPr>
+    </w:lvl>
+    <w:lvl w:ilvl="4">
+      <w:start w:val="1"/>
+      <w:numFmt w:val="lowerLetter"/>
+      <w:lvlText w:val="%5."/>
+      <w:lvlJc w:val="left"/>
+      <w:pPr>
+        <w:ind w:left="3600" w:hanging="360"/>
+      </w:pPr>
+      <w:rPr>
+        <w:u w:val="none"/>
+      </w:rPr>
+    </w:lvl>
+    <w:lvl w:ilvl="5">
+      <w:start w:val="1"/>
+      <w:numFmt w:val="lowerRoman"/>
+      <w:lvlText w:val="%6."/>
+      <w:lvlJc w:val="right"/>
+      <w:pPr>
+        <w:ind w:left="4320" w:hanging="360"/>
+      </w:pPr>
+      <w:rPr>
+        <w:u w:val="none"/>
+      </w:rPr>
+    </w:lvl>
+    <w:lvl w:ilvl="6">
+      <w:start w:val="1"/>
+      <w:numFmt w:val="decimal"/>
+      <w:lvlText w:val="%7."/>
+      <w:lvlJc w:val="left"/>
+      <w:pPr>
+        <w:ind w:left="5040" w:hanging="360"/>
+      </w:pPr>
+      <w:rPr>
+        <w:u w:val="none"/>
+      </w:rPr>
+    </w:lvl>
+    <w:lvl w:ilvl="7">
+      <w:start w:val="1"/>
+      <w:numFmt w:val="lowerLetter"/>
+      <w:lvlText w:val="%8."/>
+      <w:lvlJc w:val="left"/>
+      <w:pPr>
+        <w:ind w:left="5760" w:hanging="360"/>
+      </w:pPr>
+      <w:rPr>
+        <w:u w:val="none"/>
+      </w:rPr>
+    </w:lvl>
+    <w:lvl w:ilvl="8">
+      <w:start w:val="1"/>
+      <w:numFmt w:val="lowerRoman"/>
+      <w:lvlText w:val="%9."/>
+      <w:lvlJc w:val="right"/>
+      <w:pPr>
+        <w:ind w:left="6480" w:hanging="360"/>
+      </w:pPr>
+      <w:rPr>
+        <w:u w:val="none"/>
+      </w:rPr>
+    </w:lvl>
+  </w:abstractNum>
+  <w:abstractNum w:abstractNumId="9" w15:restartNumberingAfterBreak="0">
     <w:nsid w:val="783C55D3"/>
     <w:multiLevelType w:val="multilevel"/>
     <w:tmpl w:val="3258C3EA"/>
@@ -1392,7 +2627,7 @@
       </w:rPr>
     </w:lvl>
   </w:abstractNum>
-  <w:abstractNum w:abstractNumId="1" w15:restartNumberingAfterBreak="0">
+  <w:abstractNum w:abstractNumId="10" w15:restartNumberingAfterBreak="0">
     <w:nsid w:val="79947E74"/>
     <w:multiLevelType w:val="hybridMultilevel"/>
     <w:tmpl w:val="B6EC25EE"/>
@@ -1481,7 +2716,7 @@
       </w:pPr>
     </w:lvl>
   </w:abstractNum>
-  <w:abstractNum w:abstractNumId="2" w15:restartNumberingAfterBreak="0">
+  <w:abstractNum w:abstractNumId="11" w15:restartNumberingAfterBreak="0">
     <w:nsid w:val="7BB2415A"/>
     <w:multiLevelType w:val="multilevel"/>
     <w:tmpl w:val="FBEC29C2"/>
@@ -1597,14 +2832,41 @@
       </w:rPr>
     </w:lvl>
   </w:abstractNum>
-  <w:num w:numId="1" w16cid:durableId="874930986">
+  <w:num w:numId="1" w16cid:durableId="1080910593">
+    <w:abstractNumId w:val="6"/>
+  </w:num>
+  <w:num w:numId="2" w16cid:durableId="1084112665">
+    <w:abstractNumId w:val="1"/>
+  </w:num>
+  <w:num w:numId="3" w16cid:durableId="1102914260">
+    <w:abstractNumId w:val="5"/>
+  </w:num>
+  <w:num w:numId="4" w16cid:durableId="1255868036">
     <w:abstractNumId w:val="2"/>
   </w:num>
-  <w:num w:numId="2" w16cid:durableId="998734191">
+  <w:num w:numId="5" w16cid:durableId="1375040618">
+    <w:abstractNumId w:val="4"/>
+  </w:num>
+  <w:num w:numId="6" w16cid:durableId="1849321020">
+    <w:abstractNumId w:val="3"/>
+  </w:num>
+  <w:num w:numId="7" w16cid:durableId="1888180729">
+    <w:abstractNumId w:val="8"/>
+  </w:num>
+  <w:num w:numId="8" w16cid:durableId="1903516213">
+    <w:abstractNumId w:val="10"/>
+  </w:num>
+  <w:num w:numId="9" w16cid:durableId="1993754847">
+    <w:abstractNumId w:val="7"/>
+  </w:num>
+  <w:num w:numId="10" w16cid:durableId="572664912">
     <w:abstractNumId w:val="0"/>
   </w:num>
-  <w:num w:numId="3" w16cid:durableId="1903516213">
-    <w:abstractNumId w:val="1"/>
+  <w:num w:numId="11" w16cid:durableId="874930986">
+    <w:abstractNumId w:val="11"/>
+  </w:num>
+  <w:num w:numId="12" w16cid:durableId="998734191">
+    <w:abstractNumId w:val="9"/>
   </w:num>
 </w:numbering>
 </file>
@@ -2005,7 +3267,7 @@
   <w:style w:type="paragraph" w:default="1" w:styleId="Normal">
     <w:name w:val="Normal"/>
     <w:qFormat/>
-    <w:rsid w:val="00592D75"/>
+    <w:rsid w:val="007C1D9D"/>
   </w:style>
   <w:style w:type="paragraph" w:styleId="Heading1">
     <w:name w:val="heading 1"/>
@@ -2014,7 +3276,7 @@
     <w:link w:val="Heading1Char"/>
     <w:uiPriority w:val="9"/>
     <w:qFormat/>
-    <w:rsid w:val="00592D75"/>
+    <w:rsid w:val="005E6931"/>
     <w:pPr>
       <w:keepNext/>
       <w:keepLines/>
@@ -2037,7 +3299,7 @@
     <w:semiHidden/>
     <w:unhideWhenUsed/>
     <w:qFormat/>
-    <w:rsid w:val="00592D75"/>
+    <w:rsid w:val="005E6931"/>
     <w:pPr>
       <w:keepNext/>
       <w:keepLines/>
@@ -2060,7 +3322,7 @@
     <w:semiHidden/>
     <w:unhideWhenUsed/>
     <w:qFormat/>
-    <w:rsid w:val="00592D75"/>
+    <w:rsid w:val="005E6931"/>
     <w:pPr>
       <w:keepNext/>
       <w:keepLines/>
@@ -2083,7 +3345,7 @@
     <w:semiHidden/>
     <w:unhideWhenUsed/>
     <w:qFormat/>
-    <w:rsid w:val="00592D75"/>
+    <w:rsid w:val="005E6931"/>
     <w:pPr>
       <w:keepNext/>
       <w:keepLines/>
@@ -2106,7 +3368,7 @@
     <w:semiHidden/>
     <w:unhideWhenUsed/>
     <w:qFormat/>
-    <w:rsid w:val="00592D75"/>
+    <w:rsid w:val="005E6931"/>
     <w:pPr>
       <w:keepNext/>
       <w:keepLines/>
@@ -2127,7 +3389,7 @@
     <w:semiHidden/>
     <w:unhideWhenUsed/>
     <w:qFormat/>
-    <w:rsid w:val="00592D75"/>
+    <w:rsid w:val="005E6931"/>
     <w:pPr>
       <w:keepNext/>
       <w:keepLines/>
@@ -2150,7 +3412,7 @@
     <w:semiHidden/>
     <w:unhideWhenUsed/>
     <w:qFormat/>
-    <w:rsid w:val="00592D75"/>
+    <w:rsid w:val="005E6931"/>
     <w:pPr>
       <w:keepNext/>
       <w:keepLines/>
@@ -2171,7 +3433,7 @@
     <w:semiHidden/>
     <w:unhideWhenUsed/>
     <w:qFormat/>
-    <w:rsid w:val="00592D75"/>
+    <w:rsid w:val="005E6931"/>
     <w:pPr>
       <w:keepNext/>
       <w:keepLines/>
@@ -2193,7 +3455,7 @@
     <w:semiHidden/>
     <w:unhideWhenUsed/>
     <w:qFormat/>
-    <w:rsid w:val="00592D75"/>
+    <w:rsid w:val="005E6931"/>
     <w:pPr>
       <w:keepNext/>
       <w:keepLines/>
@@ -2239,7 +3501,7 @@
     <w:pPr>
       <w:numPr>
         <w:ilvl w:val="1"/>
-        <w:numId w:val="1"/>
+        <w:numId w:val="11"/>
       </w:numPr>
       <w:ind w:right="-790"/>
     </w:pPr>
@@ -2268,7 +3530,7 @@
     <w:rsid w:val="00EA2EF9"/>
     <w:pPr>
       <w:numPr>
-        <w:numId w:val="2"/>
+        <w:numId w:val="12"/>
       </w:numPr>
     </w:pPr>
   </w:style>
@@ -2277,7 +3539,7 @@
     <w:basedOn w:val="DefaultParagraphFont"/>
     <w:link w:val="Heading1"/>
     <w:uiPriority w:val="9"/>
-    <w:rsid w:val="00592D75"/>
+    <w:rsid w:val="005E6931"/>
     <w:rPr>
       <w:rFonts w:asciiTheme="majorHAnsi" w:eastAsiaTheme="majorEastAsia" w:hAnsiTheme="majorHAnsi" w:cstheme="majorBidi"/>
       <w:color w:val="0F4761" w:themeColor="accent1" w:themeShade="BF"/>
@@ -2291,7 +3553,7 @@
     <w:link w:val="Heading2"/>
     <w:uiPriority w:val="9"/>
     <w:semiHidden/>
-    <w:rsid w:val="00592D75"/>
+    <w:rsid w:val="005E6931"/>
     <w:rPr>
       <w:rFonts w:asciiTheme="majorHAnsi" w:eastAsiaTheme="majorEastAsia" w:hAnsiTheme="majorHAnsi" w:cstheme="majorBidi"/>
       <w:color w:val="0F4761" w:themeColor="accent1" w:themeShade="BF"/>
@@ -2305,7 +3567,7 @@
     <w:link w:val="Heading3"/>
     <w:uiPriority w:val="9"/>
     <w:semiHidden/>
-    <w:rsid w:val="00592D75"/>
+    <w:rsid w:val="005E6931"/>
     <w:rPr>
       <w:rFonts w:eastAsiaTheme="majorEastAsia" w:cstheme="majorBidi"/>
       <w:color w:val="0F4761" w:themeColor="accent1" w:themeShade="BF"/>
@@ -2319,7 +3581,7 @@
     <w:link w:val="Heading4"/>
     <w:uiPriority w:val="9"/>
     <w:semiHidden/>
-    <w:rsid w:val="00592D75"/>
+    <w:rsid w:val="005E6931"/>
     <w:rPr>
       <w:rFonts w:eastAsiaTheme="majorEastAsia" w:cstheme="majorBidi"/>
       <w:i/>
@@ -2333,7 +3595,7 @@
     <w:link w:val="Heading5"/>
     <w:uiPriority w:val="9"/>
     <w:semiHidden/>
-    <w:rsid w:val="00592D75"/>
+    <w:rsid w:val="005E6931"/>
     <w:rPr>
       <w:rFonts w:eastAsiaTheme="majorEastAsia" w:cstheme="majorBidi"/>
       <w:color w:val="0F4761" w:themeColor="accent1" w:themeShade="BF"/>
@@ -2345,7 +3607,7 @@
     <w:link w:val="Heading6"/>
     <w:uiPriority w:val="9"/>
     <w:semiHidden/>
-    <w:rsid w:val="00592D75"/>
+    <w:rsid w:val="005E6931"/>
     <w:rPr>
       <w:rFonts w:eastAsiaTheme="majorEastAsia" w:cstheme="majorBidi"/>
       <w:i/>
@@ -2359,7 +3621,7 @@
     <w:link w:val="Heading7"/>
     <w:uiPriority w:val="9"/>
     <w:semiHidden/>
-    <w:rsid w:val="00592D75"/>
+    <w:rsid w:val="005E6931"/>
     <w:rPr>
       <w:rFonts w:eastAsiaTheme="majorEastAsia" w:cstheme="majorBidi"/>
       <w:color w:val="595959" w:themeColor="text1" w:themeTint="A6"/>
@@ -2371,7 +3633,7 @@
     <w:link w:val="Heading8"/>
     <w:uiPriority w:val="9"/>
     <w:semiHidden/>
-    <w:rsid w:val="00592D75"/>
+    <w:rsid w:val="005E6931"/>
     <w:rPr>
       <w:rFonts w:eastAsiaTheme="majorEastAsia" w:cstheme="majorBidi"/>
       <w:i/>
@@ -2385,7 +3647,7 @@
     <w:link w:val="Heading9"/>
     <w:uiPriority w:val="9"/>
     <w:semiHidden/>
-    <w:rsid w:val="00592D75"/>
+    <w:rsid w:val="005E6931"/>
     <w:rPr>
       <w:rFonts w:eastAsiaTheme="majorEastAsia" w:cstheme="majorBidi"/>
       <w:color w:val="272727" w:themeColor="text1" w:themeTint="D8"/>
@@ -2398,7 +3660,7 @@
     <w:link w:val="TitleChar"/>
     <w:uiPriority w:val="10"/>
     <w:qFormat/>
-    <w:rsid w:val="00592D75"/>
+    <w:rsid w:val="005E6931"/>
     <w:pPr>
       <w:spacing w:after="80"/>
       <w:contextualSpacing/>
@@ -2416,7 +3678,7 @@
     <w:basedOn w:val="DefaultParagraphFont"/>
     <w:link w:val="Title"/>
     <w:uiPriority w:val="10"/>
-    <w:rsid w:val="00592D75"/>
+    <w:rsid w:val="005E6931"/>
     <w:rPr>
       <w:rFonts w:asciiTheme="majorHAnsi" w:eastAsiaTheme="majorEastAsia" w:hAnsiTheme="majorHAnsi" w:cstheme="majorBidi"/>
       <w:spacing w:val="-10"/>
@@ -2432,7 +3694,7 @@
     <w:link w:val="SubtitleChar"/>
     <w:uiPriority w:val="11"/>
     <w:qFormat/>
-    <w:rsid w:val="00592D75"/>
+    <w:rsid w:val="005E6931"/>
     <w:pPr>
       <w:numPr>
         <w:ilvl w:val="1"/>
@@ -2452,7 +3714,7 @@
     <w:basedOn w:val="DefaultParagraphFont"/>
     <w:link w:val="Subtitle"/>
     <w:uiPriority w:val="11"/>
-    <w:rsid w:val="00592D75"/>
+    <w:rsid w:val="005E6931"/>
     <w:rPr>
       <w:rFonts w:eastAsiaTheme="majorEastAsia" w:cstheme="majorBidi"/>
       <w:color w:val="595959" w:themeColor="text1" w:themeTint="A6"/>
@@ -2468,7 +3730,7 @@
     <w:link w:val="QuoteChar"/>
     <w:uiPriority w:val="29"/>
     <w:qFormat/>
-    <w:rsid w:val="00592D75"/>
+    <w:rsid w:val="005E6931"/>
     <w:pPr>
       <w:spacing w:before="160" w:after="160"/>
       <w:jc w:val="center"/>
@@ -2484,7 +3746,7 @@
     <w:basedOn w:val="DefaultParagraphFont"/>
     <w:link w:val="Quote"/>
     <w:uiPriority w:val="29"/>
-    <w:rsid w:val="00592D75"/>
+    <w:rsid w:val="005E6931"/>
     <w:rPr>
       <w:i/>
       <w:iCs/>
@@ -2496,7 +3758,7 @@
     <w:basedOn w:val="DefaultParagraphFont"/>
     <w:uiPriority w:val="21"/>
     <w:qFormat/>
-    <w:rsid w:val="00592D75"/>
+    <w:rsid w:val="005E6931"/>
     <w:rPr>
       <w:i/>
       <w:iCs/>
@@ -2510,7 +3772,7 @@
     <w:link w:val="IntenseQuoteChar"/>
     <w:uiPriority w:val="30"/>
     <w:qFormat/>
-    <w:rsid w:val="00592D75"/>
+    <w:rsid w:val="005E6931"/>
     <w:pPr>
       <w:pBdr>
         <w:top w:val="single" w:sz="4" w:space="10" w:color="0F4761" w:themeColor="accent1" w:themeShade="BF"/>
@@ -2531,7 +3793,7 @@
     <w:basedOn w:val="DefaultParagraphFont"/>
     <w:link w:val="IntenseQuote"/>
     <w:uiPriority w:val="30"/>
-    <w:rsid w:val="00592D75"/>
+    <w:rsid w:val="005E6931"/>
     <w:rPr>
       <w:i/>
       <w:iCs/>
@@ -2543,7 +3805,7 @@
     <w:basedOn w:val="DefaultParagraphFont"/>
     <w:uiPriority w:val="32"/>
     <w:qFormat/>
-    <w:rsid w:val="00592D75"/>
+    <w:rsid w:val="005E6931"/>
     <w:rPr>
       <w:b/>
       <w:bCs/>
@@ -2552,13 +3814,34 @@
       <w:spacing w:val="5"/>
     </w:rPr>
   </w:style>
+  <w:style w:type="paragraph" w:styleId="Header">
+    <w:name w:val="header"/>
+    <w:basedOn w:val="Normal"/>
+    <w:link w:val="HeaderChar"/>
+    <w:uiPriority w:val="99"/>
+    <w:unhideWhenUsed/>
+    <w:rsid w:val="002553B9"/>
+    <w:pPr>
+      <w:tabs>
+        <w:tab w:val="center" w:pos="4680"/>
+        <w:tab w:val="right" w:pos="9360"/>
+      </w:tabs>
+    </w:pPr>
+  </w:style>
+  <w:style w:type="character" w:customStyle="1" w:styleId="HeaderChar">
+    <w:name w:val="Header Char"/>
+    <w:basedOn w:val="DefaultParagraphFont"/>
+    <w:link w:val="Header"/>
+    <w:uiPriority w:val="99"/>
+    <w:rsid w:val="002553B9"/>
+  </w:style>
   <w:style w:type="paragraph" w:styleId="Footer">
     <w:name w:val="footer"/>
     <w:basedOn w:val="Normal"/>
     <w:link w:val="FooterChar"/>
     <w:uiPriority w:val="99"/>
     <w:unhideWhenUsed/>
-    <w:rsid w:val="00592D75"/>
+    <w:rsid w:val="002553B9"/>
     <w:pPr>
       <w:tabs>
         <w:tab w:val="center" w:pos="4680"/>
@@ -2571,13 +3854,13 @@
     <w:basedOn w:val="DefaultParagraphFont"/>
     <w:link w:val="Footer"/>
     <w:uiPriority w:val="99"/>
-    <w:rsid w:val="00592D75"/>
+    <w:rsid w:val="002553B9"/>
   </w:style>
   <w:style w:type="table" w:styleId="TableGrid">
     <w:name w:val="Table Grid"/>
     <w:basedOn w:val="TableNormal"/>
     <w:uiPriority w:val="39"/>
-    <w:rsid w:val="00592D75"/>
+    <w:rsid w:val="00BB5EFE"/>
     <w:rPr>
       <w:kern w:val="0"/>
       <w:sz w:val="22"/>

</xml_diff>